<commit_message>
Invoice template v2: lime amount due, customer reference, lighter From box, single how-to-pay section with Xero QR; Xero invoices start with a work-completed line
Co-Authored-By: Claude Opus 5.5 <noreply@anthropic.com>
Claude-Session: https://claude.ai/code/session_01XczQ4VoiYiQrKwLjiEtYiz
</commit_message>
<xml_diff>
--- a/templates/xero-invoice/Aura Invoice Template.docx
+++ b/templates/xero-invoice/Aura Invoice Template.docx
@@ -648,7 +648,7 @@
                 <w:sz w:val="14"/>
                 <w:szCs w:val="14"/>
               </w:rPr>
-              <w:t xml:space="preserve">Reference</w:t>
+              <w:t xml:space="preserve">Your reference</w:t>
             </w:r>
           </w:p>
           <w:p>
@@ -726,7 +726,7 @@
               <w:bottom w:val="single" w:color="CDD6CF" w:sz="4"/>
               <w:right w:val="single" w:color="CDD6CF" w:sz="4"/>
             </w:tcBorders>
-            <w:shd w:fill="E3F2E6" w:color="auto" w:val="clear"/>
+            <w:shd w:fill="72C936" w:color="auto" w:val="clear"/>
             <w:tcMar>
               <w:top w:type="dxa" w:w="70"/>
               <w:left w:type="dxa" w:w="110"/>
@@ -742,10 +742,10 @@
             <w:r>
               <w:rPr>
                 <w:rFonts w:ascii="Arial" w:cs="Arial" w:eastAsia="Arial" w:hAnsi="Arial"/>
-                <w:b w:val="false"/>
-                <w:bCs w:val="false"/>
+                <w:b/>
+                <w:bCs/>
                 <w:caps/>
-                <w:color w:val="5B6B60"/>
+                <w:color w:val="FFFFFF"/>
                 <w:spacing w:val="8"/>
                 <w:sz w:val="14"/>
                 <w:szCs w:val="14"/>
@@ -763,9 +763,9 @@
                 <w:b/>
                 <w:bCs/>
                 <w:caps w:val="false"/>
-                <w:color w:val="0C3E17"/>
-                <w:sz w:val="22"/>
-                <w:szCs w:val="22"/>
+                <w:color w:val="FFFFFF"/>
+                <w:sz w:val="24"/>
+                <w:szCs w:val="24"/>
               </w:rPr>
               <w:t xml:space="preserve">£</w:t>
             </w:r>
@@ -775,9 +775,9 @@
                 <w:b/>
                 <w:bCs/>
                 <w:caps w:val="false"/>
-                <w:color w:val="0C3E17"/>
-                <w:sz w:val="22"/>
-                <w:szCs w:val="22"/>
+                <w:color w:val="FFFFFF"/>
+                <w:sz w:val="24"/>
+                <w:szCs w:val="24"/>
               </w:rPr>
               <w:fldChar w:fldCharType="begin"/>
             </w:r>
@@ -787,9 +787,9 @@
                 <w:b/>
                 <w:bCs/>
                 <w:caps w:val="false"/>
-                <w:color w:val="0C3E17"/>
-                <w:sz w:val="22"/>
-                <w:szCs w:val="22"/>
+                <w:color w:val="FFFFFF"/>
+                <w:sz w:val="24"/>
+                <w:szCs w:val="24"/>
               </w:rPr>
               <w:instrText xml:space="preserve"> MERGEFIELD  InvoiceAmountDue  \# "#,##0.00;(#,##0.00)"  \* MERGEFORMAT </w:instrText>
             </w:r>
@@ -799,9 +799,9 @@
                 <w:b/>
                 <w:bCs/>
                 <w:caps w:val="false"/>
-                <w:color w:val="0C3E17"/>
-                <w:sz w:val="22"/>
-                <w:szCs w:val="22"/>
+                <w:color w:val="FFFFFF"/>
+                <w:sz w:val="24"/>
+                <w:szCs w:val="24"/>
               </w:rPr>
               <w:fldChar w:fldCharType="separate"/>
             </w:r>
@@ -811,9 +811,9 @@
                 <w:b/>
                 <w:bCs/>
                 <w:caps w:val="false"/>
-                <w:color w:val="0C3E17"/>
-                <w:sz w:val="22"/>
-                <w:szCs w:val="22"/>
+                <w:color w:val="FFFFFF"/>
+                <w:sz w:val="24"/>
+                <w:szCs w:val="24"/>
               </w:rPr>
               <w:t xml:space="preserve">«InvoiceAmountDue»</w:t>
             </w:r>
@@ -823,9 +823,9 @@
                 <w:b/>
                 <w:bCs/>
                 <w:caps w:val="false"/>
-                <w:color w:val="0C3E17"/>
-                <w:sz w:val="22"/>
-                <w:szCs w:val="22"/>
+                <w:color w:val="FFFFFF"/>
+                <w:sz w:val="24"/>
+                <w:szCs w:val="24"/>
               </w:rPr>
               <w:fldChar w:fldCharType="end"/>
             </w:r>
@@ -839,7 +839,7 @@
         <w:pBdr>
           <w:bottom w:val="single" w:color="79CF36" w:sz="6" w:space="3"/>
         </w:pBdr>
-        <w:spacing w:after="90" w:before="200"/>
+        <w:spacing w:after="80" w:before="170"/>
       </w:pPr>
       <w:r>
         <w:rPr>
@@ -1359,216 +1359,70 @@
                   </w:tcMar>
                   <w:vAlign w:val="top"/>
                 </w:tcPr>
-                <w:tbl>
-                  <w:tblPr>
-                    <w:tblW w:type="dxa" w:w="4913"/>
-                    <w:tblBorders>
-                      <w:top w:val="none" w:color="FFFFFF" w:sz="0"/>
-                      <w:left w:val="none" w:color="FFFFFF" w:sz="0"/>
-                      <w:bottom w:val="none" w:color="FFFFFF" w:sz="0"/>
-                      <w:right w:val="none" w:color="FFFFFF" w:sz="0"/>
-                      <w:insideH w:val="none" w:color="FFFFFF" w:sz="0"/>
-                      <w:insideV w:val="none" w:color="FFFFFF" w:sz="0"/>
-                    </w:tblBorders>
-                    <w:tblLayout w:type="fixed"/>
-                  </w:tblPr>
-                  <w:tblGrid>
-                    <w:gridCol w:w="1670"/>
-                    <w:gridCol w:w="3243"/>
-                  </w:tblGrid>
-                  <w:tr>
-                    <w:tc>
-                      <w:tcPr>
-                        <w:tcW w:type="dxa" w:w="1670"/>
-                        <w:tcBorders>
-                          <w:top w:val="none" w:color="FFFFFF" w:sz="0"/>
-                          <w:left w:val="none" w:color="FFFFFF" w:sz="0"/>
-                          <w:bottom w:val="none" w:color="FFFFFF" w:sz="0"/>
-                          <w:right w:val="none" w:color="FFFFFF" w:sz="0"/>
-                        </w:tcBorders>
-                        <w:tcMar>
-                          <w:top w:type="dxa" w:w="15"/>
-                          <w:left w:type="dxa" w:w="0"/>
-                          <w:bottom w:type="dxa" w:w="15"/>
-                          <w:right w:type="dxa" w:w="60"/>
-                        </w:tcMar>
-                        <w:vAlign w:val="top"/>
-                      </w:tcPr>
-                      <w:p>
-                        <w:pPr>
-                          <w:spacing w:after="0" w:before="0" w:line="260"/>
-                        </w:pPr>
-                        <w:r>
-                          <w:rPr>
-                            <w:rFonts w:ascii="Arial" w:cs="Arial" w:eastAsia="Arial" w:hAnsi="Arial"/>
-                            <w:b w:val="false"/>
-                            <w:bCs w:val="false"/>
-                            <w:caps w:val="false"/>
-                            <w:color w:val="5B6B60"/>
-                            <w:sz w:val="17"/>
-                            <w:szCs w:val="17"/>
-                          </w:rPr>
-                          <w:t xml:space="preserve">Company</w:t>
-                        </w:r>
-                      </w:p>
-                    </w:tc>
-                    <w:tc>
-                      <w:tcPr>
-                        <w:tcW w:type="dxa" w:w="3243"/>
-                        <w:tcBorders>
-                          <w:top w:val="none" w:color="FFFFFF" w:sz="0"/>
-                          <w:left w:val="none" w:color="FFFFFF" w:sz="0"/>
-                          <w:bottom w:val="none" w:color="FFFFFF" w:sz="0"/>
-                          <w:right w:val="none" w:color="FFFFFF" w:sz="0"/>
-                        </w:tcBorders>
-                        <w:tcMar>
-                          <w:top w:type="dxa" w:w="15"/>
-                          <w:left w:type="dxa" w:w="0"/>
-                          <w:bottom w:type="dxa" w:w="15"/>
-                          <w:right w:type="dxa" w:w="0"/>
-                        </w:tcMar>
-                        <w:vAlign w:val="top"/>
-                      </w:tcPr>
-                      <w:p>
-                        <w:pPr>
-                          <w:spacing w:after="0" w:before="0" w:line="260"/>
-                        </w:pPr>
-                        <w:r>
-                          <w:rPr>
-                            <w:rFonts w:ascii="Arial" w:cs="Arial" w:eastAsia="Arial" w:hAnsi="Arial"/>
-                            <w:b/>
-                            <w:bCs/>
-                            <w:caps w:val="false"/>
-                            <w:color w:val="17221B"/>
-                            <w:sz w:val="17"/>
-                            <w:szCs w:val="17"/>
-                          </w:rPr>
-                          <w:t xml:space="preserve">Aura Solutions Group Limited</w:t>
-                        </w:r>
-                      </w:p>
-                    </w:tc>
-                  </w:tr>
-                </w:tbl>
-                <w:tbl>
-                  <w:tblPr>
-                    <w:tblW w:type="dxa" w:w="4913"/>
-                    <w:tblBorders>
-                      <w:top w:val="none" w:color="FFFFFF" w:sz="0"/>
-                      <w:left w:val="none" w:color="FFFFFF" w:sz="0"/>
-                      <w:bottom w:val="none" w:color="FFFFFF" w:sz="0"/>
-                      <w:right w:val="none" w:color="FFFFFF" w:sz="0"/>
-                      <w:insideH w:val="none" w:color="FFFFFF" w:sz="0"/>
-                      <w:insideV w:val="none" w:color="FFFFFF" w:sz="0"/>
-                    </w:tblBorders>
-                    <w:tblLayout w:type="fixed"/>
-                  </w:tblPr>
-                  <w:tblGrid>
-                    <w:gridCol w:w="1670"/>
-                    <w:gridCol w:w="3243"/>
-                  </w:tblGrid>
-                  <w:tr>
-                    <w:tc>
-                      <w:tcPr>
-                        <w:tcW w:type="dxa" w:w="1670"/>
-                        <w:tcBorders>
-                          <w:top w:val="none" w:color="FFFFFF" w:sz="0"/>
-                          <w:left w:val="none" w:color="FFFFFF" w:sz="0"/>
-                          <w:bottom w:val="none" w:color="FFFFFF" w:sz="0"/>
-                          <w:right w:val="none" w:color="FFFFFF" w:sz="0"/>
-                        </w:tcBorders>
-                        <w:tcMar>
-                          <w:top w:type="dxa" w:w="15"/>
-                          <w:left w:type="dxa" w:w="0"/>
-                          <w:bottom w:type="dxa" w:w="15"/>
-                          <w:right w:type="dxa" w:w="60"/>
-                        </w:tcMar>
-                        <w:vAlign w:val="top"/>
-                      </w:tcPr>
-                      <w:p>
-                        <w:pPr>
-                          <w:spacing w:after="0" w:before="0" w:line="260"/>
-                        </w:pPr>
-                        <w:r>
-                          <w:rPr>
-                            <w:rFonts w:ascii="Arial" w:cs="Arial" w:eastAsia="Arial" w:hAnsi="Arial"/>
-                            <w:b w:val="false"/>
-                            <w:bCs w:val="false"/>
-                            <w:caps w:val="false"/>
-                            <w:color w:val="5B6B60"/>
-                            <w:sz w:val="17"/>
-                            <w:szCs w:val="17"/>
-                          </w:rPr>
-                          <w:t xml:space="preserve">Address</w:t>
-                        </w:r>
-                      </w:p>
-                    </w:tc>
-                    <w:tc>
-                      <w:tcPr>
-                        <w:tcW w:type="dxa" w:w="3243"/>
-                        <w:tcBorders>
-                          <w:top w:val="none" w:color="FFFFFF" w:sz="0"/>
-                          <w:left w:val="none" w:color="FFFFFF" w:sz="0"/>
-                          <w:bottom w:val="none" w:color="FFFFFF" w:sz="0"/>
-                          <w:right w:val="none" w:color="FFFFFF" w:sz="0"/>
-                        </w:tcBorders>
-                        <w:tcMar>
-                          <w:top w:type="dxa" w:w="15"/>
-                          <w:left w:type="dxa" w:w="0"/>
-                          <w:bottom w:type="dxa" w:w="15"/>
-                          <w:right w:type="dxa" w:w="0"/>
-                        </w:tcMar>
-                        <w:vAlign w:val="top"/>
-                      </w:tcPr>
-                      <w:p>
-                        <w:pPr>
-                          <w:spacing w:after="0" w:before="0" w:line="260"/>
-                        </w:pPr>
-                        <w:r>
-                          <w:rPr>
-                            <w:rFonts w:ascii="Arial" w:cs="Arial" w:eastAsia="Arial" w:hAnsi="Arial"/>
-                            <w:b/>
-                            <w:bCs/>
-                            <w:caps w:val="false"/>
-                            <w:color w:val="17221B"/>
-                            <w:sz w:val="17"/>
-                            <w:szCs w:val="17"/>
-                          </w:rPr>
-                          <w:t xml:space="preserve">Main Street, Sedgeberrow</w:t>
-                        </w:r>
-                        <w:r>
-                          <w:br/>
-                        </w:r>
-                        <w:r>
-                          <w:rPr>
-                            <w:rFonts w:ascii="Arial" w:cs="Arial" w:eastAsia="Arial" w:hAnsi="Arial"/>
-                            <w:b/>
-                            <w:bCs/>
-                            <w:caps w:val="false"/>
-                            <w:color w:val="17221B"/>
-                            <w:sz w:val="17"/>
-                            <w:szCs w:val="17"/>
-                          </w:rPr>
-                          <w:t xml:space="preserve">Evesham, Worcestershire</w:t>
-                        </w:r>
-                        <w:r>
-                          <w:br/>
-                        </w:r>
-                        <w:r>
-                          <w:rPr>
-                            <w:rFonts w:ascii="Arial" w:cs="Arial" w:eastAsia="Arial" w:hAnsi="Arial"/>
-                            <w:b/>
-                            <w:bCs/>
-                            <w:caps w:val="false"/>
-                            <w:color w:val="17221B"/>
-                            <w:sz w:val="17"/>
-                            <w:szCs w:val="17"/>
-                          </w:rPr>
-                          <w:t xml:space="preserve">WR11 7UH</w:t>
-                        </w:r>
-                      </w:p>
-                    </w:tc>
-                  </w:tr>
-                </w:tbl>
+                <w:p>
+                  <w:pPr>
+                    <w:spacing w:after="30" w:before="0" w:line="260"/>
+                  </w:pPr>
+                  <w:r>
+                    <w:rPr>
+                      <w:rFonts w:ascii="Arial" w:cs="Arial" w:eastAsia="Arial" w:hAnsi="Arial"/>
+                      <w:b/>
+                      <w:bCs/>
+                      <w:caps w:val="false"/>
+                      <w:color w:val="17221B"/>
+                      <w:sz w:val="19"/>
+                      <w:szCs w:val="19"/>
+                    </w:rPr>
+                    <w:t xml:space="preserve">Aura Solutions Group Limited</w:t>
+                  </w:r>
+                </w:p>
+                <w:p>
+                  <w:pPr>
+                    <w:spacing w:after="50" w:before="0" w:line="260"/>
+                  </w:pPr>
+                  <w:r>
+                    <w:rPr>
+                      <w:rFonts w:ascii="Arial" w:cs="Arial" w:eastAsia="Arial" w:hAnsi="Arial"/>
+                      <w:b w:val="false"/>
+                      <w:bCs w:val="false"/>
+                      <w:caps w:val="false"/>
+                      <w:color w:val="17221B"/>
+                      <w:sz w:val="17"/>
+                      <w:szCs w:val="17"/>
+                    </w:rPr>
+                    <w:t xml:space="preserve">Main Street, Sedgeberrow</w:t>
+                  </w:r>
+                  <w:r>
+                    <w:br/>
+                  </w:r>
+                  <w:r>
+                    <w:rPr>
+                      <w:rFonts w:ascii="Arial" w:cs="Arial" w:eastAsia="Arial" w:hAnsi="Arial"/>
+                      <w:b w:val="false"/>
+                      <w:bCs w:val="false"/>
+                      <w:caps w:val="false"/>
+                      <w:color w:val="17221B"/>
+                      <w:sz w:val="17"/>
+                      <w:szCs w:val="17"/>
+                    </w:rPr>
+                    <w:t xml:space="preserve">Evesham, Worcestershire</w:t>
+                  </w:r>
+                  <w:r>
+                    <w:br/>
+                  </w:r>
+                  <w:r>
+                    <w:rPr>
+                      <w:rFonts w:ascii="Arial" w:cs="Arial" w:eastAsia="Arial" w:hAnsi="Arial"/>
+                      <w:b w:val="false"/>
+                      <w:bCs w:val="false"/>
+                      <w:caps w:val="false"/>
+                      <w:color w:val="17221B"/>
+                      <w:sz w:val="17"/>
+                      <w:szCs w:val="17"/>
+                    </w:rPr>
+                    <w:t xml:space="preserve">WR11 7UH</w:t>
+                  </w:r>
+                </w:p>
                 <w:tbl>
                   <w:tblPr>
                     <w:tblW w:type="dxa" w:w="4913"/>
@@ -1646,8 +1500,8 @@
                         <w:r>
                           <w:rPr>
                             <w:rFonts w:ascii="Arial" w:cs="Arial" w:eastAsia="Arial" w:hAnsi="Arial"/>
-                            <w:b/>
-                            <w:bCs/>
+                            <w:b w:val="false"/>
+                            <w:bCs w:val="false"/>
                             <w:caps w:val="false"/>
                             <w:color w:val="17221B"/>
                             <w:sz w:val="17"/>
@@ -1736,8 +1590,8 @@
                         <w:r>
                           <w:rPr>
                             <w:rFonts w:ascii="Arial" w:cs="Arial" w:eastAsia="Arial" w:hAnsi="Arial"/>
-                            <w:b/>
-                            <w:bCs/>
+                            <w:b w:val="false"/>
+                            <w:bCs w:val="false"/>
                             <w:caps w:val="false"/>
                             <w:color w:val="17221B"/>
                             <w:sz w:val="17"/>
@@ -1826,29 +1680,14 @@
                         <w:r>
                           <w:rPr>
                             <w:rFonts w:ascii="Arial" w:cs="Arial" w:eastAsia="Arial" w:hAnsi="Arial"/>
-                            <w:b/>
-                            <w:bCs/>
+                            <w:b w:val="false"/>
+                            <w:bCs w:val="false"/>
                             <w:caps w:val="false"/>
                             <w:color w:val="17221B"/>
                             <w:sz w:val="17"/>
                             <w:szCs w:val="17"/>
                           </w:rPr>
-                          <w:t xml:space="preserve">info@aurasolutions.co.uk</w:t>
-                        </w:r>
-                        <w:r>
-                          <w:br/>
-                        </w:r>
-                        <w:r>
-                          <w:rPr>
-                            <w:rFonts w:ascii="Arial" w:cs="Arial" w:eastAsia="Arial" w:hAnsi="Arial"/>
-                            <w:b/>
-                            <w:bCs/>
-                            <w:caps w:val="false"/>
-                            <w:color w:val="17221B"/>
-                            <w:sz w:val="17"/>
-                            <w:szCs w:val="17"/>
-                          </w:rPr>
-                          <w:t xml:space="preserve">01386 571556</w:t>
+                          <w:t xml:space="preserve">info@aurasolutions.co.uk · 01386 571556</w:t>
                         </w:r>
                       </w:p>
                     </w:tc>
@@ -1868,7 +1707,7 @@
         <w:pBdr>
           <w:bottom w:val="single" w:color="79CF36" w:sz="6" w:space="3"/>
         </w:pBdr>
-        <w:spacing w:after="90" w:before="200"/>
+        <w:spacing w:after="80" w:before="170"/>
       </w:pPr>
       <w:r>
         <w:rPr>
@@ -3580,7 +3419,7 @@
               <w:bottom w:val="none" w:color="FFFFFF" w:sz="0"/>
               <w:right w:val="none" w:color="FFFFFF" w:sz="0"/>
             </w:tcBorders>
-            <w:shd w:fill="E3F2E6" w:color="auto" w:val="clear"/>
+            <w:shd w:fill="72C936" w:color="auto" w:val="clear"/>
             <w:tcMar>
               <w:top w:type="dxa" w:w="90"/>
               <w:left w:type="dxa" w:w="120"/>
@@ -3599,7 +3438,7 @@
                 <w:b/>
                 <w:bCs/>
                 <w:caps w:val="false"/>
-                <w:color w:val="0C3E17"/>
+                <w:color w:val="FFFFFF"/>
                 <w:sz w:val="20"/>
                 <w:szCs w:val="20"/>
               </w:rPr>
@@ -3616,7 +3455,7 @@
               <w:bottom w:val="none" w:color="FFFFFF" w:sz="0"/>
               <w:right w:val="none" w:color="FFFFFF" w:sz="0"/>
             </w:tcBorders>
-            <w:shd w:fill="E3F2E6" w:color="auto" w:val="clear"/>
+            <w:shd w:fill="72C936" w:color="auto" w:val="clear"/>
             <w:tcMar>
               <w:top w:type="dxa" w:w="90"/>
               <w:left w:type="dxa" w:w="100"/>
@@ -3636,7 +3475,7 @@
                 <w:b/>
                 <w:bCs/>
                 <w:caps w:val="false"/>
-                <w:color w:val="0C3E17"/>
+                <w:color w:val="FFFFFF"/>
                 <w:sz w:val="22"/>
                 <w:szCs w:val="22"/>
               </w:rPr>
@@ -3648,7 +3487,7 @@
                 <w:b/>
                 <w:bCs/>
                 <w:caps w:val="false"/>
-                <w:color w:val="0C3E17"/>
+                <w:color w:val="FFFFFF"/>
                 <w:sz w:val="22"/>
                 <w:szCs w:val="22"/>
               </w:rPr>
@@ -3660,7 +3499,7 @@
                 <w:b/>
                 <w:bCs/>
                 <w:caps w:val="false"/>
-                <w:color w:val="0C3E17"/>
+                <w:color w:val="FFFFFF"/>
                 <w:sz w:val="22"/>
                 <w:szCs w:val="22"/>
               </w:rPr>
@@ -3672,7 +3511,7 @@
                 <w:b/>
                 <w:bCs/>
                 <w:caps w:val="false"/>
-                <w:color w:val="0C3E17"/>
+                <w:color w:val="FFFFFF"/>
                 <w:sz w:val="22"/>
                 <w:szCs w:val="22"/>
               </w:rPr>
@@ -3684,7 +3523,7 @@
                 <w:b/>
                 <w:bCs/>
                 <w:caps w:val="false"/>
-                <w:color w:val="0C3E17"/>
+                <w:color w:val="FFFFFF"/>
                 <w:sz w:val="22"/>
                 <w:szCs w:val="22"/>
               </w:rPr>
@@ -3696,7 +3535,7 @@
                 <w:b/>
                 <w:bCs/>
                 <w:caps w:val="false"/>
-                <w:color w:val="0C3E17"/>
+                <w:color w:val="FFFFFF"/>
                 <w:sz w:val="22"/>
                 <w:szCs w:val="22"/>
               </w:rPr>
@@ -3712,7 +3551,7 @@
         <w:pBdr>
           <w:bottom w:val="single" w:color="79CF36" w:sz="6" w:space="3"/>
         </w:pBdr>
-        <w:spacing w:after="90" w:before="200"/>
+        <w:spacing w:after="80" w:before="170"/>
       </w:pPr>
       <w:r>
         <w:rPr>
@@ -3752,14 +3591,14 @@
         <w:tblLayout w:type="fixed"/>
       </w:tblPr>
       <w:tblGrid>
-        <w:gridCol w:w="5153"/>
+        <w:gridCol w:w="5200"/>
         <w:gridCol w:w="160"/>
-        <w:gridCol w:w="5153"/>
+        <w:gridCol w:w="5106"/>
       </w:tblGrid>
       <w:tr>
         <w:tc>
           <w:tcPr>
-            <w:tcW w:type="dxa" w:w="5153"/>
+            <w:tcW w:type="dxa" w:w="5200"/>
             <w:tcBorders>
               <w:top w:val="none" w:color="FFFFFF" w:sz="0"/>
               <w:left w:val="none" w:color="FFFFFF" w:sz="0"/>
@@ -3774,9 +3613,27 @@
             </w:tcMar>
             <w:vAlign w:val="top"/>
           </w:tcPr>
+          <w:p>
+            <w:pPr>
+              <w:spacing w:after="60" w:before="0" w:line="260"/>
+            </w:pPr>
+            <w:r>
+              <w:rPr>
+                <w:rFonts w:ascii="Arial" w:cs="Arial" w:eastAsia="Arial" w:hAnsi="Arial"/>
+                <w:b/>
+                <w:bCs/>
+                <w:caps/>
+                <w:color w:val="2F6B3A"/>
+                <w:spacing w:val="10"/>
+                <w:sz w:val="16"/>
+                <w:szCs w:val="16"/>
+              </w:rPr>
+              <w:t xml:space="preserve">Bank transfer (BACS)</w:t>
+            </w:r>
+          </w:p>
           <w:tbl>
             <w:tblPr>
-              <w:tblW w:type="dxa" w:w="5153"/>
+              <w:tblW w:type="dxa" w:w="5000"/>
               <w:tblBorders>
                 <w:top w:val="none" w:color="FFFFFF" w:sz="0"/>
                 <w:left w:val="none" w:color="FFFFFF" w:sz="0"/>
@@ -3788,24 +3645,59 @@
               <w:tblLayout w:type="fixed"/>
             </w:tblPr>
             <w:tblGrid>
-              <w:gridCol w:w="5153"/>
+              <w:gridCol w:w="1700"/>
+              <w:gridCol w:w="3300"/>
             </w:tblGrid>
             <w:tr>
               <w:tc>
                 <w:tcPr>
-                  <w:tcW w:type="dxa" w:w="5153"/>
+                  <w:tcW w:type="dxa" w:w="1700"/>
                   <w:tcBorders>
-                    <w:top w:val="single" w:color="CDD6CF" w:sz="4"/>
-                    <w:left w:val="single" w:color="CDD6CF" w:sz="4"/>
-                    <w:bottom w:val="single" w:color="CDD6CF" w:sz="4"/>
-                    <w:right w:val="single" w:color="CDD6CF" w:sz="4"/>
+                    <w:top w:val="none" w:color="FFFFFF" w:sz="0"/>
+                    <w:left w:val="none" w:color="FFFFFF" w:sz="0"/>
+                    <w:bottom w:val="none" w:color="FFFFFF" w:sz="0"/>
+                    <w:right w:val="none" w:color="FFFFFF" w:sz="0"/>
                   </w:tcBorders>
-                  <w:shd w:fill="EEF4EF" w:color="auto" w:val="clear"/>
                   <w:tcMar>
-                    <w:top w:type="dxa" w:w="50"/>
-                    <w:left w:type="dxa" w:w="120"/>
-                    <w:bottom w:type="dxa" w:w="50"/>
-                    <w:right w:type="dxa" w:w="120"/>
+                    <w:top w:type="dxa" w:w="15"/>
+                    <w:left w:type="dxa" w:w="0"/>
+                    <w:bottom w:type="dxa" w:w="15"/>
+                    <w:right w:type="dxa" w:w="60"/>
+                  </w:tcMar>
+                  <w:vAlign w:val="top"/>
+                </w:tcPr>
+                <w:p>
+                  <w:pPr>
+                    <w:spacing w:after="0" w:before="0" w:line="260"/>
+                  </w:pPr>
+                  <w:r>
+                    <w:rPr>
+                      <w:rFonts w:ascii="Arial" w:cs="Arial" w:eastAsia="Arial" w:hAnsi="Arial"/>
+                      <w:b w:val="false"/>
+                      <w:bCs w:val="false"/>
+                      <w:caps w:val="false"/>
+                      <w:color w:val="5B6B60"/>
+                      <w:sz w:val="17"/>
+                      <w:szCs w:val="17"/>
+                    </w:rPr>
+                    <w:t xml:space="preserve">Bank</w:t>
+                  </w:r>
+                </w:p>
+              </w:tc>
+              <w:tc>
+                <w:tcPr>
+                  <w:tcW w:type="dxa" w:w="3300"/>
+                  <w:tcBorders>
+                    <w:top w:val="none" w:color="FFFFFF" w:sz="0"/>
+                    <w:left w:val="none" w:color="FFFFFF" w:sz="0"/>
+                    <w:bottom w:val="none" w:color="FFFFFF" w:sz="0"/>
+                    <w:right w:val="none" w:color="FFFFFF" w:sz="0"/>
+                  </w:tcBorders>
+                  <w:tcMar>
+                    <w:top w:type="dxa" w:w="15"/>
+                    <w:left w:type="dxa" w:w="0"/>
+                    <w:bottom w:type="dxa" w:w="15"/>
+                    <w:right w:type="dxa" w:w="0"/>
                   </w:tcMar>
                   <w:vAlign w:val="top"/>
                 </w:tcPr>
@@ -3818,534 +3710,422 @@
                       <w:rFonts w:ascii="Arial" w:cs="Arial" w:eastAsia="Arial" w:hAnsi="Arial"/>
                       <w:b/>
                       <w:bCs/>
-                      <w:caps/>
-                      <w:color w:val="2F6B3A"/>
-                      <w:spacing w:val="10"/>
-                      <w:sz w:val="16"/>
-                      <w:szCs w:val="16"/>
+                      <w:caps w:val="false"/>
+                      <w:color w:val="17221B"/>
+                      <w:sz w:val="17"/>
+                      <w:szCs w:val="17"/>
                     </w:rPr>
-                    <w:t xml:space="preserve">Bank transfer (BACS)</w:t>
+                    <w:t xml:space="preserve">HSBC</w:t>
                   </w:r>
                 </w:p>
               </w:tc>
             </w:tr>
+          </w:tbl>
+          <w:tbl>
+            <w:tblPr>
+              <w:tblW w:type="dxa" w:w="5000"/>
+              <w:tblBorders>
+                <w:top w:val="none" w:color="FFFFFF" w:sz="0"/>
+                <w:left w:val="none" w:color="FFFFFF" w:sz="0"/>
+                <w:bottom w:val="none" w:color="FFFFFF" w:sz="0"/>
+                <w:right w:val="none" w:color="FFFFFF" w:sz="0"/>
+                <w:insideH w:val="none" w:color="FFFFFF" w:sz="0"/>
+                <w:insideV w:val="none" w:color="FFFFFF" w:sz="0"/>
+              </w:tblBorders>
+              <w:tblLayout w:type="fixed"/>
+            </w:tblPr>
+            <w:tblGrid>
+              <w:gridCol w:w="1700"/>
+              <w:gridCol w:w="3300"/>
+            </w:tblGrid>
             <w:tr>
               <w:tc>
                 <w:tcPr>
-                  <w:tcW w:type="dxa" w:w="5153"/>
+                  <w:tcW w:type="dxa" w:w="1700"/>
                   <w:tcBorders>
                     <w:top w:val="none" w:color="FFFFFF" w:sz="0"/>
-                    <w:left w:val="single" w:color="CDD6CF" w:sz="4"/>
-                    <w:bottom w:val="single" w:color="CDD6CF" w:sz="4"/>
-                    <w:right w:val="single" w:color="CDD6CF" w:sz="4"/>
+                    <w:left w:val="none" w:color="FFFFFF" w:sz="0"/>
+                    <w:bottom w:val="none" w:color="FFFFFF" w:sz="0"/>
+                    <w:right w:val="none" w:color="FFFFFF" w:sz="0"/>
                   </w:tcBorders>
                   <w:tcMar>
-                    <w:top w:type="dxa" w:w="80"/>
-                    <w:left w:type="dxa" w:w="120"/>
-                    <w:bottom w:type="dxa" w:w="90"/>
-                    <w:right w:type="dxa" w:w="120"/>
+                    <w:top w:type="dxa" w:w="15"/>
+                    <w:left w:type="dxa" w:w="0"/>
+                    <w:bottom w:type="dxa" w:w="15"/>
+                    <w:right w:type="dxa" w:w="60"/>
                   </w:tcMar>
                   <w:vAlign w:val="top"/>
                 </w:tcPr>
-                <w:tbl>
-                  <w:tblPr>
-                    <w:tblW w:type="dxa" w:w="4913"/>
-                    <w:tblBorders>
-                      <w:top w:val="none" w:color="FFFFFF" w:sz="0"/>
-                      <w:left w:val="none" w:color="FFFFFF" w:sz="0"/>
-                      <w:bottom w:val="none" w:color="FFFFFF" w:sz="0"/>
-                      <w:right w:val="none" w:color="FFFFFF" w:sz="0"/>
-                      <w:insideH w:val="none" w:color="FFFFFF" w:sz="0"/>
-                      <w:insideV w:val="none" w:color="FFFFFF" w:sz="0"/>
-                    </w:tblBorders>
-                    <w:tblLayout w:type="fixed"/>
-                  </w:tblPr>
-                  <w:tblGrid>
-                    <w:gridCol w:w="1670"/>
-                    <w:gridCol w:w="3243"/>
-                  </w:tblGrid>
-                  <w:tr>
-                    <w:tc>
-                      <w:tcPr>
-                        <w:tcW w:type="dxa" w:w="1670"/>
-                        <w:tcBorders>
-                          <w:top w:val="none" w:color="FFFFFF" w:sz="0"/>
-                          <w:left w:val="none" w:color="FFFFFF" w:sz="0"/>
-                          <w:bottom w:val="none" w:color="FFFFFF" w:sz="0"/>
-                          <w:right w:val="none" w:color="FFFFFF" w:sz="0"/>
-                        </w:tcBorders>
-                        <w:tcMar>
-                          <w:top w:type="dxa" w:w="15"/>
-                          <w:left w:type="dxa" w:w="0"/>
-                          <w:bottom w:type="dxa" w:w="15"/>
-                          <w:right w:type="dxa" w:w="60"/>
-                        </w:tcMar>
-                        <w:vAlign w:val="top"/>
-                      </w:tcPr>
-                      <w:p>
-                        <w:pPr>
-                          <w:spacing w:after="0" w:before="0" w:line="260"/>
-                        </w:pPr>
-                        <w:r>
-                          <w:rPr>
-                            <w:rFonts w:ascii="Arial" w:cs="Arial" w:eastAsia="Arial" w:hAnsi="Arial"/>
-                            <w:b w:val="false"/>
-                            <w:bCs w:val="false"/>
-                            <w:caps w:val="false"/>
-                            <w:color w:val="5B6B60"/>
-                            <w:sz w:val="17"/>
-                            <w:szCs w:val="17"/>
-                          </w:rPr>
-                          <w:t xml:space="preserve">Bank</w:t>
-                        </w:r>
-                      </w:p>
-                    </w:tc>
-                    <w:tc>
-                      <w:tcPr>
-                        <w:tcW w:type="dxa" w:w="3243"/>
-                        <w:tcBorders>
-                          <w:top w:val="none" w:color="FFFFFF" w:sz="0"/>
-                          <w:left w:val="none" w:color="FFFFFF" w:sz="0"/>
-                          <w:bottom w:val="none" w:color="FFFFFF" w:sz="0"/>
-                          <w:right w:val="none" w:color="FFFFFF" w:sz="0"/>
-                        </w:tcBorders>
-                        <w:tcMar>
-                          <w:top w:type="dxa" w:w="15"/>
-                          <w:left w:type="dxa" w:w="0"/>
-                          <w:bottom w:type="dxa" w:w="15"/>
-                          <w:right w:type="dxa" w:w="0"/>
-                        </w:tcMar>
-                        <w:vAlign w:val="top"/>
-                      </w:tcPr>
-                      <w:p>
-                        <w:pPr>
-                          <w:spacing w:after="0" w:before="0" w:line="260"/>
-                        </w:pPr>
-                        <w:r>
-                          <w:rPr>
-                            <w:rFonts w:ascii="Arial" w:cs="Arial" w:eastAsia="Arial" w:hAnsi="Arial"/>
-                            <w:b/>
-                            <w:bCs/>
-                            <w:caps w:val="false"/>
-                            <w:color w:val="17221B"/>
-                            <w:sz w:val="17"/>
-                            <w:szCs w:val="17"/>
-                          </w:rPr>
-                          <w:t xml:space="preserve">HSBC</w:t>
-                        </w:r>
-                      </w:p>
-                    </w:tc>
-                  </w:tr>
-                </w:tbl>
-                <w:tbl>
-                  <w:tblPr>
-                    <w:tblW w:type="dxa" w:w="4913"/>
-                    <w:tblBorders>
-                      <w:top w:val="none" w:color="FFFFFF" w:sz="0"/>
-                      <w:left w:val="none" w:color="FFFFFF" w:sz="0"/>
-                      <w:bottom w:val="none" w:color="FFFFFF" w:sz="0"/>
-                      <w:right w:val="none" w:color="FFFFFF" w:sz="0"/>
-                      <w:insideH w:val="none" w:color="FFFFFF" w:sz="0"/>
-                      <w:insideV w:val="none" w:color="FFFFFF" w:sz="0"/>
-                    </w:tblBorders>
-                    <w:tblLayout w:type="fixed"/>
-                  </w:tblPr>
-                  <w:tblGrid>
-                    <w:gridCol w:w="1670"/>
-                    <w:gridCol w:w="3243"/>
-                  </w:tblGrid>
-                  <w:tr>
-                    <w:tc>
-                      <w:tcPr>
-                        <w:tcW w:type="dxa" w:w="1670"/>
-                        <w:tcBorders>
-                          <w:top w:val="none" w:color="FFFFFF" w:sz="0"/>
-                          <w:left w:val="none" w:color="FFFFFF" w:sz="0"/>
-                          <w:bottom w:val="none" w:color="FFFFFF" w:sz="0"/>
-                          <w:right w:val="none" w:color="FFFFFF" w:sz="0"/>
-                        </w:tcBorders>
-                        <w:tcMar>
-                          <w:top w:type="dxa" w:w="15"/>
-                          <w:left w:type="dxa" w:w="0"/>
-                          <w:bottom w:type="dxa" w:w="15"/>
-                          <w:right w:type="dxa" w:w="60"/>
-                        </w:tcMar>
-                        <w:vAlign w:val="top"/>
-                      </w:tcPr>
-                      <w:p>
-                        <w:pPr>
-                          <w:spacing w:after="0" w:before="0" w:line="260"/>
-                        </w:pPr>
-                        <w:r>
-                          <w:rPr>
-                            <w:rFonts w:ascii="Arial" w:cs="Arial" w:eastAsia="Arial" w:hAnsi="Arial"/>
-                            <w:b w:val="false"/>
-                            <w:bCs w:val="false"/>
-                            <w:caps w:val="false"/>
-                            <w:color w:val="5B6B60"/>
-                            <w:sz w:val="17"/>
-                            <w:szCs w:val="17"/>
-                          </w:rPr>
-                          <w:t xml:space="preserve">Account name</w:t>
-                        </w:r>
-                      </w:p>
-                    </w:tc>
-                    <w:tc>
-                      <w:tcPr>
-                        <w:tcW w:type="dxa" w:w="3243"/>
-                        <w:tcBorders>
-                          <w:top w:val="none" w:color="FFFFFF" w:sz="0"/>
-                          <w:left w:val="none" w:color="FFFFFF" w:sz="0"/>
-                          <w:bottom w:val="none" w:color="FFFFFF" w:sz="0"/>
-                          <w:right w:val="none" w:color="FFFFFF" w:sz="0"/>
-                        </w:tcBorders>
-                        <w:tcMar>
-                          <w:top w:type="dxa" w:w="15"/>
-                          <w:left w:type="dxa" w:w="0"/>
-                          <w:bottom w:type="dxa" w:w="15"/>
-                          <w:right w:type="dxa" w:w="0"/>
-                        </w:tcMar>
-                        <w:vAlign w:val="top"/>
-                      </w:tcPr>
-                      <w:p>
-                        <w:pPr>
-                          <w:spacing w:after="0" w:before="0" w:line="260"/>
-                        </w:pPr>
-                        <w:r>
-                          <w:rPr>
-                            <w:rFonts w:ascii="Arial" w:cs="Arial" w:eastAsia="Arial" w:hAnsi="Arial"/>
-                            <w:b/>
-                            <w:bCs/>
-                            <w:caps w:val="false"/>
-                            <w:color w:val="17221B"/>
-                            <w:sz w:val="17"/>
-                            <w:szCs w:val="17"/>
-                          </w:rPr>
-                          <w:t xml:space="preserve">Aura Solutions Group Limited</w:t>
-                        </w:r>
-                      </w:p>
-                    </w:tc>
-                  </w:tr>
-                </w:tbl>
-                <w:tbl>
-                  <w:tblPr>
-                    <w:tblW w:type="dxa" w:w="4913"/>
-                    <w:tblBorders>
-                      <w:top w:val="none" w:color="FFFFFF" w:sz="0"/>
-                      <w:left w:val="none" w:color="FFFFFF" w:sz="0"/>
-                      <w:bottom w:val="none" w:color="FFFFFF" w:sz="0"/>
-                      <w:right w:val="none" w:color="FFFFFF" w:sz="0"/>
-                      <w:insideH w:val="none" w:color="FFFFFF" w:sz="0"/>
-                      <w:insideV w:val="none" w:color="FFFFFF" w:sz="0"/>
-                    </w:tblBorders>
-                    <w:tblLayout w:type="fixed"/>
-                  </w:tblPr>
-                  <w:tblGrid>
-                    <w:gridCol w:w="1670"/>
-                    <w:gridCol w:w="3243"/>
-                  </w:tblGrid>
-                  <w:tr>
-                    <w:tc>
-                      <w:tcPr>
-                        <w:tcW w:type="dxa" w:w="1670"/>
-                        <w:tcBorders>
-                          <w:top w:val="none" w:color="FFFFFF" w:sz="0"/>
-                          <w:left w:val="none" w:color="FFFFFF" w:sz="0"/>
-                          <w:bottom w:val="none" w:color="FFFFFF" w:sz="0"/>
-                          <w:right w:val="none" w:color="FFFFFF" w:sz="0"/>
-                        </w:tcBorders>
-                        <w:tcMar>
-                          <w:top w:type="dxa" w:w="15"/>
-                          <w:left w:type="dxa" w:w="0"/>
-                          <w:bottom w:type="dxa" w:w="15"/>
-                          <w:right w:type="dxa" w:w="60"/>
-                        </w:tcMar>
-                        <w:vAlign w:val="top"/>
-                      </w:tcPr>
-                      <w:p>
-                        <w:pPr>
-                          <w:spacing w:after="0" w:before="0" w:line="260"/>
-                        </w:pPr>
-                        <w:r>
-                          <w:rPr>
-                            <w:rFonts w:ascii="Arial" w:cs="Arial" w:eastAsia="Arial" w:hAnsi="Arial"/>
-                            <w:b w:val="false"/>
-                            <w:bCs w:val="false"/>
-                            <w:caps w:val="false"/>
-                            <w:color w:val="5B6B60"/>
-                            <w:sz w:val="17"/>
-                            <w:szCs w:val="17"/>
-                          </w:rPr>
-                          <w:t xml:space="preserve">Sort code</w:t>
-                        </w:r>
-                      </w:p>
-                    </w:tc>
-                    <w:tc>
-                      <w:tcPr>
-                        <w:tcW w:type="dxa" w:w="3243"/>
-                        <w:tcBorders>
-                          <w:top w:val="none" w:color="FFFFFF" w:sz="0"/>
-                          <w:left w:val="none" w:color="FFFFFF" w:sz="0"/>
-                          <w:bottom w:val="none" w:color="FFFFFF" w:sz="0"/>
-                          <w:right w:val="none" w:color="FFFFFF" w:sz="0"/>
-                        </w:tcBorders>
-                        <w:tcMar>
-                          <w:top w:type="dxa" w:w="15"/>
-                          <w:left w:type="dxa" w:w="0"/>
-                          <w:bottom w:type="dxa" w:w="15"/>
-                          <w:right w:type="dxa" w:w="0"/>
-                        </w:tcMar>
-                        <w:vAlign w:val="top"/>
-                      </w:tcPr>
-                      <w:p>
-                        <w:pPr>
-                          <w:spacing w:after="0" w:before="0" w:line="260"/>
-                        </w:pPr>
-                        <w:r>
-                          <w:rPr>
-                            <w:rFonts w:ascii="Arial" w:cs="Arial" w:eastAsia="Arial" w:hAnsi="Arial"/>
-                            <w:b/>
-                            <w:bCs/>
-                            <w:caps w:val="false"/>
-                            <w:color w:val="17221B"/>
-                            <w:sz w:val="17"/>
-                            <w:szCs w:val="17"/>
-                          </w:rPr>
-                          <w:t xml:space="preserve">40-18-00</w:t>
-                        </w:r>
-                      </w:p>
-                    </w:tc>
-                  </w:tr>
-                </w:tbl>
-                <w:tbl>
-                  <w:tblPr>
-                    <w:tblW w:type="dxa" w:w="4913"/>
-                    <w:tblBorders>
-                      <w:top w:val="none" w:color="FFFFFF" w:sz="0"/>
-                      <w:left w:val="none" w:color="FFFFFF" w:sz="0"/>
-                      <w:bottom w:val="none" w:color="FFFFFF" w:sz="0"/>
-                      <w:right w:val="none" w:color="FFFFFF" w:sz="0"/>
-                      <w:insideH w:val="none" w:color="FFFFFF" w:sz="0"/>
-                      <w:insideV w:val="none" w:color="FFFFFF" w:sz="0"/>
-                    </w:tblBorders>
-                    <w:tblLayout w:type="fixed"/>
-                  </w:tblPr>
-                  <w:tblGrid>
-                    <w:gridCol w:w="1670"/>
-                    <w:gridCol w:w="3243"/>
-                  </w:tblGrid>
-                  <w:tr>
-                    <w:tc>
-                      <w:tcPr>
-                        <w:tcW w:type="dxa" w:w="1670"/>
-                        <w:tcBorders>
-                          <w:top w:val="none" w:color="FFFFFF" w:sz="0"/>
-                          <w:left w:val="none" w:color="FFFFFF" w:sz="0"/>
-                          <w:bottom w:val="none" w:color="FFFFFF" w:sz="0"/>
-                          <w:right w:val="none" w:color="FFFFFF" w:sz="0"/>
-                        </w:tcBorders>
-                        <w:tcMar>
-                          <w:top w:type="dxa" w:w="15"/>
-                          <w:left w:type="dxa" w:w="0"/>
-                          <w:bottom w:type="dxa" w:w="15"/>
-                          <w:right w:type="dxa" w:w="60"/>
-                        </w:tcMar>
-                        <w:vAlign w:val="top"/>
-                      </w:tcPr>
-                      <w:p>
-                        <w:pPr>
-                          <w:spacing w:after="0" w:before="0" w:line="260"/>
-                        </w:pPr>
-                        <w:r>
-                          <w:rPr>
-                            <w:rFonts w:ascii="Arial" w:cs="Arial" w:eastAsia="Arial" w:hAnsi="Arial"/>
-                            <w:b w:val="false"/>
-                            <w:bCs w:val="false"/>
-                            <w:caps w:val="false"/>
-                            <w:color w:val="5B6B60"/>
-                            <w:sz w:val="17"/>
-                            <w:szCs w:val="17"/>
-                          </w:rPr>
-                          <w:t xml:space="preserve">Account no.</w:t>
-                        </w:r>
-                      </w:p>
-                    </w:tc>
-                    <w:tc>
-                      <w:tcPr>
-                        <w:tcW w:type="dxa" w:w="3243"/>
-                        <w:tcBorders>
-                          <w:top w:val="none" w:color="FFFFFF" w:sz="0"/>
-                          <w:left w:val="none" w:color="FFFFFF" w:sz="0"/>
-                          <w:bottom w:val="none" w:color="FFFFFF" w:sz="0"/>
-                          <w:right w:val="none" w:color="FFFFFF" w:sz="0"/>
-                        </w:tcBorders>
-                        <w:tcMar>
-                          <w:top w:type="dxa" w:w="15"/>
-                          <w:left w:type="dxa" w:w="0"/>
-                          <w:bottom w:type="dxa" w:w="15"/>
-                          <w:right w:type="dxa" w:w="0"/>
-                        </w:tcMar>
-                        <w:vAlign w:val="top"/>
-                      </w:tcPr>
-                      <w:p>
-                        <w:pPr>
-                          <w:spacing w:after="0" w:before="0" w:line="260"/>
-                        </w:pPr>
-                        <w:r>
-                          <w:rPr>
-                            <w:rFonts w:ascii="Arial" w:cs="Arial" w:eastAsia="Arial" w:hAnsi="Arial"/>
-                            <w:b/>
-                            <w:bCs/>
-                            <w:caps w:val="false"/>
-                            <w:color w:val="17221B"/>
-                            <w:sz w:val="17"/>
-                            <w:szCs w:val="17"/>
-                          </w:rPr>
-                          <w:t xml:space="preserve">31377817</w:t>
-                        </w:r>
-                      </w:p>
-                    </w:tc>
-                  </w:tr>
-                </w:tbl>
-                <w:tbl>
-                  <w:tblPr>
-                    <w:tblW w:type="dxa" w:w="4913"/>
-                    <w:tblBorders>
-                      <w:top w:val="none" w:color="FFFFFF" w:sz="0"/>
-                      <w:left w:val="none" w:color="FFFFFF" w:sz="0"/>
-                      <w:bottom w:val="none" w:color="FFFFFF" w:sz="0"/>
-                      <w:right w:val="none" w:color="FFFFFF" w:sz="0"/>
-                      <w:insideH w:val="none" w:color="FFFFFF" w:sz="0"/>
-                      <w:insideV w:val="none" w:color="FFFFFF" w:sz="0"/>
-                    </w:tblBorders>
-                    <w:tblLayout w:type="fixed"/>
-                  </w:tblPr>
-                  <w:tblGrid>
-                    <w:gridCol w:w="1670"/>
-                    <w:gridCol w:w="3243"/>
-                  </w:tblGrid>
-                  <w:tr>
-                    <w:tc>
-                      <w:tcPr>
-                        <w:tcW w:type="dxa" w:w="1670"/>
-                        <w:tcBorders>
-                          <w:top w:val="none" w:color="FFFFFF" w:sz="0"/>
-                          <w:left w:val="none" w:color="FFFFFF" w:sz="0"/>
-                          <w:bottom w:val="none" w:color="FFFFFF" w:sz="0"/>
-                          <w:right w:val="none" w:color="FFFFFF" w:sz="0"/>
-                        </w:tcBorders>
-                        <w:tcMar>
-                          <w:top w:type="dxa" w:w="15"/>
-                          <w:left w:type="dxa" w:w="0"/>
-                          <w:bottom w:type="dxa" w:w="15"/>
-                          <w:right w:type="dxa" w:w="60"/>
-                        </w:tcMar>
-                        <w:vAlign w:val="top"/>
-                      </w:tcPr>
-                      <w:p>
-                        <w:pPr>
-                          <w:spacing w:after="0" w:before="0" w:line="260"/>
-                        </w:pPr>
-                        <w:r>
-                          <w:rPr>
-                            <w:rFonts w:ascii="Arial" w:cs="Arial" w:eastAsia="Arial" w:hAnsi="Arial"/>
-                            <w:b w:val="false"/>
-                            <w:bCs w:val="false"/>
-                            <w:caps w:val="false"/>
-                            <w:color w:val="5B6B60"/>
-                            <w:sz w:val="17"/>
-                            <w:szCs w:val="17"/>
-                          </w:rPr>
-                          <w:t xml:space="preserve">Reference</w:t>
-                        </w:r>
-                      </w:p>
-                    </w:tc>
-                    <w:tc>
-                      <w:tcPr>
-                        <w:tcW w:type="dxa" w:w="3243"/>
-                        <w:tcBorders>
-                          <w:top w:val="none" w:color="FFFFFF" w:sz="0"/>
-                          <w:left w:val="none" w:color="FFFFFF" w:sz="0"/>
-                          <w:bottom w:val="none" w:color="FFFFFF" w:sz="0"/>
-                          <w:right w:val="none" w:color="FFFFFF" w:sz="0"/>
-                        </w:tcBorders>
-                        <w:tcMar>
-                          <w:top w:type="dxa" w:w="15"/>
-                          <w:left w:type="dxa" w:w="0"/>
-                          <w:bottom w:type="dxa" w:w="15"/>
-                          <w:right w:type="dxa" w:w="0"/>
-                        </w:tcMar>
-                        <w:vAlign w:val="top"/>
-                      </w:tcPr>
-                      <w:p>
-                        <w:pPr>
-                          <w:spacing w:after="0" w:before="0" w:line="260"/>
-                        </w:pPr>
-                        <w:r>
-                          <w:rPr>
-                            <w:rFonts w:ascii="Arial" w:cs="Arial" w:eastAsia="Arial" w:hAnsi="Arial"/>
-                            <w:b/>
-                            <w:bCs/>
-                            <w:caps w:val="false"/>
-                            <w:color w:val="17221B"/>
-                            <w:sz w:val="17"/>
-                            <w:szCs w:val="17"/>
-                          </w:rPr>
-                          <w:fldChar w:fldCharType="begin"/>
-                        </w:r>
-                        <w:r>
-                          <w:rPr>
-                            <w:rFonts w:ascii="Arial" w:cs="Arial" w:eastAsia="Arial" w:hAnsi="Arial"/>
-                            <w:b/>
-                            <w:bCs/>
-                            <w:caps w:val="false"/>
-                            <w:color w:val="17221B"/>
-                            <w:sz w:val="17"/>
-                            <w:szCs w:val="17"/>
-                          </w:rPr>
-                          <w:instrText xml:space="preserve"> MERGEFIELD  InvoiceNumber  \* MERGEFORMAT </w:instrText>
-                        </w:r>
-                        <w:r>
-                          <w:rPr>
-                            <w:rFonts w:ascii="Arial" w:cs="Arial" w:eastAsia="Arial" w:hAnsi="Arial"/>
-                            <w:b/>
-                            <w:bCs/>
-                            <w:caps w:val="false"/>
-                            <w:color w:val="17221B"/>
-                            <w:sz w:val="17"/>
-                            <w:szCs w:val="17"/>
-                          </w:rPr>
-                          <w:fldChar w:fldCharType="separate"/>
-                        </w:r>
-                        <w:r>
-                          <w:rPr>
-                            <w:rFonts w:ascii="Arial" w:cs="Arial" w:eastAsia="Arial" w:hAnsi="Arial"/>
-                            <w:b/>
-                            <w:bCs/>
-                            <w:caps w:val="false"/>
-                            <w:color w:val="17221B"/>
-                            <w:sz w:val="17"/>
-                            <w:szCs w:val="17"/>
-                          </w:rPr>
-                          <w:t xml:space="preserve">«InvoiceNumber»</w:t>
-                        </w:r>
-                        <w:r>
-                          <w:rPr>
-                            <w:rFonts w:ascii="Arial" w:cs="Arial" w:eastAsia="Arial" w:hAnsi="Arial"/>
-                            <w:b/>
-                            <w:bCs/>
-                            <w:caps w:val="false"/>
-                            <w:color w:val="17221B"/>
-                            <w:sz w:val="17"/>
-                            <w:szCs w:val="17"/>
-                          </w:rPr>
-                          <w:fldChar w:fldCharType="end"/>
-                        </w:r>
-                      </w:p>
-                    </w:tc>
-                  </w:tr>
-                </w:tbl>
-                <w:p/>
+                <w:p>
+                  <w:pPr>
+                    <w:spacing w:after="0" w:before="0" w:line="260"/>
+                  </w:pPr>
+                  <w:r>
+                    <w:rPr>
+                      <w:rFonts w:ascii="Arial" w:cs="Arial" w:eastAsia="Arial" w:hAnsi="Arial"/>
+                      <w:b w:val="false"/>
+                      <w:bCs w:val="false"/>
+                      <w:caps w:val="false"/>
+                      <w:color w:val="5B6B60"/>
+                      <w:sz w:val="17"/>
+                      <w:szCs w:val="17"/>
+                    </w:rPr>
+                    <w:t xml:space="preserve">Account name</w:t>
+                  </w:r>
+                </w:p>
+              </w:tc>
+              <w:tc>
+                <w:tcPr>
+                  <w:tcW w:type="dxa" w:w="3300"/>
+                  <w:tcBorders>
+                    <w:top w:val="none" w:color="FFFFFF" w:sz="0"/>
+                    <w:left w:val="none" w:color="FFFFFF" w:sz="0"/>
+                    <w:bottom w:val="none" w:color="FFFFFF" w:sz="0"/>
+                    <w:right w:val="none" w:color="FFFFFF" w:sz="0"/>
+                  </w:tcBorders>
+                  <w:tcMar>
+                    <w:top w:type="dxa" w:w="15"/>
+                    <w:left w:type="dxa" w:w="0"/>
+                    <w:bottom w:type="dxa" w:w="15"/>
+                    <w:right w:type="dxa" w:w="0"/>
+                  </w:tcMar>
+                  <w:vAlign w:val="top"/>
+                </w:tcPr>
+                <w:p>
+                  <w:pPr>
+                    <w:spacing w:after="0" w:before="0" w:line="260"/>
+                  </w:pPr>
+                  <w:r>
+                    <w:rPr>
+                      <w:rFonts w:ascii="Arial" w:cs="Arial" w:eastAsia="Arial" w:hAnsi="Arial"/>
+                      <w:b/>
+                      <w:bCs/>
+                      <w:caps w:val="false"/>
+                      <w:color w:val="17221B"/>
+                      <w:sz w:val="17"/>
+                      <w:szCs w:val="17"/>
+                    </w:rPr>
+                    <w:t xml:space="preserve">Aura Solutions Group Limited</w:t>
+                  </w:r>
+                </w:p>
+              </w:tc>
+            </w:tr>
+          </w:tbl>
+          <w:tbl>
+            <w:tblPr>
+              <w:tblW w:type="dxa" w:w="5000"/>
+              <w:tblBorders>
+                <w:top w:val="none" w:color="FFFFFF" w:sz="0"/>
+                <w:left w:val="none" w:color="FFFFFF" w:sz="0"/>
+                <w:bottom w:val="none" w:color="FFFFFF" w:sz="0"/>
+                <w:right w:val="none" w:color="FFFFFF" w:sz="0"/>
+                <w:insideH w:val="none" w:color="FFFFFF" w:sz="0"/>
+                <w:insideV w:val="none" w:color="FFFFFF" w:sz="0"/>
+              </w:tblBorders>
+              <w:tblLayout w:type="fixed"/>
+            </w:tblPr>
+            <w:tblGrid>
+              <w:gridCol w:w="1700"/>
+              <w:gridCol w:w="3300"/>
+            </w:tblGrid>
+            <w:tr>
+              <w:tc>
+                <w:tcPr>
+                  <w:tcW w:type="dxa" w:w="1700"/>
+                  <w:tcBorders>
+                    <w:top w:val="none" w:color="FFFFFF" w:sz="0"/>
+                    <w:left w:val="none" w:color="FFFFFF" w:sz="0"/>
+                    <w:bottom w:val="none" w:color="FFFFFF" w:sz="0"/>
+                    <w:right w:val="none" w:color="FFFFFF" w:sz="0"/>
+                  </w:tcBorders>
+                  <w:tcMar>
+                    <w:top w:type="dxa" w:w="15"/>
+                    <w:left w:type="dxa" w:w="0"/>
+                    <w:bottom w:type="dxa" w:w="15"/>
+                    <w:right w:type="dxa" w:w="60"/>
+                  </w:tcMar>
+                  <w:vAlign w:val="top"/>
+                </w:tcPr>
+                <w:p>
+                  <w:pPr>
+                    <w:spacing w:after="0" w:before="0" w:line="260"/>
+                  </w:pPr>
+                  <w:r>
+                    <w:rPr>
+                      <w:rFonts w:ascii="Arial" w:cs="Arial" w:eastAsia="Arial" w:hAnsi="Arial"/>
+                      <w:b w:val="false"/>
+                      <w:bCs w:val="false"/>
+                      <w:caps w:val="false"/>
+                      <w:color w:val="5B6B60"/>
+                      <w:sz w:val="17"/>
+                      <w:szCs w:val="17"/>
+                    </w:rPr>
+                    <w:t xml:space="preserve">Sort code</w:t>
+                  </w:r>
+                </w:p>
+              </w:tc>
+              <w:tc>
+                <w:tcPr>
+                  <w:tcW w:type="dxa" w:w="3300"/>
+                  <w:tcBorders>
+                    <w:top w:val="none" w:color="FFFFFF" w:sz="0"/>
+                    <w:left w:val="none" w:color="FFFFFF" w:sz="0"/>
+                    <w:bottom w:val="none" w:color="FFFFFF" w:sz="0"/>
+                    <w:right w:val="none" w:color="FFFFFF" w:sz="0"/>
+                  </w:tcBorders>
+                  <w:tcMar>
+                    <w:top w:type="dxa" w:w="15"/>
+                    <w:left w:type="dxa" w:w="0"/>
+                    <w:bottom w:type="dxa" w:w="15"/>
+                    <w:right w:type="dxa" w:w="0"/>
+                  </w:tcMar>
+                  <w:vAlign w:val="top"/>
+                </w:tcPr>
+                <w:p>
+                  <w:pPr>
+                    <w:spacing w:after="0" w:before="0" w:line="260"/>
+                  </w:pPr>
+                  <w:r>
+                    <w:rPr>
+                      <w:rFonts w:ascii="Arial" w:cs="Arial" w:eastAsia="Arial" w:hAnsi="Arial"/>
+                      <w:b/>
+                      <w:bCs/>
+                      <w:caps w:val="false"/>
+                      <w:color w:val="17221B"/>
+                      <w:sz w:val="17"/>
+                      <w:szCs w:val="17"/>
+                    </w:rPr>
+                    <w:t xml:space="preserve">40-18-00</w:t>
+                  </w:r>
+                </w:p>
+              </w:tc>
+            </w:tr>
+          </w:tbl>
+          <w:tbl>
+            <w:tblPr>
+              <w:tblW w:type="dxa" w:w="5000"/>
+              <w:tblBorders>
+                <w:top w:val="none" w:color="FFFFFF" w:sz="0"/>
+                <w:left w:val="none" w:color="FFFFFF" w:sz="0"/>
+                <w:bottom w:val="none" w:color="FFFFFF" w:sz="0"/>
+                <w:right w:val="none" w:color="FFFFFF" w:sz="0"/>
+                <w:insideH w:val="none" w:color="FFFFFF" w:sz="0"/>
+                <w:insideV w:val="none" w:color="FFFFFF" w:sz="0"/>
+              </w:tblBorders>
+              <w:tblLayout w:type="fixed"/>
+            </w:tblPr>
+            <w:tblGrid>
+              <w:gridCol w:w="1700"/>
+              <w:gridCol w:w="3300"/>
+            </w:tblGrid>
+            <w:tr>
+              <w:tc>
+                <w:tcPr>
+                  <w:tcW w:type="dxa" w:w="1700"/>
+                  <w:tcBorders>
+                    <w:top w:val="none" w:color="FFFFFF" w:sz="0"/>
+                    <w:left w:val="none" w:color="FFFFFF" w:sz="0"/>
+                    <w:bottom w:val="none" w:color="FFFFFF" w:sz="0"/>
+                    <w:right w:val="none" w:color="FFFFFF" w:sz="0"/>
+                  </w:tcBorders>
+                  <w:tcMar>
+                    <w:top w:type="dxa" w:w="15"/>
+                    <w:left w:type="dxa" w:w="0"/>
+                    <w:bottom w:type="dxa" w:w="15"/>
+                    <w:right w:type="dxa" w:w="60"/>
+                  </w:tcMar>
+                  <w:vAlign w:val="top"/>
+                </w:tcPr>
+                <w:p>
+                  <w:pPr>
+                    <w:spacing w:after="0" w:before="0" w:line="260"/>
+                  </w:pPr>
+                  <w:r>
+                    <w:rPr>
+                      <w:rFonts w:ascii="Arial" w:cs="Arial" w:eastAsia="Arial" w:hAnsi="Arial"/>
+                      <w:b w:val="false"/>
+                      <w:bCs w:val="false"/>
+                      <w:caps w:val="false"/>
+                      <w:color w:val="5B6B60"/>
+                      <w:sz w:val="17"/>
+                      <w:szCs w:val="17"/>
+                    </w:rPr>
+                    <w:t xml:space="preserve">Account no.</w:t>
+                  </w:r>
+                </w:p>
+              </w:tc>
+              <w:tc>
+                <w:tcPr>
+                  <w:tcW w:type="dxa" w:w="3300"/>
+                  <w:tcBorders>
+                    <w:top w:val="none" w:color="FFFFFF" w:sz="0"/>
+                    <w:left w:val="none" w:color="FFFFFF" w:sz="0"/>
+                    <w:bottom w:val="none" w:color="FFFFFF" w:sz="0"/>
+                    <w:right w:val="none" w:color="FFFFFF" w:sz="0"/>
+                  </w:tcBorders>
+                  <w:tcMar>
+                    <w:top w:type="dxa" w:w="15"/>
+                    <w:left w:type="dxa" w:w="0"/>
+                    <w:bottom w:type="dxa" w:w="15"/>
+                    <w:right w:type="dxa" w:w="0"/>
+                  </w:tcMar>
+                  <w:vAlign w:val="top"/>
+                </w:tcPr>
+                <w:p>
+                  <w:pPr>
+                    <w:spacing w:after="0" w:before="0" w:line="260"/>
+                  </w:pPr>
+                  <w:r>
+                    <w:rPr>
+                      <w:rFonts w:ascii="Arial" w:cs="Arial" w:eastAsia="Arial" w:hAnsi="Arial"/>
+                      <w:b/>
+                      <w:bCs/>
+                      <w:caps w:val="false"/>
+                      <w:color w:val="17221B"/>
+                      <w:sz w:val="17"/>
+                      <w:szCs w:val="17"/>
+                    </w:rPr>
+                    <w:t xml:space="preserve">31377817</w:t>
+                  </w:r>
+                </w:p>
+              </w:tc>
+            </w:tr>
+          </w:tbl>
+          <w:tbl>
+            <w:tblPr>
+              <w:tblW w:type="dxa" w:w="5000"/>
+              <w:tblBorders>
+                <w:top w:val="none" w:color="FFFFFF" w:sz="0"/>
+                <w:left w:val="none" w:color="FFFFFF" w:sz="0"/>
+                <w:bottom w:val="none" w:color="FFFFFF" w:sz="0"/>
+                <w:right w:val="none" w:color="FFFFFF" w:sz="0"/>
+                <w:insideH w:val="none" w:color="FFFFFF" w:sz="0"/>
+                <w:insideV w:val="none" w:color="FFFFFF" w:sz="0"/>
+              </w:tblBorders>
+              <w:tblLayout w:type="fixed"/>
+            </w:tblPr>
+            <w:tblGrid>
+              <w:gridCol w:w="1700"/>
+              <w:gridCol w:w="3300"/>
+            </w:tblGrid>
+            <w:tr>
+              <w:tc>
+                <w:tcPr>
+                  <w:tcW w:type="dxa" w:w="1700"/>
+                  <w:tcBorders>
+                    <w:top w:val="none" w:color="FFFFFF" w:sz="0"/>
+                    <w:left w:val="none" w:color="FFFFFF" w:sz="0"/>
+                    <w:bottom w:val="none" w:color="FFFFFF" w:sz="0"/>
+                    <w:right w:val="none" w:color="FFFFFF" w:sz="0"/>
+                  </w:tcBorders>
+                  <w:tcMar>
+                    <w:top w:type="dxa" w:w="15"/>
+                    <w:left w:type="dxa" w:w="0"/>
+                    <w:bottom w:type="dxa" w:w="15"/>
+                    <w:right w:type="dxa" w:w="60"/>
+                  </w:tcMar>
+                  <w:vAlign w:val="top"/>
+                </w:tcPr>
+                <w:p>
+                  <w:pPr>
+                    <w:spacing w:after="0" w:before="0" w:line="260"/>
+                  </w:pPr>
+                  <w:r>
+                    <w:rPr>
+                      <w:rFonts w:ascii="Arial" w:cs="Arial" w:eastAsia="Arial" w:hAnsi="Arial"/>
+                      <w:b w:val="false"/>
+                      <w:bCs w:val="false"/>
+                      <w:caps w:val="false"/>
+                      <w:color w:val="5B6B60"/>
+                      <w:sz w:val="17"/>
+                      <w:szCs w:val="17"/>
+                    </w:rPr>
+                    <w:t xml:space="preserve">Payment reference</w:t>
+                  </w:r>
+                </w:p>
+              </w:tc>
+              <w:tc>
+                <w:tcPr>
+                  <w:tcW w:type="dxa" w:w="3300"/>
+                  <w:tcBorders>
+                    <w:top w:val="none" w:color="FFFFFF" w:sz="0"/>
+                    <w:left w:val="none" w:color="FFFFFF" w:sz="0"/>
+                    <w:bottom w:val="none" w:color="FFFFFF" w:sz="0"/>
+                    <w:right w:val="none" w:color="FFFFFF" w:sz="0"/>
+                  </w:tcBorders>
+                  <w:tcMar>
+                    <w:top w:type="dxa" w:w="15"/>
+                    <w:left w:type="dxa" w:w="0"/>
+                    <w:bottom w:type="dxa" w:w="15"/>
+                    <w:right w:type="dxa" w:w="0"/>
+                  </w:tcMar>
+                  <w:vAlign w:val="top"/>
+                </w:tcPr>
+                <w:p>
+                  <w:pPr>
+                    <w:spacing w:after="0" w:before="0" w:line="260"/>
+                  </w:pPr>
+                  <w:r>
+                    <w:rPr>
+                      <w:rFonts w:ascii="Arial" w:cs="Arial" w:eastAsia="Arial" w:hAnsi="Arial"/>
+                      <w:b/>
+                      <w:bCs/>
+                      <w:caps w:val="false"/>
+                      <w:color w:val="17221B"/>
+                      <w:sz w:val="17"/>
+                      <w:szCs w:val="17"/>
+                    </w:rPr>
+                    <w:fldChar w:fldCharType="begin"/>
+                  </w:r>
+                  <w:r>
+                    <w:rPr>
+                      <w:rFonts w:ascii="Arial" w:cs="Arial" w:eastAsia="Arial" w:hAnsi="Arial"/>
+                      <w:b/>
+                      <w:bCs/>
+                      <w:caps w:val="false"/>
+                      <w:color w:val="17221B"/>
+                      <w:sz w:val="17"/>
+                      <w:szCs w:val="17"/>
+                    </w:rPr>
+                    <w:instrText xml:space="preserve"> MERGEFIELD  InvoiceNumber  \* MERGEFORMAT </w:instrText>
+                  </w:r>
+                  <w:r>
+                    <w:rPr>
+                      <w:rFonts w:ascii="Arial" w:cs="Arial" w:eastAsia="Arial" w:hAnsi="Arial"/>
+                      <w:b/>
+                      <w:bCs/>
+                      <w:caps w:val="false"/>
+                      <w:color w:val="17221B"/>
+                      <w:sz w:val="17"/>
+                      <w:szCs w:val="17"/>
+                    </w:rPr>
+                    <w:fldChar w:fldCharType="separate"/>
+                  </w:r>
+                  <w:r>
+                    <w:rPr>
+                      <w:rFonts w:ascii="Arial" w:cs="Arial" w:eastAsia="Arial" w:hAnsi="Arial"/>
+                      <w:b/>
+                      <w:bCs/>
+                      <w:caps w:val="false"/>
+                      <w:color w:val="17221B"/>
+                      <w:sz w:val="17"/>
+                      <w:szCs w:val="17"/>
+                    </w:rPr>
+                    <w:t xml:space="preserve">«InvoiceNumber»</w:t>
+                  </w:r>
+                  <w:r>
+                    <w:rPr>
+                      <w:rFonts w:ascii="Arial" w:cs="Arial" w:eastAsia="Arial" w:hAnsi="Arial"/>
+                      <w:b/>
+                      <w:bCs/>
+                      <w:caps w:val="false"/>
+                      <w:color w:val="17221B"/>
+                      <w:sz w:val="17"/>
+                      <w:szCs w:val="17"/>
+                    </w:rPr>
+                    <w:fldChar w:fldCharType="end"/>
+                  </w:r>
+                </w:p>
               </w:tc>
             </w:tr>
           </w:tbl>
@@ -4358,7 +4138,7 @@
               <w:top w:val="none" w:color="FFFFFF" w:sz="0"/>
               <w:left w:val="none" w:color="FFFFFF" w:sz="0"/>
               <w:bottom w:val="none" w:color="FFFFFF" w:sz="0"/>
-              <w:right w:val="none" w:color="FFFFFF" w:sz="0"/>
+              <w:right w:val="single" w:color="CDD6CF" w:sz="4"/>
             </w:tcBorders>
             <w:tcMar>
               <w:top w:type="dxa" w:w="0"/>
@@ -4376,7 +4156,7 @@
         </w:tc>
         <w:tc>
           <w:tcPr>
-            <w:tcW w:type="dxa" w:w="5153"/>
+            <w:tcW w:type="dxa" w:w="5106"/>
             <w:tcBorders>
               <w:top w:val="none" w:color="FFFFFF" w:sz="0"/>
               <w:left w:val="none" w:color="FFFFFF" w:sz="0"/>
@@ -4391,336 +4171,323 @@
             </w:tcMar>
             <w:vAlign w:val="top"/>
           </w:tcPr>
-          <w:tbl>
-            <w:tblPr>
-              <w:tblW w:type="dxa" w:w="5153"/>
-              <w:tblBorders>
-                <w:top w:val="none" w:color="FFFFFF" w:sz="0"/>
-                <w:left w:val="none" w:color="FFFFFF" w:sz="0"/>
-                <w:bottom w:val="none" w:color="FFFFFF" w:sz="0"/>
-                <w:right w:val="none" w:color="FFFFFF" w:sz="0"/>
-                <w:insideH w:val="none" w:color="FFFFFF" w:sz="0"/>
-                <w:insideV w:val="none" w:color="FFFFFF" w:sz="0"/>
-              </w:tblBorders>
-              <w:tblLayout w:type="fixed"/>
-            </w:tblPr>
-            <w:tblGrid>
-              <w:gridCol w:w="5153"/>
-            </w:tblGrid>
-            <w:tr>
-              <w:tc>
-                <w:tcPr>
-                  <w:tcW w:type="dxa" w:w="5153"/>
-                  <w:tcBorders>
-                    <w:top w:val="single" w:color="CDD6CF" w:sz="4"/>
-                    <w:left w:val="single" w:color="CDD6CF" w:sz="4"/>
-                    <w:bottom w:val="single" w:color="CDD6CF" w:sz="4"/>
-                    <w:right w:val="single" w:color="CDD6CF" w:sz="4"/>
-                  </w:tcBorders>
-                  <w:shd w:fill="EEF4EF" w:color="auto" w:val="clear"/>
-                  <w:tcMar>
-                    <w:top w:type="dxa" w:w="50"/>
-                    <w:left w:type="dxa" w:w="120"/>
-                    <w:bottom w:type="dxa" w:w="50"/>
-                    <w:right w:type="dxa" w:w="120"/>
-                  </w:tcMar>
-                  <w:vAlign w:val="top"/>
-                </w:tcPr>
-                <w:p>
-                  <w:pPr>
-                    <w:spacing w:after="0" w:before="0" w:line="260"/>
-                  </w:pPr>
-                  <w:r>
-                    <w:rPr>
-                      <w:rFonts w:ascii="Arial" w:cs="Arial" w:eastAsia="Arial" w:hAnsi="Arial"/>
-                      <w:b/>
-                      <w:bCs/>
-                      <w:caps/>
-                      <w:color w:val="2F6B3A"/>
-                      <w:spacing w:val="10"/>
-                      <w:sz w:val="16"/>
-                      <w:szCs w:val="16"/>
-                    </w:rPr>
-                    <w:t xml:space="preserve">Terms</w:t>
-                  </w:r>
-                </w:p>
-              </w:tc>
-            </w:tr>
-            <w:tr>
-              <w:tc>
-                <w:tcPr>
-                  <w:tcW w:type="dxa" w:w="5153"/>
-                  <w:tcBorders>
-                    <w:top w:val="none" w:color="FFFFFF" w:sz="0"/>
-                    <w:left w:val="single" w:color="CDD6CF" w:sz="4"/>
-                    <w:bottom w:val="single" w:color="CDD6CF" w:sz="4"/>
-                    <w:right w:val="single" w:color="CDD6CF" w:sz="4"/>
-                  </w:tcBorders>
-                  <w:tcMar>
-                    <w:top w:type="dxa" w:w="80"/>
-                    <w:left w:type="dxa" w:w="120"/>
-                    <w:bottom w:type="dxa" w:w="90"/>
-                    <w:right w:type="dxa" w:w="120"/>
-                  </w:tcMar>
-                  <w:vAlign w:val="top"/>
-                </w:tcPr>
-                <w:p>
-                  <w:pPr>
-                    <w:spacing w:after="60" w:before="0" w:line="260"/>
-                  </w:pPr>
-                  <w:r>
-                    <w:rPr>
-                      <w:rFonts w:ascii="Arial" w:cs="Arial" w:eastAsia="Arial" w:hAnsi="Arial"/>
-                      <w:b w:val="false"/>
-                      <w:bCs w:val="false"/>
-                      <w:caps w:val="false"/>
-                      <w:color w:val="17221B"/>
-                      <w:sz w:val="16"/>
-                      <w:szCs w:val="16"/>
-                    </w:rPr>
-                    <w:t xml:space="preserve">Payment is due by </w:t>
-                  </w:r>
-                  <w:r>
-                    <w:rPr>
-                      <w:rFonts w:ascii="Arial" w:cs="Arial" w:eastAsia="Arial" w:hAnsi="Arial"/>
-                      <w:b w:val="false"/>
-                      <w:bCs w:val="false"/>
-                      <w:caps w:val="false"/>
-                      <w:color w:val="17221B"/>
-                      <w:sz w:val="16"/>
-                      <w:szCs w:val="16"/>
-                    </w:rPr>
-                    <w:fldChar w:fldCharType="begin"/>
-                  </w:r>
-                  <w:r>
-                    <w:rPr>
-                      <w:rFonts w:ascii="Arial" w:cs="Arial" w:eastAsia="Arial" w:hAnsi="Arial"/>
-                      <w:b w:val="false"/>
-                      <w:bCs w:val="false"/>
-                      <w:caps w:val="false"/>
-                      <w:color w:val="17221B"/>
-                      <w:sz w:val="16"/>
-                      <w:szCs w:val="16"/>
-                    </w:rPr>
-                    <w:instrText xml:space="preserve"> MERGEFIELD  InvoiceDueDate  \@ "d MMMM yyyy"  \* MERGEFORMAT </w:instrText>
-                  </w:r>
-                  <w:r>
-                    <w:rPr>
-                      <w:rFonts w:ascii="Arial" w:cs="Arial" w:eastAsia="Arial" w:hAnsi="Arial"/>
-                      <w:b w:val="false"/>
-                      <w:bCs w:val="false"/>
-                      <w:caps w:val="false"/>
-                      <w:color w:val="17221B"/>
-                      <w:sz w:val="16"/>
-                      <w:szCs w:val="16"/>
-                    </w:rPr>
-                    <w:fldChar w:fldCharType="separate"/>
-                  </w:r>
-                  <w:r>
-                    <w:rPr>
-                      <w:rFonts w:ascii="Arial" w:cs="Arial" w:eastAsia="Arial" w:hAnsi="Arial"/>
-                      <w:b w:val="false"/>
-                      <w:bCs w:val="false"/>
-                      <w:caps w:val="false"/>
-                      <w:color w:val="17221B"/>
-                      <w:sz w:val="16"/>
-                      <w:szCs w:val="16"/>
-                    </w:rPr>
-                    <w:t xml:space="preserve">«InvoiceDueDate»</w:t>
-                  </w:r>
-                  <w:r>
-                    <w:rPr>
-                      <w:rFonts w:ascii="Arial" w:cs="Arial" w:eastAsia="Arial" w:hAnsi="Arial"/>
-                      <w:b w:val="false"/>
-                      <w:bCs w:val="false"/>
-                      <w:caps w:val="false"/>
-                      <w:color w:val="17221B"/>
-                      <w:sz w:val="16"/>
-                      <w:szCs w:val="16"/>
-                    </w:rPr>
-                    <w:fldChar w:fldCharType="end"/>
-                  </w:r>
-                  <w:r>
-                    <w:rPr>
-                      <w:rFonts w:ascii="Arial" w:cs="Arial" w:eastAsia="Arial" w:hAnsi="Arial"/>
-                      <w:b w:val="false"/>
-                      <w:bCs w:val="false"/>
-                      <w:caps w:val="false"/>
-                      <w:color w:val="17221B"/>
-                      <w:sz w:val="16"/>
-                      <w:szCs w:val="16"/>
-                    </w:rPr>
-                    <w:t xml:space="preserve"> (30 days end of month). Please quote the invoice number as your reference and send remittance advice to info@aurasolutions.co.uk.</w:t>
-                  </w:r>
-                </w:p>
-                <w:p>
-                  <w:pPr>
-                    <w:spacing w:after="60" w:before="0" w:line="260"/>
-                  </w:pPr>
-                  <w:r>
-                    <w:rPr>
-                      <w:rFonts w:ascii="Arial" w:cs="Arial" w:eastAsia="Arial" w:hAnsi="Arial"/>
-                      <w:b w:val="false"/>
-                      <w:bCs w:val="false"/>
-                      <w:caps w:val="false"/>
-                      <w:color w:val="17221B"/>
-                      <w:sz w:val="16"/>
-                      <w:szCs w:val="16"/>
-                    </w:rPr>
-                    <w:t xml:space="preserve">No CIS deductions are to be made from this invoice.</w:t>
-                  </w:r>
-                </w:p>
-                <w:p>
-                  <w:pPr>
-                    <w:spacing w:after="60" w:before="0" w:line="260"/>
-                  </w:pPr>
-                  <w:r>
-                    <w:rPr>
-                      <w:rFonts w:ascii="Arial" w:cs="Arial" w:eastAsia="Arial" w:hAnsi="Arial"/>
-                      <w:b w:val="false"/>
-                      <w:bCs w:val="false"/>
-                      <w:caps w:val="false"/>
-                      <w:color w:val="5B6B60"/>
-                      <w:sz w:val="15"/>
-                      <w:szCs w:val="15"/>
-                    </w:rPr>
-                    <w:t xml:space="preserve">Accounts not settled within terms may be charged interest and compensation under the Late Payment of Commercial Debts (Interest) Act 1998.</w:t>
-                  </w:r>
-                </w:p>
-                <w:p>
-                  <w:pPr>
-                    <w:spacing w:after="0" w:before="0" w:line="260"/>
-                  </w:pPr>
-                  <w:r>
-                    <w:rPr>
-                      <w:rFonts w:ascii="Arial" w:cs="Arial" w:eastAsia="Arial" w:hAnsi="Arial"/>
-                      <w:b/>
-                      <w:bCs/>
-                      <w:caps w:val="false"/>
-                      <w:color w:val="2F6B3A"/>
-                      <w:sz w:val="16"/>
-                      <w:szCs w:val="16"/>
-                    </w:rPr>
-                    <w:fldChar w:fldCharType="begin"/>
-                  </w:r>
-                  <w:r>
-                    <w:rPr>
-                      <w:rFonts w:ascii="Arial" w:cs="Arial" w:eastAsia="Arial" w:hAnsi="Arial"/>
-                      <w:b/>
-                      <w:bCs/>
-                      <w:caps w:val="false"/>
-                      <w:color w:val="2F6B3A"/>
-                      <w:sz w:val="16"/>
-                      <w:szCs w:val="16"/>
-                    </w:rPr>
-                    <w:instrText xml:space="preserve"> MERGEFIELD  PaymentMessageAndUrl  \* MERGEFORMAT </w:instrText>
-                  </w:r>
-                  <w:r>
-                    <w:rPr>
-                      <w:rFonts w:ascii="Arial" w:cs="Arial" w:eastAsia="Arial" w:hAnsi="Arial"/>
-                      <w:b/>
-                      <w:bCs/>
-                      <w:caps w:val="false"/>
-                      <w:color w:val="2F6B3A"/>
-                      <w:sz w:val="16"/>
-                      <w:szCs w:val="16"/>
-                    </w:rPr>
-                    <w:fldChar w:fldCharType="separate"/>
-                  </w:r>
-                  <w:r>
-                    <w:rPr>
-                      <w:rFonts w:ascii="Arial" w:cs="Arial" w:eastAsia="Arial" w:hAnsi="Arial"/>
-                      <w:b/>
-                      <w:bCs/>
-                      <w:caps w:val="false"/>
-                      <w:color w:val="2F6B3A"/>
-                      <w:sz w:val="16"/>
-                      <w:szCs w:val="16"/>
-                    </w:rPr>
-                    <w:t xml:space="preserve">«PaymentMessageAndUrl»</w:t>
-                  </w:r>
-                  <w:r>
-                    <w:rPr>
-                      <w:rFonts w:ascii="Arial" w:cs="Arial" w:eastAsia="Arial" w:hAnsi="Arial"/>
-                      <w:b/>
-                      <w:bCs/>
-                      <w:caps w:val="false"/>
-                      <w:color w:val="2F6B3A"/>
-                      <w:sz w:val="16"/>
-                      <w:szCs w:val="16"/>
-                    </w:rPr>
-                    <w:fldChar w:fldCharType="end"/>
-                  </w:r>
-                </w:p>
-                <w:p>
-                  <w:pPr>
-                    <w:spacing w:after="0" w:before="0" w:line="260"/>
-                  </w:pPr>
-                  <w:r>
-                    <w:rPr>
-                      <w:rFonts w:ascii="Arial" w:cs="Arial" w:eastAsia="Arial" w:hAnsi="Arial"/>
-                      <w:b w:val="false"/>
-                      <w:bCs w:val="false"/>
-                      <w:caps w:val="false"/>
-                      <w:color w:val="17221B"/>
-                      <w:sz w:val="18"/>
-                      <w:szCs w:val="18"/>
-                    </w:rPr>
-                    <w:fldChar w:fldCharType="begin"/>
-                  </w:r>
-                  <w:r>
-                    <w:rPr>
-                      <w:rFonts w:ascii="Arial" w:cs="Arial" w:eastAsia="Arial" w:hAnsi="Arial"/>
-                      <w:b w:val="false"/>
-                      <w:bCs w:val="false"/>
-                      <w:caps w:val="false"/>
-                      <w:color w:val="17221B"/>
-                      <w:sz w:val="18"/>
-                      <w:szCs w:val="18"/>
-                    </w:rPr>
-                    <w:instrText xml:space="preserve"> MERGEFIELD  PaymentImage  \* MERGEFORMAT </w:instrText>
-                  </w:r>
-                  <w:r>
-                    <w:rPr>
-                      <w:rFonts w:ascii="Arial" w:cs="Arial" w:eastAsia="Arial" w:hAnsi="Arial"/>
-                      <w:b w:val="false"/>
-                      <w:bCs w:val="false"/>
-                      <w:caps w:val="false"/>
-                      <w:color w:val="17221B"/>
-                      <w:sz w:val="18"/>
-                      <w:szCs w:val="18"/>
-                    </w:rPr>
-                    <w:fldChar w:fldCharType="separate"/>
-                  </w:r>
-                  <w:r>
-                    <w:rPr>
-                      <w:rFonts w:ascii="Arial" w:cs="Arial" w:eastAsia="Arial" w:hAnsi="Arial"/>
-                      <w:b w:val="false"/>
-                      <w:bCs w:val="false"/>
-                      <w:caps w:val="false"/>
-                      <w:color w:val="17221B"/>
-                      <w:sz w:val="18"/>
-                      <w:szCs w:val="18"/>
-                    </w:rPr>
-                    <w:t xml:space="preserve">«PaymentImage»</w:t>
-                  </w:r>
-                  <w:r>
-                    <w:rPr>
-                      <w:rFonts w:ascii="Arial" w:cs="Arial" w:eastAsia="Arial" w:hAnsi="Arial"/>
-                      <w:b w:val="false"/>
-                      <w:bCs w:val="false"/>
-                      <w:caps w:val="false"/>
-                      <w:color w:val="17221B"/>
-                      <w:sz w:val="18"/>
-                      <w:szCs w:val="18"/>
-                    </w:rPr>
-                    <w:fldChar w:fldCharType="end"/>
-                  </w:r>
-                </w:p>
-              </w:tc>
-            </w:tr>
-          </w:tbl>
-          <w:p/>
+          <w:p>
+            <w:pPr>
+              <w:spacing w:after="60" w:before="0" w:line="260"/>
+              <w:ind w:left="200"/>
+            </w:pPr>
+            <w:r>
+              <w:rPr>
+                <w:rFonts w:ascii="Arial" w:cs="Arial" w:eastAsia="Arial" w:hAnsi="Arial"/>
+                <w:b/>
+                <w:bCs/>
+                <w:caps/>
+                <w:color w:val="2F6B3A"/>
+                <w:spacing w:val="10"/>
+                <w:sz w:val="16"/>
+                <w:szCs w:val="16"/>
+              </w:rPr>
+              <w:t xml:space="preserve">Pay online</w:t>
+            </w:r>
+          </w:p>
+          <w:p>
+            <w:pPr>
+              <w:spacing w:after="40"/>
+              <w:ind w:left="200"/>
+            </w:pPr>
+            <w:r>
+              <w:rPr>
+                <w:rFonts w:ascii="Arial" w:cs="Arial" w:eastAsia="Arial" w:hAnsi="Arial"/>
+                <w:b w:val="false"/>
+                <w:bCs w:val="false"/>
+                <w:caps w:val="false"/>
+                <w:color w:val="17221B"/>
+                <w:sz w:val="18"/>
+                <w:szCs w:val="18"/>
+              </w:rPr>
+              <w:fldChar w:fldCharType="begin"/>
+            </w:r>
+            <w:r>
+              <w:rPr>
+                <w:rFonts w:ascii="Arial" w:cs="Arial" w:eastAsia="Arial" w:hAnsi="Arial"/>
+                <w:b w:val="false"/>
+                <w:bCs w:val="false"/>
+                <w:caps w:val="false"/>
+                <w:color w:val="17221B"/>
+                <w:sz w:val="18"/>
+                <w:szCs w:val="18"/>
+              </w:rPr>
+              <w:instrText xml:space="preserve"> MERGEFIELD  PaymentImage  \* MERGEFORMAT </w:instrText>
+            </w:r>
+            <w:r>
+              <w:rPr>
+                <w:rFonts w:ascii="Arial" w:cs="Arial" w:eastAsia="Arial" w:hAnsi="Arial"/>
+                <w:b w:val="false"/>
+                <w:bCs w:val="false"/>
+                <w:caps w:val="false"/>
+                <w:color w:val="17221B"/>
+                <w:sz w:val="18"/>
+                <w:szCs w:val="18"/>
+              </w:rPr>
+              <w:fldChar w:fldCharType="separate"/>
+            </w:r>
+            <w:r>
+              <w:rPr>
+                <w:rFonts w:ascii="Arial" w:cs="Arial" w:eastAsia="Arial" w:hAnsi="Arial"/>
+                <w:b w:val="false"/>
+                <w:bCs w:val="false"/>
+                <w:caps w:val="false"/>
+                <w:color w:val="17221B"/>
+                <w:sz w:val="18"/>
+                <w:szCs w:val="18"/>
+              </w:rPr>
+              <w:t xml:space="preserve">«PaymentImage»</w:t>
+            </w:r>
+            <w:r>
+              <w:rPr>
+                <w:rFonts w:ascii="Arial" w:cs="Arial" w:eastAsia="Arial" w:hAnsi="Arial"/>
+                <w:b w:val="false"/>
+                <w:bCs w:val="false"/>
+                <w:caps w:val="false"/>
+                <w:color w:val="17221B"/>
+                <w:sz w:val="18"/>
+                <w:szCs w:val="18"/>
+              </w:rPr>
+              <w:fldChar w:fldCharType="end"/>
+            </w:r>
+          </w:p>
+          <w:p>
+            <w:pPr>
+              <w:spacing w:after="0" w:before="0" w:line="260"/>
+              <w:ind w:left="200"/>
+            </w:pPr>
+            <w:r>
+              <w:rPr>
+                <w:rFonts w:ascii="Arial" w:cs="Arial" w:eastAsia="Arial" w:hAnsi="Arial"/>
+                <w:b/>
+                <w:bCs/>
+                <w:caps w:val="false"/>
+                <w:color w:val="2F6B3A"/>
+                <w:sz w:val="16"/>
+                <w:szCs w:val="16"/>
+              </w:rPr>
+              <w:fldChar w:fldCharType="begin"/>
+            </w:r>
+            <w:r>
+              <w:rPr>
+                <w:rFonts w:ascii="Arial" w:cs="Arial" w:eastAsia="Arial" w:hAnsi="Arial"/>
+                <w:b/>
+                <w:bCs/>
+                <w:caps w:val="false"/>
+                <w:color w:val="2F6B3A"/>
+                <w:sz w:val="16"/>
+                <w:szCs w:val="16"/>
+              </w:rPr>
+              <w:instrText xml:space="preserve"> MERGEFIELD  PaymentMessageAndUrl  \* MERGEFORMAT </w:instrText>
+            </w:r>
+            <w:r>
+              <w:rPr>
+                <w:rFonts w:ascii="Arial" w:cs="Arial" w:eastAsia="Arial" w:hAnsi="Arial"/>
+                <w:b/>
+                <w:bCs/>
+                <w:caps w:val="false"/>
+                <w:color w:val="2F6B3A"/>
+                <w:sz w:val="16"/>
+                <w:szCs w:val="16"/>
+              </w:rPr>
+              <w:fldChar w:fldCharType="separate"/>
+            </w:r>
+            <w:r>
+              <w:rPr>
+                <w:rFonts w:ascii="Arial" w:cs="Arial" w:eastAsia="Arial" w:hAnsi="Arial"/>
+                <w:b/>
+                <w:bCs/>
+                <w:caps w:val="false"/>
+                <w:color w:val="2F6B3A"/>
+                <w:sz w:val="16"/>
+                <w:szCs w:val="16"/>
+              </w:rPr>
+              <w:t xml:space="preserve">«PaymentMessageAndUrl»</w:t>
+            </w:r>
+            <w:r>
+              <w:rPr>
+                <w:rFonts w:ascii="Arial" w:cs="Arial" w:eastAsia="Arial" w:hAnsi="Arial"/>
+                <w:b/>
+                <w:bCs/>
+                <w:caps w:val="false"/>
+                <w:color w:val="2F6B3A"/>
+                <w:sz w:val="16"/>
+                <w:szCs w:val="16"/>
+              </w:rPr>
+              <w:fldChar w:fldCharType="end"/>
+            </w:r>
+          </w:p>
+        </w:tc>
+      </w:tr>
+    </w:tbl>
+    <w:p>
+      <w:pPr>
+        <w:spacing w:after="80"/>
+      </w:pPr>
+    </w:p>
+    <w:tbl>
+      <w:tblPr>
+        <w:tblW w:type="dxa" w:w="10466"/>
+        <w:tblBorders>
+          <w:top w:val="none" w:color="FFFFFF" w:sz="0"/>
+          <w:left w:val="none" w:color="FFFFFF" w:sz="0"/>
+          <w:bottom w:val="none" w:color="FFFFFF" w:sz="0"/>
+          <w:right w:val="none" w:color="FFFFFF" w:sz="0"/>
+          <w:insideH w:val="none" w:color="FFFFFF" w:sz="0"/>
+          <w:insideV w:val="none" w:color="FFFFFF" w:sz="0"/>
+        </w:tblBorders>
+        <w:tblLayout w:type="fixed"/>
+      </w:tblPr>
+      <w:tblGrid>
+        <w:gridCol w:w="10466"/>
+      </w:tblGrid>
+      <w:tr>
+        <w:tc>
+          <w:tcPr>
+            <w:tcW w:type="dxa" w:w="10466"/>
+            <w:tcBorders>
+              <w:top w:val="single" w:color="E3E9E4" w:sz="4"/>
+              <w:left w:val="single" w:color="E3E9E4" w:sz="4"/>
+              <w:bottom w:val="single" w:color="E3E9E4" w:sz="4"/>
+              <w:right w:val="single" w:color="E3E9E4" w:sz="4"/>
+            </w:tcBorders>
+            <w:shd w:fill="F6F9F6" w:color="auto" w:val="clear"/>
+            <w:tcMar>
+              <w:top w:type="dxa" w:w="90"/>
+              <w:left w:type="dxa" w:w="140"/>
+              <w:bottom w:type="dxa" w:w="90"/>
+              <w:right w:type="dxa" w:w="140"/>
+            </w:tcMar>
+            <w:vAlign w:val="top"/>
+          </w:tcPr>
+          <w:p>
+            <w:pPr>
+              <w:spacing w:after="50" w:before="0" w:line="260"/>
+            </w:pPr>
+            <w:r>
+              <w:rPr>
+                <w:rFonts w:ascii="Arial" w:cs="Arial" w:eastAsia="Arial" w:hAnsi="Arial"/>
+                <w:b w:val="false"/>
+                <w:bCs w:val="false"/>
+                <w:caps w:val="false"/>
+                <w:color w:val="17221B"/>
+                <w:sz w:val="16"/>
+                <w:szCs w:val="16"/>
+              </w:rPr>
+              <w:t xml:space="preserve">Payment is due by </w:t>
+            </w:r>
+            <w:r>
+              <w:rPr>
+                <w:rFonts w:ascii="Arial" w:cs="Arial" w:eastAsia="Arial" w:hAnsi="Arial"/>
+                <w:b w:val="false"/>
+                <w:bCs w:val="false"/>
+                <w:caps w:val="false"/>
+                <w:color w:val="17221B"/>
+                <w:sz w:val="16"/>
+                <w:szCs w:val="16"/>
+              </w:rPr>
+              <w:fldChar w:fldCharType="begin"/>
+            </w:r>
+            <w:r>
+              <w:rPr>
+                <w:rFonts w:ascii="Arial" w:cs="Arial" w:eastAsia="Arial" w:hAnsi="Arial"/>
+                <w:b w:val="false"/>
+                <w:bCs w:val="false"/>
+                <w:caps w:val="false"/>
+                <w:color w:val="17221B"/>
+                <w:sz w:val="16"/>
+                <w:szCs w:val="16"/>
+              </w:rPr>
+              <w:instrText xml:space="preserve"> MERGEFIELD  InvoiceDueDate  \@ "d MMMM yyyy"  \* MERGEFORMAT </w:instrText>
+            </w:r>
+            <w:r>
+              <w:rPr>
+                <w:rFonts w:ascii="Arial" w:cs="Arial" w:eastAsia="Arial" w:hAnsi="Arial"/>
+                <w:b w:val="false"/>
+                <w:bCs w:val="false"/>
+                <w:caps w:val="false"/>
+                <w:color w:val="17221B"/>
+                <w:sz w:val="16"/>
+                <w:szCs w:val="16"/>
+              </w:rPr>
+              <w:fldChar w:fldCharType="separate"/>
+            </w:r>
+            <w:r>
+              <w:rPr>
+                <w:rFonts w:ascii="Arial" w:cs="Arial" w:eastAsia="Arial" w:hAnsi="Arial"/>
+                <w:b w:val="false"/>
+                <w:bCs w:val="false"/>
+                <w:caps w:val="false"/>
+                <w:color w:val="17221B"/>
+                <w:sz w:val="16"/>
+                <w:szCs w:val="16"/>
+              </w:rPr>
+              <w:t xml:space="preserve">«InvoiceDueDate»</w:t>
+            </w:r>
+            <w:r>
+              <w:rPr>
+                <w:rFonts w:ascii="Arial" w:cs="Arial" w:eastAsia="Arial" w:hAnsi="Arial"/>
+                <w:b w:val="false"/>
+                <w:bCs w:val="false"/>
+                <w:caps w:val="false"/>
+                <w:color w:val="17221B"/>
+                <w:sz w:val="16"/>
+                <w:szCs w:val="16"/>
+              </w:rPr>
+              <w:fldChar w:fldCharType="end"/>
+            </w:r>
+            <w:r>
+              <w:rPr>
+                <w:rFonts w:ascii="Arial" w:cs="Arial" w:eastAsia="Arial" w:hAnsi="Arial"/>
+                <w:b w:val="false"/>
+                <w:bCs w:val="false"/>
+                <w:caps w:val="false"/>
+                <w:color w:val="17221B"/>
+                <w:sz w:val="16"/>
+                <w:szCs w:val="16"/>
+              </w:rPr>
+              <w:t xml:space="preserve"> – 30 days end of month. Please quote the invoice number as your payment reference and send remittance advice to info@aurasolutions.co.uk.</w:t>
+            </w:r>
+          </w:p>
+          <w:p>
+            <w:pPr>
+              <w:spacing w:after="50" w:before="0" w:line="260"/>
+            </w:pPr>
+            <w:r>
+              <w:rPr>
+                <w:rFonts w:ascii="Arial" w:cs="Arial" w:eastAsia="Arial" w:hAnsi="Arial"/>
+                <w:b/>
+                <w:bCs/>
+                <w:caps w:val="false"/>
+                <w:color w:val="17221B"/>
+                <w:sz w:val="16"/>
+                <w:szCs w:val="16"/>
+              </w:rPr>
+              <w:t xml:space="preserve">No CIS deductions are to be made from this invoice.</w:t>
+            </w:r>
+          </w:p>
+          <w:p>
+            <w:pPr>
+              <w:spacing w:after="0" w:before="0" w:line="260"/>
+            </w:pPr>
+            <w:r>
+              <w:rPr>
+                <w:rFonts w:ascii="Arial" w:cs="Arial" w:eastAsia="Arial" w:hAnsi="Arial"/>
+                <w:b w:val="false"/>
+                <w:bCs w:val="false"/>
+                <w:caps w:val="false"/>
+                <w:color w:val="5B6B60"/>
+                <w:sz w:val="15"/>
+                <w:szCs w:val="15"/>
+              </w:rPr>
+              <w:t xml:space="preserve">Accounts not settled within terms may be charged interest and compensation under the Late Payment of Commercial Debts (Interest) Act 1998.</w:t>
+            </w:r>
+          </w:p>
         </w:tc>
       </w:tr>
     </w:tbl>

</xml_diff>

<commit_message>
Xero invoices: date at the start of each line, one line per visit on multi-visit jobs, no job/site block; reference falls back to job number; template v3 with subtle green
Co-Authored-By: Claude Opus 5.5 <noreply@anthropic.com>
Claude-Session: https://claude.ai/code/session_01XczQ4VoiYiQrKwLjiEtYiz
</commit_message>
<xml_diff>
--- a/templates/xero-invoice/Aura Invoice Template.docx
+++ b/templates/xero-invoice/Aura Invoice Template.docx
@@ -726,7 +726,7 @@
               <w:bottom w:val="single" w:color="CDD6CF" w:sz="4"/>
               <w:right w:val="single" w:color="CDD6CF" w:sz="4"/>
             </w:tcBorders>
-            <w:shd w:fill="72C936" w:color="auto" w:val="clear"/>
+            <w:shd w:fill="E3F2E6" w:color="auto" w:val="clear"/>
             <w:tcMar>
               <w:top w:type="dxa" w:w="70"/>
               <w:left w:type="dxa" w:w="110"/>
@@ -745,7 +745,7 @@
                 <w:b/>
                 <w:bCs/>
                 <w:caps/>
-                <w:color w:val="FFFFFF"/>
+                <w:color w:val="2F6B3A"/>
                 <w:spacing w:val="8"/>
                 <w:sz w:val="14"/>
                 <w:szCs w:val="14"/>
@@ -763,7 +763,7 @@
                 <w:b/>
                 <w:bCs/>
                 <w:caps w:val="false"/>
-                <w:color w:val="FFFFFF"/>
+                <w:color w:val="0C3E17"/>
                 <w:sz w:val="24"/>
                 <w:szCs w:val="24"/>
               </w:rPr>
@@ -775,7 +775,7 @@
                 <w:b/>
                 <w:bCs/>
                 <w:caps w:val="false"/>
-                <w:color w:val="FFFFFF"/>
+                <w:color w:val="0C3E17"/>
                 <w:sz w:val="24"/>
                 <w:szCs w:val="24"/>
               </w:rPr>
@@ -787,7 +787,7 @@
                 <w:b/>
                 <w:bCs/>
                 <w:caps w:val="false"/>
-                <w:color w:val="FFFFFF"/>
+                <w:color w:val="0C3E17"/>
                 <w:sz w:val="24"/>
                 <w:szCs w:val="24"/>
               </w:rPr>
@@ -799,7 +799,7 @@
                 <w:b/>
                 <w:bCs/>
                 <w:caps w:val="false"/>
-                <w:color w:val="FFFFFF"/>
+                <w:color w:val="0C3E17"/>
                 <w:sz w:val="24"/>
                 <w:szCs w:val="24"/>
               </w:rPr>
@@ -811,7 +811,7 @@
                 <w:b/>
                 <w:bCs/>
                 <w:caps w:val="false"/>
-                <w:color w:val="FFFFFF"/>
+                <w:color w:val="0C3E17"/>
                 <w:sz w:val="24"/>
                 <w:szCs w:val="24"/>
               </w:rPr>
@@ -823,7 +823,7 @@
                 <w:b/>
                 <w:bCs/>
                 <w:caps w:val="false"/>
-                <w:color w:val="FFFFFF"/>
+                <w:color w:val="0C3E17"/>
                 <w:sz w:val="24"/>
                 <w:szCs w:val="24"/>
               </w:rPr>
@@ -3419,7 +3419,7 @@
               <w:bottom w:val="none" w:color="FFFFFF" w:sz="0"/>
               <w:right w:val="none" w:color="FFFFFF" w:sz="0"/>
             </w:tcBorders>
-            <w:shd w:fill="72C936" w:color="auto" w:val="clear"/>
+            <w:shd w:fill="E3F2E6" w:color="auto" w:val="clear"/>
             <w:tcMar>
               <w:top w:type="dxa" w:w="90"/>
               <w:left w:type="dxa" w:w="120"/>
@@ -3438,7 +3438,7 @@
                 <w:b/>
                 <w:bCs/>
                 <w:caps w:val="false"/>
-                <w:color w:val="FFFFFF"/>
+                <w:color w:val="0C3E17"/>
                 <w:sz w:val="20"/>
                 <w:szCs w:val="20"/>
               </w:rPr>
@@ -3455,7 +3455,7 @@
               <w:bottom w:val="none" w:color="FFFFFF" w:sz="0"/>
               <w:right w:val="none" w:color="FFFFFF" w:sz="0"/>
             </w:tcBorders>
-            <w:shd w:fill="72C936" w:color="auto" w:val="clear"/>
+            <w:shd w:fill="E3F2E6" w:color="auto" w:val="clear"/>
             <w:tcMar>
               <w:top w:type="dxa" w:w="90"/>
               <w:left w:type="dxa" w:w="100"/>
@@ -3475,7 +3475,7 @@
                 <w:b/>
                 <w:bCs/>
                 <w:caps w:val="false"/>
-                <w:color w:val="FFFFFF"/>
+                <w:color w:val="0C3E17"/>
                 <w:sz w:val="22"/>
                 <w:szCs w:val="22"/>
               </w:rPr>
@@ -3487,7 +3487,7 @@
                 <w:b/>
                 <w:bCs/>
                 <w:caps w:val="false"/>
-                <w:color w:val="FFFFFF"/>
+                <w:color w:val="0C3E17"/>
                 <w:sz w:val="22"/>
                 <w:szCs w:val="22"/>
               </w:rPr>
@@ -3499,7 +3499,7 @@
                 <w:b/>
                 <w:bCs/>
                 <w:caps w:val="false"/>
-                <w:color w:val="FFFFFF"/>
+                <w:color w:val="0C3E17"/>
                 <w:sz w:val="22"/>
                 <w:szCs w:val="22"/>
               </w:rPr>
@@ -3511,7 +3511,7 @@
                 <w:b/>
                 <w:bCs/>
                 <w:caps w:val="false"/>
-                <w:color w:val="FFFFFF"/>
+                <w:color w:val="0C3E17"/>
                 <w:sz w:val="22"/>
                 <w:szCs w:val="22"/>
               </w:rPr>
@@ -3523,7 +3523,7 @@
                 <w:b/>
                 <w:bCs/>
                 <w:caps w:val="false"/>
-                <w:color w:val="FFFFFF"/>
+                <w:color w:val="0C3E17"/>
                 <w:sz w:val="22"/>
                 <w:szCs w:val="22"/>
               </w:rPr>
@@ -3535,7 +3535,7 @@
                 <w:b/>
                 <w:bCs/>
                 <w:caps w:val="false"/>
-                <w:color w:val="FFFFFF"/>
+                <w:color w:val="0C3E17"/>
                 <w:sz w:val="22"/>
                 <w:szCs w:val="22"/>
               </w:rPr>

</xml_diff>

<commit_message>
Invoice template v4: invoice number in a lime box, pay online centred
Co-Authored-By: Claude Opus 5.5 <noreply@anthropic.com>
Claude-Session: https://claude.ai/code/session_01XczQ4VoiYiQrKwLjiEtYiz
</commit_message>
<xml_diff>
--- a/templates/xero-invoice/Aura Invoice Template.docx
+++ b/templates/xero-invoice/Aura Invoice Template.docx
@@ -211,72 +211,112 @@
               <w:fldChar w:fldCharType="end"/>
             </w:r>
           </w:p>
-          <w:p>
-            <w:pPr>
-              <w:spacing w:after="0" w:before="0" w:line="260"/>
+          <w:tbl>
+            <w:tblPr>
+              <w:tblW w:type="dxa" w:w="2000"/>
               <w:jc w:val="right"/>
-            </w:pPr>
-            <w:r>
-              <w:rPr>
-                <w:rFonts w:ascii="Arial" w:cs="Arial" w:eastAsia="Arial" w:hAnsi="Arial"/>
-                <w:b/>
-                <w:bCs/>
-                <w:caps w:val="false"/>
-                <w:color w:val="17221B"/>
-                <w:sz w:val="23"/>
-                <w:szCs w:val="23"/>
-              </w:rPr>
-              <w:fldChar w:fldCharType="begin"/>
-            </w:r>
-            <w:r>
-              <w:rPr>
-                <w:rFonts w:ascii="Arial" w:cs="Arial" w:eastAsia="Arial" w:hAnsi="Arial"/>
-                <w:b/>
-                <w:bCs/>
-                <w:caps w:val="false"/>
-                <w:color w:val="17221B"/>
-                <w:sz w:val="23"/>
-                <w:szCs w:val="23"/>
-              </w:rPr>
-              <w:instrText xml:space="preserve"> MERGEFIELD  InvoiceNumber  \* MERGEFORMAT </w:instrText>
-            </w:r>
-            <w:r>
-              <w:rPr>
-                <w:rFonts w:ascii="Arial" w:cs="Arial" w:eastAsia="Arial" w:hAnsi="Arial"/>
-                <w:b/>
-                <w:bCs/>
-                <w:caps w:val="false"/>
-                <w:color w:val="17221B"/>
-                <w:sz w:val="23"/>
-                <w:szCs w:val="23"/>
-              </w:rPr>
-              <w:fldChar w:fldCharType="separate"/>
-            </w:r>
-            <w:r>
-              <w:rPr>
-                <w:rFonts w:ascii="Arial" w:cs="Arial" w:eastAsia="Arial" w:hAnsi="Arial"/>
-                <w:b/>
-                <w:bCs/>
-                <w:caps w:val="false"/>
-                <w:color w:val="17221B"/>
-                <w:sz w:val="23"/>
-                <w:szCs w:val="23"/>
-              </w:rPr>
-              <w:t xml:space="preserve">«InvoiceNumber»</w:t>
-            </w:r>
-            <w:r>
-              <w:rPr>
-                <w:rFonts w:ascii="Arial" w:cs="Arial" w:eastAsia="Arial" w:hAnsi="Arial"/>
-                <w:b/>
-                <w:bCs/>
-                <w:caps w:val="false"/>
-                <w:color w:val="17221B"/>
-                <w:sz w:val="23"/>
-                <w:szCs w:val="23"/>
-              </w:rPr>
-              <w:fldChar w:fldCharType="end"/>
-            </w:r>
-          </w:p>
+              <w:tblBorders>
+                <w:top w:val="none" w:color="FFFFFF" w:sz="0"/>
+                <w:left w:val="none" w:color="FFFFFF" w:sz="0"/>
+                <w:bottom w:val="none" w:color="FFFFFF" w:sz="0"/>
+                <w:right w:val="none" w:color="FFFFFF" w:sz="0"/>
+                <w:insideH w:val="none" w:color="FFFFFF" w:sz="0"/>
+                <w:insideV w:val="none" w:color="FFFFFF" w:sz="0"/>
+              </w:tblBorders>
+              <w:tblLayout w:type="fixed"/>
+            </w:tblPr>
+            <w:tblGrid>
+              <w:gridCol w:w="2000"/>
+            </w:tblGrid>
+            <w:tr>
+              <w:tc>
+                <w:tcPr>
+                  <w:tcW w:type="dxa" w:w="2000"/>
+                  <w:tcBorders>
+                    <w:top w:val="none" w:color="FFFFFF" w:sz="0"/>
+                    <w:left w:val="none" w:color="FFFFFF" w:sz="0"/>
+                    <w:bottom w:val="none" w:color="FFFFFF" w:sz="0"/>
+                    <w:right w:val="none" w:color="FFFFFF" w:sz="0"/>
+                  </w:tcBorders>
+                  <w:shd w:fill="72C936" w:color="auto" w:val="clear"/>
+                  <w:tcMar>
+                    <w:top w:type="dxa" w:w="30"/>
+                    <w:left w:type="dxa" w:w="80"/>
+                    <w:bottom w:type="dxa" w:w="30"/>
+                    <w:right w:type="dxa" w:w="80"/>
+                  </w:tcMar>
+                  <w:vAlign w:val="top"/>
+                </w:tcPr>
+                <w:p>
+                  <w:pPr>
+                    <w:spacing w:after="0" w:before="0" w:line="260"/>
+                    <w:jc w:val="center"/>
+                  </w:pPr>
+                  <w:r>
+                    <w:rPr>
+                      <w:rFonts w:ascii="Arial" w:cs="Arial" w:eastAsia="Arial" w:hAnsi="Arial"/>
+                      <w:b/>
+                      <w:bCs/>
+                      <w:caps w:val="false"/>
+                      <w:color w:val="FFFFFF"/>
+                      <w:sz w:val="22"/>
+                      <w:szCs w:val="22"/>
+                    </w:rPr>
+                    <w:fldChar w:fldCharType="begin"/>
+                  </w:r>
+                  <w:r>
+                    <w:rPr>
+                      <w:rFonts w:ascii="Arial" w:cs="Arial" w:eastAsia="Arial" w:hAnsi="Arial"/>
+                      <w:b/>
+                      <w:bCs/>
+                      <w:caps w:val="false"/>
+                      <w:color w:val="FFFFFF"/>
+                      <w:sz w:val="22"/>
+                      <w:szCs w:val="22"/>
+                    </w:rPr>
+                    <w:instrText xml:space="preserve"> MERGEFIELD  InvoiceNumber  \* MERGEFORMAT </w:instrText>
+                  </w:r>
+                  <w:r>
+                    <w:rPr>
+                      <w:rFonts w:ascii="Arial" w:cs="Arial" w:eastAsia="Arial" w:hAnsi="Arial"/>
+                      <w:b/>
+                      <w:bCs/>
+                      <w:caps w:val="false"/>
+                      <w:color w:val="FFFFFF"/>
+                      <w:sz w:val="22"/>
+                      <w:szCs w:val="22"/>
+                    </w:rPr>
+                    <w:fldChar w:fldCharType="separate"/>
+                  </w:r>
+                  <w:r>
+                    <w:rPr>
+                      <w:rFonts w:ascii="Arial" w:cs="Arial" w:eastAsia="Arial" w:hAnsi="Arial"/>
+                      <w:b/>
+                      <w:bCs/>
+                      <w:caps w:val="false"/>
+                      <w:color w:val="FFFFFF"/>
+                      <w:sz w:val="22"/>
+                      <w:szCs w:val="22"/>
+                    </w:rPr>
+                    <w:t xml:space="preserve">«InvoiceNumber»</w:t>
+                  </w:r>
+                  <w:r>
+                    <w:rPr>
+                      <w:rFonts w:ascii="Arial" w:cs="Arial" w:eastAsia="Arial" w:hAnsi="Arial"/>
+                      <w:b/>
+                      <w:bCs/>
+                      <w:caps w:val="false"/>
+                      <w:color w:val="FFFFFF"/>
+                      <w:sz w:val="22"/>
+                      <w:szCs w:val="22"/>
+                    </w:rPr>
+                    <w:fldChar w:fldCharType="end"/>
+                  </w:r>
+                </w:p>
+              </w:tc>
+            </w:tr>
+          </w:tbl>
+          <w:p/>
         </w:tc>
       </w:tr>
     </w:tbl>
@@ -4165,16 +4205,16 @@
             </w:tcBorders>
             <w:tcMar>
               <w:top w:type="dxa" w:w="0"/>
-              <w:left w:type="dxa" w:w="0"/>
+              <w:left w:type="dxa" w:w="120"/>
               <w:bottom w:type="dxa" w:w="0"/>
-              <w:right w:type="dxa" w:w="0"/>
+              <w:right w:type="dxa" w:w="120"/>
             </w:tcMar>
-            <w:vAlign w:val="top"/>
+            <w:vAlign w:val="center"/>
           </w:tcPr>
           <w:p>
             <w:pPr>
               <w:spacing w:after="60" w:before="0" w:line="260"/>
-              <w:ind w:left="200"/>
+              <w:jc w:val="center"/>
             </w:pPr>
             <w:r>
               <w:rPr>
@@ -4193,7 +4233,7 @@
           <w:p>
             <w:pPr>
               <w:spacing w:after="40"/>
-              <w:ind w:left="200"/>
+              <w:jc w:val="center"/>
             </w:pPr>
             <w:r>
               <w:rPr>
@@ -4259,7 +4299,7 @@
           <w:p>
             <w:pPr>
               <w:spacing w:after="0" w:before="0" w:line="260"/>
-              <w:ind w:left="200"/>
+              <w:jc w:val="center"/>
             </w:pPr>
             <w:r>
               <w:rPr>

</xml_diff>

<commit_message>
Invoice template v5: Bill to and From boxes the same depth
Co-Authored-By: Claude Opus 5.5 <noreply@anthropic.com>
Claude-Session: https://claude.ai/code/session_01XczQ4VoiYiQrKwLjiEtYiz
</commit_message>
<xml_diff>
--- a/templates/xero-invoice/Aura Invoice Template.docx
+++ b/templates/xero-invoice/Aura Invoice Template.docx
@@ -928,363 +928,38 @@
           <w:tcPr>
             <w:tcW w:type="dxa" w:w="5153"/>
             <w:tcBorders>
-              <w:top w:val="none" w:color="FFFFFF" w:sz="0"/>
-              <w:left w:val="none" w:color="FFFFFF" w:sz="0"/>
-              <w:bottom w:val="none" w:color="FFFFFF" w:sz="0"/>
-              <w:right w:val="none" w:color="FFFFFF" w:sz="0"/>
+              <w:top w:val="single" w:color="CDD6CF" w:sz="4"/>
+              <w:left w:val="single" w:color="CDD6CF" w:sz="4"/>
+              <w:bottom w:val="single" w:color="CDD6CF" w:sz="4"/>
+              <w:right w:val="single" w:color="CDD6CF" w:sz="4"/>
             </w:tcBorders>
+            <w:shd w:fill="EEF4EF" w:color="auto" w:val="clear"/>
             <w:tcMar>
-              <w:top w:type="dxa" w:w="0"/>
-              <w:left w:type="dxa" w:w="0"/>
-              <w:bottom w:type="dxa" w:w="0"/>
-              <w:right w:type="dxa" w:w="0"/>
+              <w:top w:type="dxa" w:w="50"/>
+              <w:left w:type="dxa" w:w="120"/>
+              <w:bottom w:type="dxa" w:w="50"/>
+              <w:right w:type="dxa" w:w="120"/>
             </w:tcMar>
             <w:vAlign w:val="top"/>
           </w:tcPr>
-          <w:tbl>
-            <w:tblPr>
-              <w:tblW w:type="dxa" w:w="5153"/>
-              <w:tblBorders>
-                <w:top w:val="none" w:color="FFFFFF" w:sz="0"/>
-                <w:left w:val="none" w:color="FFFFFF" w:sz="0"/>
-                <w:bottom w:val="none" w:color="FFFFFF" w:sz="0"/>
-                <w:right w:val="none" w:color="FFFFFF" w:sz="0"/>
-                <w:insideH w:val="none" w:color="FFFFFF" w:sz="0"/>
-                <w:insideV w:val="none" w:color="FFFFFF" w:sz="0"/>
-              </w:tblBorders>
-              <w:tblLayout w:type="fixed"/>
-            </w:tblPr>
-            <w:tblGrid>
-              <w:gridCol w:w="5153"/>
-            </w:tblGrid>
-            <w:tr>
-              <w:tc>
-                <w:tcPr>
-                  <w:tcW w:type="dxa" w:w="5153"/>
-                  <w:tcBorders>
-                    <w:top w:val="single" w:color="CDD6CF" w:sz="4"/>
-                    <w:left w:val="single" w:color="CDD6CF" w:sz="4"/>
-                    <w:bottom w:val="single" w:color="CDD6CF" w:sz="4"/>
-                    <w:right w:val="single" w:color="CDD6CF" w:sz="4"/>
-                  </w:tcBorders>
-                  <w:shd w:fill="EEF4EF" w:color="auto" w:val="clear"/>
-                  <w:tcMar>
-                    <w:top w:type="dxa" w:w="50"/>
-                    <w:left w:type="dxa" w:w="120"/>
-                    <w:bottom w:type="dxa" w:w="50"/>
-                    <w:right w:type="dxa" w:w="120"/>
-                  </w:tcMar>
-                  <w:vAlign w:val="top"/>
-                </w:tcPr>
-                <w:p>
-                  <w:pPr>
-                    <w:spacing w:after="0" w:before="0" w:line="260"/>
-                  </w:pPr>
-                  <w:r>
-                    <w:rPr>
-                      <w:rFonts w:ascii="Arial" w:cs="Arial" w:eastAsia="Arial" w:hAnsi="Arial"/>
-                      <w:b/>
-                      <w:bCs/>
-                      <w:caps/>
-                      <w:color w:val="2F6B3A"/>
-                      <w:spacing w:val="10"/>
-                      <w:sz w:val="16"/>
-                      <w:szCs w:val="16"/>
-                    </w:rPr>
-                    <w:t xml:space="preserve">Bill to</w:t>
-                  </w:r>
-                </w:p>
-              </w:tc>
-            </w:tr>
-            <w:tr>
-              <w:tc>
-                <w:tcPr>
-                  <w:tcW w:type="dxa" w:w="5153"/>
-                  <w:tcBorders>
-                    <w:top w:val="none" w:color="FFFFFF" w:sz="0"/>
-                    <w:left w:val="single" w:color="CDD6CF" w:sz="4"/>
-                    <w:bottom w:val="single" w:color="CDD6CF" w:sz="4"/>
-                    <w:right w:val="single" w:color="CDD6CF" w:sz="4"/>
-                  </w:tcBorders>
-                  <w:tcMar>
-                    <w:top w:type="dxa" w:w="80"/>
-                    <w:left w:type="dxa" w:w="120"/>
-                    <w:bottom w:type="dxa" w:w="90"/>
-                    <w:right w:type="dxa" w:w="120"/>
-                  </w:tcMar>
-                  <w:vAlign w:val="top"/>
-                </w:tcPr>
-                <w:p>
-                  <w:pPr>
-                    <w:spacing w:after="30" w:before="0" w:line="260"/>
-                  </w:pPr>
-                  <w:r>
-                    <w:rPr>
-                      <w:rFonts w:ascii="Arial" w:cs="Arial" w:eastAsia="Arial" w:hAnsi="Arial"/>
-                      <w:b/>
-                      <w:bCs/>
-                      <w:caps w:val="false"/>
-                      <w:color w:val="17221B"/>
-                      <w:sz w:val="19"/>
-                      <w:szCs w:val="19"/>
-                    </w:rPr>
-                    <w:fldChar w:fldCharType="begin"/>
-                  </w:r>
-                  <w:r>
-                    <w:rPr>
-                      <w:rFonts w:ascii="Arial" w:cs="Arial" w:eastAsia="Arial" w:hAnsi="Arial"/>
-                      <w:b/>
-                      <w:bCs/>
-                      <w:caps w:val="false"/>
-                      <w:color w:val="17221B"/>
-                      <w:sz w:val="19"/>
-                      <w:szCs w:val="19"/>
-                    </w:rPr>
-                    <w:instrText xml:space="preserve"> MERGEFIELD  ContactName  \* MERGEFORMAT </w:instrText>
-                  </w:r>
-                  <w:r>
-                    <w:rPr>
-                      <w:rFonts w:ascii="Arial" w:cs="Arial" w:eastAsia="Arial" w:hAnsi="Arial"/>
-                      <w:b/>
-                      <w:bCs/>
-                      <w:caps w:val="false"/>
-                      <w:color w:val="17221B"/>
-                      <w:sz w:val="19"/>
-                      <w:szCs w:val="19"/>
-                    </w:rPr>
-                    <w:fldChar w:fldCharType="separate"/>
-                  </w:r>
-                  <w:r>
-                    <w:rPr>
-                      <w:rFonts w:ascii="Arial" w:cs="Arial" w:eastAsia="Arial" w:hAnsi="Arial"/>
-                      <w:b/>
-                      <w:bCs/>
-                      <w:caps w:val="false"/>
-                      <w:color w:val="17221B"/>
-                      <w:sz w:val="19"/>
-                      <w:szCs w:val="19"/>
-                    </w:rPr>
-                    <w:t xml:space="preserve">«ContactName»</w:t>
-                  </w:r>
-                  <w:r>
-                    <w:rPr>
-                      <w:rFonts w:ascii="Arial" w:cs="Arial" w:eastAsia="Arial" w:hAnsi="Arial"/>
-                      <w:b/>
-                      <w:bCs/>
-                      <w:caps w:val="false"/>
-                      <w:color w:val="17221B"/>
-                      <w:sz w:val="19"/>
-                      <w:szCs w:val="19"/>
-                    </w:rPr>
-                    <w:fldChar w:fldCharType="end"/>
-                  </w:r>
-                </w:p>
-                <w:p>
-                  <w:pPr>
-                    <w:spacing w:after="30" w:before="0" w:line="260"/>
-                  </w:pPr>
-                  <w:r>
-                    <w:rPr>
-                      <w:rFonts w:ascii="Arial" w:cs="Arial" w:eastAsia="Arial" w:hAnsi="Arial"/>
-                      <w:b w:val="false"/>
-                      <w:bCs w:val="false"/>
-                      <w:caps w:val="false"/>
-                      <w:color w:val="17221B"/>
-                      <w:sz w:val="17"/>
-                      <w:szCs w:val="17"/>
-                    </w:rPr>
-                    <w:fldChar w:fldCharType="begin"/>
-                  </w:r>
-                  <w:r>
-                    <w:rPr>
-                      <w:rFonts w:ascii="Arial" w:cs="Arial" w:eastAsia="Arial" w:hAnsi="Arial"/>
-                      <w:b w:val="false"/>
-                      <w:bCs w:val="false"/>
-                      <w:caps w:val="false"/>
-                      <w:color w:val="17221B"/>
-                      <w:sz w:val="17"/>
-                      <w:szCs w:val="17"/>
-                    </w:rPr>
-                    <w:instrText xml:space="preserve"> MERGEFIELD  ContactPostalAddress  \* MERGEFORMAT </w:instrText>
-                  </w:r>
-                  <w:r>
-                    <w:rPr>
-                      <w:rFonts w:ascii="Arial" w:cs="Arial" w:eastAsia="Arial" w:hAnsi="Arial"/>
-                      <w:b w:val="false"/>
-                      <w:bCs w:val="false"/>
-                      <w:caps w:val="false"/>
-                      <w:color w:val="17221B"/>
-                      <w:sz w:val="17"/>
-                      <w:szCs w:val="17"/>
-                    </w:rPr>
-                    <w:fldChar w:fldCharType="separate"/>
-                  </w:r>
-                  <w:r>
-                    <w:rPr>
-                      <w:rFonts w:ascii="Arial" w:cs="Arial" w:eastAsia="Arial" w:hAnsi="Arial"/>
-                      <w:b w:val="false"/>
-                      <w:bCs w:val="false"/>
-                      <w:caps w:val="false"/>
-                      <w:color w:val="17221B"/>
-                      <w:sz w:val="17"/>
-                      <w:szCs w:val="17"/>
-                    </w:rPr>
-                    <w:t xml:space="preserve">«ContactPostalAddress»</w:t>
-                  </w:r>
-                  <w:r>
-                    <w:rPr>
-                      <w:rFonts w:ascii="Arial" w:cs="Arial" w:eastAsia="Arial" w:hAnsi="Arial"/>
-                      <w:b w:val="false"/>
-                      <w:bCs w:val="false"/>
-                      <w:caps w:val="false"/>
-                      <w:color w:val="17221B"/>
-                      <w:sz w:val="17"/>
-                      <w:szCs w:val="17"/>
-                    </w:rPr>
-                    <w:fldChar w:fldCharType="end"/>
-                  </w:r>
-                </w:p>
-                <w:p>
-                  <w:pPr>
-                    <w:spacing w:after="0" w:before="0" w:line="260"/>
-                  </w:pPr>
-                  <w:r>
-                    <w:rPr>
-                      <w:rFonts w:ascii="Arial" w:cs="Arial" w:eastAsia="Arial" w:hAnsi="Arial"/>
-                      <w:b w:val="false"/>
-                      <w:bCs w:val="false"/>
-                      <w:caps w:val="false"/>
-                      <w:color w:val="5B6B60"/>
-                      <w:sz w:val="15"/>
-                      <w:szCs w:val="15"/>
-                    </w:rPr>
-                    <w:fldChar w:fldCharType="begin"/>
-                  </w:r>
-                  <w:r>
-                    <w:rPr>
-                      <w:rFonts w:ascii="Arial" w:cs="Arial" w:eastAsia="Arial" w:hAnsi="Arial"/>
-                      <w:b w:val="false"/>
-                      <w:bCs w:val="false"/>
-                      <w:caps w:val="false"/>
-                      <w:color w:val="5B6B60"/>
-                      <w:sz w:val="15"/>
-                      <w:szCs w:val="15"/>
-                    </w:rPr>
-                    <w:instrText xml:space="preserve"> MERGEFIELD  ContactTaxDisplayName  \* MERGEFORMAT </w:instrText>
-                  </w:r>
-                  <w:r>
-                    <w:rPr>
-                      <w:rFonts w:ascii="Arial" w:cs="Arial" w:eastAsia="Arial" w:hAnsi="Arial"/>
-                      <w:b w:val="false"/>
-                      <w:bCs w:val="false"/>
-                      <w:caps w:val="false"/>
-                      <w:color w:val="5B6B60"/>
-                      <w:sz w:val="15"/>
-                      <w:szCs w:val="15"/>
-                    </w:rPr>
-                    <w:fldChar w:fldCharType="separate"/>
-                  </w:r>
-                  <w:r>
-                    <w:rPr>
-                      <w:rFonts w:ascii="Arial" w:cs="Arial" w:eastAsia="Arial" w:hAnsi="Arial"/>
-                      <w:b w:val="false"/>
-                      <w:bCs w:val="false"/>
-                      <w:caps w:val="false"/>
-                      <w:color w:val="5B6B60"/>
-                      <w:sz w:val="15"/>
-                      <w:szCs w:val="15"/>
-                    </w:rPr>
-                    <w:t xml:space="preserve">«ContactTaxDisplayName»</w:t>
-                  </w:r>
-                  <w:r>
-                    <w:rPr>
-                      <w:rFonts w:ascii="Arial" w:cs="Arial" w:eastAsia="Arial" w:hAnsi="Arial"/>
-                      <w:b w:val="false"/>
-                      <w:bCs w:val="false"/>
-                      <w:caps w:val="false"/>
-                      <w:color w:val="5B6B60"/>
-                      <w:sz w:val="15"/>
-                      <w:szCs w:val="15"/>
-                    </w:rPr>
-                    <w:fldChar w:fldCharType="end"/>
-                  </w:r>
-                  <w:r>
-                    <w:rPr>
-                      <w:rFonts w:ascii="Arial" w:cs="Arial" w:eastAsia="Arial" w:hAnsi="Arial"/>
-                      <w:b w:val="false"/>
-                      <w:bCs w:val="false"/>
-                      <w:caps w:val="false"/>
-                      <w:color w:val="5B6B60"/>
-                      <w:sz w:val="15"/>
-                      <w:szCs w:val="15"/>
-                    </w:rPr>
-                    <w:t xml:space="preserve"> </w:t>
-                  </w:r>
-                  <w:r>
-                    <w:rPr>
-                      <w:rFonts w:ascii="Arial" w:cs="Arial" w:eastAsia="Arial" w:hAnsi="Arial"/>
-                      <w:b w:val="false"/>
-                      <w:bCs w:val="false"/>
-                      <w:caps w:val="false"/>
-                      <w:color w:val="5B6B60"/>
-                      <w:sz w:val="15"/>
-                      <w:szCs w:val="15"/>
-                    </w:rPr>
-                    <w:fldChar w:fldCharType="begin"/>
-                  </w:r>
-                  <w:r>
-                    <w:rPr>
-                      <w:rFonts w:ascii="Arial" w:cs="Arial" w:eastAsia="Arial" w:hAnsi="Arial"/>
-                      <w:b w:val="false"/>
-                      <w:bCs w:val="false"/>
-                      <w:caps w:val="false"/>
-                      <w:color w:val="5B6B60"/>
-                      <w:sz w:val="15"/>
-                      <w:szCs w:val="15"/>
-                    </w:rPr>
-                    <w:instrText xml:space="preserve"> MERGEFIELD  ContactTaxNumber  \* MERGEFORMAT </w:instrText>
-                  </w:r>
-                  <w:r>
-                    <w:rPr>
-                      <w:rFonts w:ascii="Arial" w:cs="Arial" w:eastAsia="Arial" w:hAnsi="Arial"/>
-                      <w:b w:val="false"/>
-                      <w:bCs w:val="false"/>
-                      <w:caps w:val="false"/>
-                      <w:color w:val="5B6B60"/>
-                      <w:sz w:val="15"/>
-                      <w:szCs w:val="15"/>
-                    </w:rPr>
-                    <w:fldChar w:fldCharType="separate"/>
-                  </w:r>
-                  <w:r>
-                    <w:rPr>
-                      <w:rFonts w:ascii="Arial" w:cs="Arial" w:eastAsia="Arial" w:hAnsi="Arial"/>
-                      <w:b w:val="false"/>
-                      <w:bCs w:val="false"/>
-                      <w:caps w:val="false"/>
-                      <w:color w:val="5B6B60"/>
-                      <w:sz w:val="15"/>
-                      <w:szCs w:val="15"/>
-                    </w:rPr>
-                    <w:t xml:space="preserve">«ContactTaxNumber»</w:t>
-                  </w:r>
-                  <w:r>
-                    <w:rPr>
-                      <w:rFonts w:ascii="Arial" w:cs="Arial" w:eastAsia="Arial" w:hAnsi="Arial"/>
-                      <w:b w:val="false"/>
-                      <w:bCs w:val="false"/>
-                      <w:caps w:val="false"/>
-                      <w:color w:val="5B6B60"/>
-                      <w:sz w:val="15"/>
-                      <w:szCs w:val="15"/>
-                    </w:rPr>
-                    <w:fldChar w:fldCharType="end"/>
-                  </w:r>
-                </w:p>
-              </w:tc>
-            </w:tr>
-          </w:tbl>
-          <w:p/>
+          <w:p>
+            <w:pPr>
+              <w:spacing w:after="0" w:before="0" w:line="260"/>
+            </w:pPr>
+            <w:r>
+              <w:rPr>
+                <w:rFonts w:ascii="Arial" w:cs="Arial" w:eastAsia="Arial" w:hAnsi="Arial"/>
+                <w:b/>
+                <w:bCs/>
+                <w:caps/>
+                <w:color w:val="2F6B3A"/>
+                <w:spacing w:val="10"/>
+                <w:sz w:val="16"/>
+                <w:szCs w:val="16"/>
+              </w:rPr>
+              <w:t xml:space="preserve">Bill to</w:t>
+            </w:r>
+          </w:p>
         </w:tc>
         <w:tc>
           <w:tcPr>
@@ -1305,13 +980,337 @@
           </w:tcPr>
           <w:p>
             <w:pPr>
-              <w:spacing w:after="40" w:before="0" w:line="260"/>
+              <w:spacing w:after="0" w:before="0" w:line="260"/>
             </w:pPr>
           </w:p>
         </w:tc>
         <w:tc>
           <w:tcPr>
             <w:tcW w:type="dxa" w:w="5153"/>
+            <w:tcBorders>
+              <w:top w:val="single" w:color="CDD6CF" w:sz="4"/>
+              <w:left w:val="single" w:color="CDD6CF" w:sz="4"/>
+              <w:bottom w:val="single" w:color="CDD6CF" w:sz="4"/>
+              <w:right w:val="single" w:color="CDD6CF" w:sz="4"/>
+            </w:tcBorders>
+            <w:shd w:fill="EEF4EF" w:color="auto" w:val="clear"/>
+            <w:tcMar>
+              <w:top w:type="dxa" w:w="50"/>
+              <w:left w:type="dxa" w:w="120"/>
+              <w:bottom w:type="dxa" w:w="50"/>
+              <w:right w:type="dxa" w:w="120"/>
+            </w:tcMar>
+            <w:vAlign w:val="top"/>
+          </w:tcPr>
+          <w:p>
+            <w:pPr>
+              <w:spacing w:after="0" w:before="0" w:line="260"/>
+            </w:pPr>
+            <w:r>
+              <w:rPr>
+                <w:rFonts w:ascii="Arial" w:cs="Arial" w:eastAsia="Arial" w:hAnsi="Arial"/>
+                <w:b/>
+                <w:bCs/>
+                <w:caps/>
+                <w:color w:val="2F6B3A"/>
+                <w:spacing w:val="10"/>
+                <w:sz w:val="16"/>
+                <w:szCs w:val="16"/>
+              </w:rPr>
+              <w:t xml:space="preserve">From</w:t>
+            </w:r>
+          </w:p>
+        </w:tc>
+      </w:tr>
+      <w:tr>
+        <w:tc>
+          <w:tcPr>
+            <w:tcW w:type="dxa" w:w="5153"/>
+            <w:tcBorders>
+              <w:top w:val="none" w:color="FFFFFF" w:sz="0"/>
+              <w:left w:val="single" w:color="CDD6CF" w:sz="4"/>
+              <w:bottom w:val="single" w:color="CDD6CF" w:sz="4"/>
+              <w:right w:val="single" w:color="CDD6CF" w:sz="4"/>
+            </w:tcBorders>
+            <w:tcMar>
+              <w:top w:type="dxa" w:w="80"/>
+              <w:left w:type="dxa" w:w="120"/>
+              <w:bottom w:type="dxa" w:w="90"/>
+              <w:right w:type="dxa" w:w="120"/>
+            </w:tcMar>
+            <w:vAlign w:val="top"/>
+          </w:tcPr>
+          <w:p>
+            <w:pPr>
+              <w:spacing w:after="30" w:before="0" w:line="260"/>
+            </w:pPr>
+            <w:r>
+              <w:rPr>
+                <w:rFonts w:ascii="Arial" w:cs="Arial" w:eastAsia="Arial" w:hAnsi="Arial"/>
+                <w:b/>
+                <w:bCs/>
+                <w:caps w:val="false"/>
+                <w:color w:val="17221B"/>
+                <w:sz w:val="19"/>
+                <w:szCs w:val="19"/>
+              </w:rPr>
+              <w:fldChar w:fldCharType="begin"/>
+            </w:r>
+            <w:r>
+              <w:rPr>
+                <w:rFonts w:ascii="Arial" w:cs="Arial" w:eastAsia="Arial" w:hAnsi="Arial"/>
+                <w:b/>
+                <w:bCs/>
+                <w:caps w:val="false"/>
+                <w:color w:val="17221B"/>
+                <w:sz w:val="19"/>
+                <w:szCs w:val="19"/>
+              </w:rPr>
+              <w:instrText xml:space="preserve"> MERGEFIELD  ContactName  \* MERGEFORMAT </w:instrText>
+            </w:r>
+            <w:r>
+              <w:rPr>
+                <w:rFonts w:ascii="Arial" w:cs="Arial" w:eastAsia="Arial" w:hAnsi="Arial"/>
+                <w:b/>
+                <w:bCs/>
+                <w:caps w:val="false"/>
+                <w:color w:val="17221B"/>
+                <w:sz w:val="19"/>
+                <w:szCs w:val="19"/>
+              </w:rPr>
+              <w:fldChar w:fldCharType="separate"/>
+            </w:r>
+            <w:r>
+              <w:rPr>
+                <w:rFonts w:ascii="Arial" w:cs="Arial" w:eastAsia="Arial" w:hAnsi="Arial"/>
+                <w:b/>
+                <w:bCs/>
+                <w:caps w:val="false"/>
+                <w:color w:val="17221B"/>
+                <w:sz w:val="19"/>
+                <w:szCs w:val="19"/>
+              </w:rPr>
+              <w:t xml:space="preserve">«ContactName»</w:t>
+            </w:r>
+            <w:r>
+              <w:rPr>
+                <w:rFonts w:ascii="Arial" w:cs="Arial" w:eastAsia="Arial" w:hAnsi="Arial"/>
+                <w:b/>
+                <w:bCs/>
+                <w:caps w:val="false"/>
+                <w:color w:val="17221B"/>
+                <w:sz w:val="19"/>
+                <w:szCs w:val="19"/>
+              </w:rPr>
+              <w:fldChar w:fldCharType="end"/>
+            </w:r>
+          </w:p>
+          <w:p>
+            <w:pPr>
+              <w:spacing w:after="40" w:before="0" w:line="260"/>
+            </w:pPr>
+            <w:r>
+              <w:rPr>
+                <w:rFonts w:ascii="Arial" w:cs="Arial" w:eastAsia="Arial" w:hAnsi="Arial"/>
+                <w:b w:val="false"/>
+                <w:bCs w:val="false"/>
+                <w:caps w:val="false"/>
+                <w:color w:val="17221B"/>
+                <w:sz w:val="17"/>
+                <w:szCs w:val="17"/>
+              </w:rPr>
+              <w:fldChar w:fldCharType="begin"/>
+            </w:r>
+            <w:r>
+              <w:rPr>
+                <w:rFonts w:ascii="Arial" w:cs="Arial" w:eastAsia="Arial" w:hAnsi="Arial"/>
+                <w:b w:val="false"/>
+                <w:bCs w:val="false"/>
+                <w:caps w:val="false"/>
+                <w:color w:val="17221B"/>
+                <w:sz w:val="17"/>
+                <w:szCs w:val="17"/>
+              </w:rPr>
+              <w:instrText xml:space="preserve"> MERGEFIELD  ContactPostalAddress  \* MERGEFORMAT </w:instrText>
+            </w:r>
+            <w:r>
+              <w:rPr>
+                <w:rFonts w:ascii="Arial" w:cs="Arial" w:eastAsia="Arial" w:hAnsi="Arial"/>
+                <w:b w:val="false"/>
+                <w:bCs w:val="false"/>
+                <w:caps w:val="false"/>
+                <w:color w:val="17221B"/>
+                <w:sz w:val="17"/>
+                <w:szCs w:val="17"/>
+              </w:rPr>
+              <w:fldChar w:fldCharType="separate"/>
+            </w:r>
+            <w:r>
+              <w:rPr>
+                <w:rFonts w:ascii="Arial" w:cs="Arial" w:eastAsia="Arial" w:hAnsi="Arial"/>
+                <w:b w:val="false"/>
+                <w:bCs w:val="false"/>
+                <w:caps w:val="false"/>
+                <w:color w:val="17221B"/>
+                <w:sz w:val="17"/>
+                <w:szCs w:val="17"/>
+              </w:rPr>
+              <w:t xml:space="preserve">«ContactPostalAddress»</w:t>
+            </w:r>
+            <w:r>
+              <w:rPr>
+                <w:rFonts w:ascii="Arial" w:cs="Arial" w:eastAsia="Arial" w:hAnsi="Arial"/>
+                <w:b w:val="false"/>
+                <w:bCs w:val="false"/>
+                <w:caps w:val="false"/>
+                <w:color w:val="17221B"/>
+                <w:sz w:val="17"/>
+                <w:szCs w:val="17"/>
+              </w:rPr>
+              <w:fldChar w:fldCharType="end"/>
+            </w:r>
+          </w:p>
+          <w:p>
+            <w:pPr>
+              <w:spacing w:after="0" w:before="0" w:line="260"/>
+            </w:pPr>
+            <w:r>
+              <w:rPr>
+                <w:rFonts w:ascii="Arial" w:cs="Arial" w:eastAsia="Arial" w:hAnsi="Arial"/>
+                <w:b w:val="false"/>
+                <w:bCs w:val="false"/>
+                <w:caps w:val="false"/>
+                <w:color w:val="5B6B60"/>
+                <w:sz w:val="15"/>
+                <w:szCs w:val="15"/>
+              </w:rPr>
+              <w:fldChar w:fldCharType="begin"/>
+            </w:r>
+            <w:r>
+              <w:rPr>
+                <w:rFonts w:ascii="Arial" w:cs="Arial" w:eastAsia="Arial" w:hAnsi="Arial"/>
+                <w:b w:val="false"/>
+                <w:bCs w:val="false"/>
+                <w:caps w:val="false"/>
+                <w:color w:val="5B6B60"/>
+                <w:sz w:val="15"/>
+                <w:szCs w:val="15"/>
+              </w:rPr>
+              <w:instrText xml:space="preserve"> MERGEFIELD  ContactTaxDisplayName  \* MERGEFORMAT </w:instrText>
+            </w:r>
+            <w:r>
+              <w:rPr>
+                <w:rFonts w:ascii="Arial" w:cs="Arial" w:eastAsia="Arial" w:hAnsi="Arial"/>
+                <w:b w:val="false"/>
+                <w:bCs w:val="false"/>
+                <w:caps w:val="false"/>
+                <w:color w:val="5B6B60"/>
+                <w:sz w:val="15"/>
+                <w:szCs w:val="15"/>
+              </w:rPr>
+              <w:fldChar w:fldCharType="separate"/>
+            </w:r>
+            <w:r>
+              <w:rPr>
+                <w:rFonts w:ascii="Arial" w:cs="Arial" w:eastAsia="Arial" w:hAnsi="Arial"/>
+                <w:b w:val="false"/>
+                <w:bCs w:val="false"/>
+                <w:caps w:val="false"/>
+                <w:color w:val="5B6B60"/>
+                <w:sz w:val="15"/>
+                <w:szCs w:val="15"/>
+              </w:rPr>
+              <w:t xml:space="preserve">«ContactTaxDisplayName»</w:t>
+            </w:r>
+            <w:r>
+              <w:rPr>
+                <w:rFonts w:ascii="Arial" w:cs="Arial" w:eastAsia="Arial" w:hAnsi="Arial"/>
+                <w:b w:val="false"/>
+                <w:bCs w:val="false"/>
+                <w:caps w:val="false"/>
+                <w:color w:val="5B6B60"/>
+                <w:sz w:val="15"/>
+                <w:szCs w:val="15"/>
+              </w:rPr>
+              <w:fldChar w:fldCharType="end"/>
+            </w:r>
+            <w:r>
+              <w:rPr>
+                <w:rFonts w:ascii="Arial" w:cs="Arial" w:eastAsia="Arial" w:hAnsi="Arial"/>
+                <w:b w:val="false"/>
+                <w:bCs w:val="false"/>
+                <w:caps w:val="false"/>
+                <w:color w:val="5B6B60"/>
+                <w:sz w:val="15"/>
+                <w:szCs w:val="15"/>
+              </w:rPr>
+              <w:t xml:space="preserve"> </w:t>
+            </w:r>
+            <w:r>
+              <w:rPr>
+                <w:rFonts w:ascii="Arial" w:cs="Arial" w:eastAsia="Arial" w:hAnsi="Arial"/>
+                <w:b w:val="false"/>
+                <w:bCs w:val="false"/>
+                <w:caps w:val="false"/>
+                <w:color w:val="5B6B60"/>
+                <w:sz w:val="15"/>
+                <w:szCs w:val="15"/>
+              </w:rPr>
+              <w:fldChar w:fldCharType="begin"/>
+            </w:r>
+            <w:r>
+              <w:rPr>
+                <w:rFonts w:ascii="Arial" w:cs="Arial" w:eastAsia="Arial" w:hAnsi="Arial"/>
+                <w:b w:val="false"/>
+                <w:bCs w:val="false"/>
+                <w:caps w:val="false"/>
+                <w:color w:val="5B6B60"/>
+                <w:sz w:val="15"/>
+                <w:szCs w:val="15"/>
+              </w:rPr>
+              <w:instrText xml:space="preserve"> MERGEFIELD  ContactTaxNumber  \* MERGEFORMAT </w:instrText>
+            </w:r>
+            <w:r>
+              <w:rPr>
+                <w:rFonts w:ascii="Arial" w:cs="Arial" w:eastAsia="Arial" w:hAnsi="Arial"/>
+                <w:b w:val="false"/>
+                <w:bCs w:val="false"/>
+                <w:caps w:val="false"/>
+                <w:color w:val="5B6B60"/>
+                <w:sz w:val="15"/>
+                <w:szCs w:val="15"/>
+              </w:rPr>
+              <w:fldChar w:fldCharType="separate"/>
+            </w:r>
+            <w:r>
+              <w:rPr>
+                <w:rFonts w:ascii="Arial" w:cs="Arial" w:eastAsia="Arial" w:hAnsi="Arial"/>
+                <w:b w:val="false"/>
+                <w:bCs w:val="false"/>
+                <w:caps w:val="false"/>
+                <w:color w:val="5B6B60"/>
+                <w:sz w:val="15"/>
+                <w:szCs w:val="15"/>
+              </w:rPr>
+              <w:t xml:space="preserve">«ContactTaxNumber»</w:t>
+            </w:r>
+            <w:r>
+              <w:rPr>
+                <w:rFonts w:ascii="Arial" w:cs="Arial" w:eastAsia="Arial" w:hAnsi="Arial"/>
+                <w:b w:val="false"/>
+                <w:bCs w:val="false"/>
+                <w:caps w:val="false"/>
+                <w:color w:val="5B6B60"/>
+                <w:sz w:val="15"/>
+                <w:szCs w:val="15"/>
+              </w:rPr>
+              <w:fldChar w:fldCharType="end"/>
+            </w:r>
+          </w:p>
+        </w:tc>
+        <w:tc>
+          <w:tcPr>
+            <w:tcW w:type="dxa" w:w="160"/>
             <w:tcBorders>
               <w:top w:val="none" w:color="FFFFFF" w:sz="0"/>
               <w:left w:val="none" w:color="FFFFFF" w:sz="0"/>
@@ -1326,418 +1325,110 @@
             </w:tcMar>
             <w:vAlign w:val="top"/>
           </w:tcPr>
-          <w:tbl>
-            <w:tblPr>
-              <w:tblW w:type="dxa" w:w="5153"/>
-              <w:tblBorders>
-                <w:top w:val="none" w:color="FFFFFF" w:sz="0"/>
-                <w:left w:val="none" w:color="FFFFFF" w:sz="0"/>
-                <w:bottom w:val="none" w:color="FFFFFF" w:sz="0"/>
-                <w:right w:val="none" w:color="FFFFFF" w:sz="0"/>
-                <w:insideH w:val="none" w:color="FFFFFF" w:sz="0"/>
-                <w:insideV w:val="none" w:color="FFFFFF" w:sz="0"/>
-              </w:tblBorders>
-              <w:tblLayout w:type="fixed"/>
-            </w:tblPr>
-            <w:tblGrid>
-              <w:gridCol w:w="5153"/>
-            </w:tblGrid>
-            <w:tr>
-              <w:tc>
-                <w:tcPr>
-                  <w:tcW w:type="dxa" w:w="5153"/>
-                  <w:tcBorders>
-                    <w:top w:val="single" w:color="CDD6CF" w:sz="4"/>
-                    <w:left w:val="single" w:color="CDD6CF" w:sz="4"/>
-                    <w:bottom w:val="single" w:color="CDD6CF" w:sz="4"/>
-                    <w:right w:val="single" w:color="CDD6CF" w:sz="4"/>
-                  </w:tcBorders>
-                  <w:shd w:fill="EEF4EF" w:color="auto" w:val="clear"/>
-                  <w:tcMar>
-                    <w:top w:type="dxa" w:w="50"/>
-                    <w:left w:type="dxa" w:w="120"/>
-                    <w:bottom w:type="dxa" w:w="50"/>
-                    <w:right w:type="dxa" w:w="120"/>
-                  </w:tcMar>
-                  <w:vAlign w:val="top"/>
-                </w:tcPr>
-                <w:p>
-                  <w:pPr>
-                    <w:spacing w:after="0" w:before="0" w:line="260"/>
-                  </w:pPr>
-                  <w:r>
-                    <w:rPr>
-                      <w:rFonts w:ascii="Arial" w:cs="Arial" w:eastAsia="Arial" w:hAnsi="Arial"/>
-                      <w:b/>
-                      <w:bCs/>
-                      <w:caps/>
-                      <w:color w:val="2F6B3A"/>
-                      <w:spacing w:val="10"/>
-                      <w:sz w:val="16"/>
-                      <w:szCs w:val="16"/>
-                    </w:rPr>
-                    <w:t xml:space="preserve">From</w:t>
-                  </w:r>
-                </w:p>
-              </w:tc>
-            </w:tr>
-            <w:tr>
-              <w:tc>
-                <w:tcPr>
-                  <w:tcW w:type="dxa" w:w="5153"/>
-                  <w:tcBorders>
-                    <w:top w:val="none" w:color="FFFFFF" w:sz="0"/>
-                    <w:left w:val="single" w:color="CDD6CF" w:sz="4"/>
-                    <w:bottom w:val="single" w:color="CDD6CF" w:sz="4"/>
-                    <w:right w:val="single" w:color="CDD6CF" w:sz="4"/>
-                  </w:tcBorders>
-                  <w:tcMar>
-                    <w:top w:type="dxa" w:w="80"/>
-                    <w:left w:type="dxa" w:w="120"/>
-                    <w:bottom w:type="dxa" w:w="90"/>
-                    <w:right w:type="dxa" w:w="120"/>
-                  </w:tcMar>
-                  <w:vAlign w:val="top"/>
-                </w:tcPr>
-                <w:p>
-                  <w:pPr>
-                    <w:spacing w:after="30" w:before="0" w:line="260"/>
-                  </w:pPr>
-                  <w:r>
-                    <w:rPr>
-                      <w:rFonts w:ascii="Arial" w:cs="Arial" w:eastAsia="Arial" w:hAnsi="Arial"/>
-                      <w:b/>
-                      <w:bCs/>
-                      <w:caps w:val="false"/>
-                      <w:color w:val="17221B"/>
-                      <w:sz w:val="19"/>
-                      <w:szCs w:val="19"/>
-                    </w:rPr>
-                    <w:t xml:space="preserve">Aura Solutions Group Limited</w:t>
-                  </w:r>
-                </w:p>
-                <w:p>
-                  <w:pPr>
-                    <w:spacing w:after="50" w:before="0" w:line="260"/>
-                  </w:pPr>
-                  <w:r>
-                    <w:rPr>
-                      <w:rFonts w:ascii="Arial" w:cs="Arial" w:eastAsia="Arial" w:hAnsi="Arial"/>
-                      <w:b w:val="false"/>
-                      <w:bCs w:val="false"/>
-                      <w:caps w:val="false"/>
-                      <w:color w:val="17221B"/>
-                      <w:sz w:val="17"/>
-                      <w:szCs w:val="17"/>
-                    </w:rPr>
-                    <w:t xml:space="preserve">Main Street, Sedgeberrow</w:t>
-                  </w:r>
-                  <w:r>
-                    <w:br/>
-                  </w:r>
-                  <w:r>
-                    <w:rPr>
-                      <w:rFonts w:ascii="Arial" w:cs="Arial" w:eastAsia="Arial" w:hAnsi="Arial"/>
-                      <w:b w:val="false"/>
-                      <w:bCs w:val="false"/>
-                      <w:caps w:val="false"/>
-                      <w:color w:val="17221B"/>
-                      <w:sz w:val="17"/>
-                      <w:szCs w:val="17"/>
-                    </w:rPr>
-                    <w:t xml:space="preserve">Evesham, Worcestershire</w:t>
-                  </w:r>
-                  <w:r>
-                    <w:br/>
-                  </w:r>
-                  <w:r>
-                    <w:rPr>
-                      <w:rFonts w:ascii="Arial" w:cs="Arial" w:eastAsia="Arial" w:hAnsi="Arial"/>
-                      <w:b w:val="false"/>
-                      <w:bCs w:val="false"/>
-                      <w:caps w:val="false"/>
-                      <w:color w:val="17221B"/>
-                      <w:sz w:val="17"/>
-                      <w:szCs w:val="17"/>
-                    </w:rPr>
-                    <w:t xml:space="preserve">WR11 7UH</w:t>
-                  </w:r>
-                </w:p>
-                <w:tbl>
-                  <w:tblPr>
-                    <w:tblW w:type="dxa" w:w="4913"/>
-                    <w:tblBorders>
-                      <w:top w:val="none" w:color="FFFFFF" w:sz="0"/>
-                      <w:left w:val="none" w:color="FFFFFF" w:sz="0"/>
-                      <w:bottom w:val="none" w:color="FFFFFF" w:sz="0"/>
-                      <w:right w:val="none" w:color="FFFFFF" w:sz="0"/>
-                      <w:insideH w:val="none" w:color="FFFFFF" w:sz="0"/>
-                      <w:insideV w:val="none" w:color="FFFFFF" w:sz="0"/>
-                    </w:tblBorders>
-                    <w:tblLayout w:type="fixed"/>
-                  </w:tblPr>
-                  <w:tblGrid>
-                    <w:gridCol w:w="1670"/>
-                    <w:gridCol w:w="3243"/>
-                  </w:tblGrid>
-                  <w:tr>
-                    <w:tc>
-                      <w:tcPr>
-                        <w:tcW w:type="dxa" w:w="1670"/>
-                        <w:tcBorders>
-                          <w:top w:val="none" w:color="FFFFFF" w:sz="0"/>
-                          <w:left w:val="none" w:color="FFFFFF" w:sz="0"/>
-                          <w:bottom w:val="none" w:color="FFFFFF" w:sz="0"/>
-                          <w:right w:val="none" w:color="FFFFFF" w:sz="0"/>
-                        </w:tcBorders>
-                        <w:tcMar>
-                          <w:top w:type="dxa" w:w="15"/>
-                          <w:left w:type="dxa" w:w="0"/>
-                          <w:bottom w:type="dxa" w:w="15"/>
-                          <w:right w:type="dxa" w:w="60"/>
-                        </w:tcMar>
-                        <w:vAlign w:val="top"/>
-                      </w:tcPr>
-                      <w:p>
-                        <w:pPr>
-                          <w:spacing w:after="0" w:before="0" w:line="260"/>
-                        </w:pPr>
-                        <w:r>
-                          <w:rPr>
-                            <w:rFonts w:ascii="Arial" w:cs="Arial" w:eastAsia="Arial" w:hAnsi="Arial"/>
-                            <w:b w:val="false"/>
-                            <w:bCs w:val="false"/>
-                            <w:caps w:val="false"/>
-                            <w:color w:val="5B6B60"/>
-                            <w:sz w:val="17"/>
-                            <w:szCs w:val="17"/>
-                          </w:rPr>
-                          <w:t xml:space="preserve">Company no.</w:t>
-                        </w:r>
-                      </w:p>
-                    </w:tc>
-                    <w:tc>
-                      <w:tcPr>
-                        <w:tcW w:type="dxa" w:w="3243"/>
-                        <w:tcBorders>
-                          <w:top w:val="none" w:color="FFFFFF" w:sz="0"/>
-                          <w:left w:val="none" w:color="FFFFFF" w:sz="0"/>
-                          <w:bottom w:val="none" w:color="FFFFFF" w:sz="0"/>
-                          <w:right w:val="none" w:color="FFFFFF" w:sz="0"/>
-                        </w:tcBorders>
-                        <w:tcMar>
-                          <w:top w:type="dxa" w:w="15"/>
-                          <w:left w:type="dxa" w:w="0"/>
-                          <w:bottom w:type="dxa" w:w="15"/>
-                          <w:right w:type="dxa" w:w="0"/>
-                        </w:tcMar>
-                        <w:vAlign w:val="top"/>
-                      </w:tcPr>
-                      <w:p>
-                        <w:pPr>
-                          <w:spacing w:after="0" w:before="0" w:line="260"/>
-                        </w:pPr>
-                        <w:r>
-                          <w:rPr>
-                            <w:rFonts w:ascii="Arial" w:cs="Arial" w:eastAsia="Arial" w:hAnsi="Arial"/>
-                            <w:b w:val="false"/>
-                            <w:bCs w:val="false"/>
-                            <w:caps w:val="false"/>
-                            <w:color w:val="17221B"/>
-                            <w:sz w:val="17"/>
-                            <w:szCs w:val="17"/>
-                          </w:rPr>
-                          <w:t xml:space="preserve">15761350 (England and Wales)</w:t>
-                        </w:r>
-                      </w:p>
-                    </w:tc>
-                  </w:tr>
-                </w:tbl>
-                <w:tbl>
-                  <w:tblPr>
-                    <w:tblW w:type="dxa" w:w="4913"/>
-                    <w:tblBorders>
-                      <w:top w:val="none" w:color="FFFFFF" w:sz="0"/>
-                      <w:left w:val="none" w:color="FFFFFF" w:sz="0"/>
-                      <w:bottom w:val="none" w:color="FFFFFF" w:sz="0"/>
-                      <w:right w:val="none" w:color="FFFFFF" w:sz="0"/>
-                      <w:insideH w:val="none" w:color="FFFFFF" w:sz="0"/>
-                      <w:insideV w:val="none" w:color="FFFFFF" w:sz="0"/>
-                    </w:tblBorders>
-                    <w:tblLayout w:type="fixed"/>
-                  </w:tblPr>
-                  <w:tblGrid>
-                    <w:gridCol w:w="1670"/>
-                    <w:gridCol w:w="3243"/>
-                  </w:tblGrid>
-                  <w:tr>
-                    <w:tc>
-                      <w:tcPr>
-                        <w:tcW w:type="dxa" w:w="1670"/>
-                        <w:tcBorders>
-                          <w:top w:val="none" w:color="FFFFFF" w:sz="0"/>
-                          <w:left w:val="none" w:color="FFFFFF" w:sz="0"/>
-                          <w:bottom w:val="none" w:color="FFFFFF" w:sz="0"/>
-                          <w:right w:val="none" w:color="FFFFFF" w:sz="0"/>
-                        </w:tcBorders>
-                        <w:tcMar>
-                          <w:top w:type="dxa" w:w="15"/>
-                          <w:left w:type="dxa" w:w="0"/>
-                          <w:bottom w:type="dxa" w:w="15"/>
-                          <w:right w:type="dxa" w:w="60"/>
-                        </w:tcMar>
-                        <w:vAlign w:val="top"/>
-                      </w:tcPr>
-                      <w:p>
-                        <w:pPr>
-                          <w:spacing w:after="0" w:before="0" w:line="260"/>
-                        </w:pPr>
-                        <w:r>
-                          <w:rPr>
-                            <w:rFonts w:ascii="Arial" w:cs="Arial" w:eastAsia="Arial" w:hAnsi="Arial"/>
-                            <w:b w:val="false"/>
-                            <w:bCs w:val="false"/>
-                            <w:caps w:val="false"/>
-                            <w:color w:val="5B6B60"/>
-                            <w:sz w:val="17"/>
-                            <w:szCs w:val="17"/>
-                          </w:rPr>
-                          <w:t xml:space="preserve">VAT no.</w:t>
-                        </w:r>
-                      </w:p>
-                    </w:tc>
-                    <w:tc>
-                      <w:tcPr>
-                        <w:tcW w:type="dxa" w:w="3243"/>
-                        <w:tcBorders>
-                          <w:top w:val="none" w:color="FFFFFF" w:sz="0"/>
-                          <w:left w:val="none" w:color="FFFFFF" w:sz="0"/>
-                          <w:bottom w:val="none" w:color="FFFFFF" w:sz="0"/>
-                          <w:right w:val="none" w:color="FFFFFF" w:sz="0"/>
-                        </w:tcBorders>
-                        <w:tcMar>
-                          <w:top w:type="dxa" w:w="15"/>
-                          <w:left w:type="dxa" w:w="0"/>
-                          <w:bottom w:type="dxa" w:w="15"/>
-                          <w:right w:type="dxa" w:w="0"/>
-                        </w:tcMar>
-                        <w:vAlign w:val="top"/>
-                      </w:tcPr>
-                      <w:p>
-                        <w:pPr>
-                          <w:spacing w:after="0" w:before="0" w:line="260"/>
-                        </w:pPr>
-                        <w:r>
-                          <w:rPr>
-                            <w:rFonts w:ascii="Arial" w:cs="Arial" w:eastAsia="Arial" w:hAnsi="Arial"/>
-                            <w:b w:val="false"/>
-                            <w:bCs w:val="false"/>
-                            <w:caps w:val="false"/>
-                            <w:color w:val="17221B"/>
-                            <w:sz w:val="17"/>
-                            <w:szCs w:val="17"/>
-                          </w:rPr>
-                          <w:t xml:space="preserve">GB 471 3179 91</w:t>
-                        </w:r>
-                      </w:p>
-                    </w:tc>
-                  </w:tr>
-                </w:tbl>
-                <w:tbl>
-                  <w:tblPr>
-                    <w:tblW w:type="dxa" w:w="4913"/>
-                    <w:tblBorders>
-                      <w:top w:val="none" w:color="FFFFFF" w:sz="0"/>
-                      <w:left w:val="none" w:color="FFFFFF" w:sz="0"/>
-                      <w:bottom w:val="none" w:color="FFFFFF" w:sz="0"/>
-                      <w:right w:val="none" w:color="FFFFFF" w:sz="0"/>
-                      <w:insideH w:val="none" w:color="FFFFFF" w:sz="0"/>
-                      <w:insideV w:val="none" w:color="FFFFFF" w:sz="0"/>
-                    </w:tblBorders>
-                    <w:tblLayout w:type="fixed"/>
-                  </w:tblPr>
-                  <w:tblGrid>
-                    <w:gridCol w:w="1670"/>
-                    <w:gridCol w:w="3243"/>
-                  </w:tblGrid>
-                  <w:tr>
-                    <w:tc>
-                      <w:tcPr>
-                        <w:tcW w:type="dxa" w:w="1670"/>
-                        <w:tcBorders>
-                          <w:top w:val="none" w:color="FFFFFF" w:sz="0"/>
-                          <w:left w:val="none" w:color="FFFFFF" w:sz="0"/>
-                          <w:bottom w:val="none" w:color="FFFFFF" w:sz="0"/>
-                          <w:right w:val="none" w:color="FFFFFF" w:sz="0"/>
-                        </w:tcBorders>
-                        <w:tcMar>
-                          <w:top w:type="dxa" w:w="15"/>
-                          <w:left w:type="dxa" w:w="0"/>
-                          <w:bottom w:type="dxa" w:w="15"/>
-                          <w:right w:type="dxa" w:w="60"/>
-                        </w:tcMar>
-                        <w:vAlign w:val="top"/>
-                      </w:tcPr>
-                      <w:p>
-                        <w:pPr>
-                          <w:spacing w:after="0" w:before="0" w:line="260"/>
-                        </w:pPr>
-                        <w:r>
-                          <w:rPr>
-                            <w:rFonts w:ascii="Arial" w:cs="Arial" w:eastAsia="Arial" w:hAnsi="Arial"/>
-                            <w:b w:val="false"/>
-                            <w:bCs w:val="false"/>
-                            <w:caps w:val="false"/>
-                            <w:color w:val="5B6B60"/>
-                            <w:sz w:val="17"/>
-                            <w:szCs w:val="17"/>
-                          </w:rPr>
-                          <w:t xml:space="preserve">Queries</w:t>
-                        </w:r>
-                      </w:p>
-                    </w:tc>
-                    <w:tc>
-                      <w:tcPr>
-                        <w:tcW w:type="dxa" w:w="3243"/>
-                        <w:tcBorders>
-                          <w:top w:val="none" w:color="FFFFFF" w:sz="0"/>
-                          <w:left w:val="none" w:color="FFFFFF" w:sz="0"/>
-                          <w:bottom w:val="none" w:color="FFFFFF" w:sz="0"/>
-                          <w:right w:val="none" w:color="FFFFFF" w:sz="0"/>
-                        </w:tcBorders>
-                        <w:tcMar>
-                          <w:top w:type="dxa" w:w="15"/>
-                          <w:left w:type="dxa" w:w="0"/>
-                          <w:bottom w:type="dxa" w:w="15"/>
-                          <w:right w:type="dxa" w:w="0"/>
-                        </w:tcMar>
-                        <w:vAlign w:val="top"/>
-                      </w:tcPr>
-                      <w:p>
-                        <w:pPr>
-                          <w:spacing w:after="0" w:before="0" w:line="260"/>
-                        </w:pPr>
-                        <w:r>
-                          <w:rPr>
-                            <w:rFonts w:ascii="Arial" w:cs="Arial" w:eastAsia="Arial" w:hAnsi="Arial"/>
-                            <w:b w:val="false"/>
-                            <w:bCs w:val="false"/>
-                            <w:caps w:val="false"/>
-                            <w:color w:val="17221B"/>
-                            <w:sz w:val="17"/>
-                            <w:szCs w:val="17"/>
-                          </w:rPr>
-                          <w:t xml:space="preserve">info@aurasolutions.co.uk · 01386 571556</w:t>
-                        </w:r>
-                      </w:p>
-                    </w:tc>
-                  </w:tr>
-                </w:tbl>
-                <w:p/>
-              </w:tc>
-            </w:tr>
-          </w:tbl>
-          <w:p/>
+          <w:p>
+            <w:pPr>
+              <w:spacing w:after="0" w:before="0" w:line="260"/>
+            </w:pPr>
+          </w:p>
+        </w:tc>
+        <w:tc>
+          <w:tcPr>
+            <w:tcW w:type="dxa" w:w="5153"/>
+            <w:tcBorders>
+              <w:top w:val="none" w:color="FFFFFF" w:sz="0"/>
+              <w:left w:val="single" w:color="CDD6CF" w:sz="4"/>
+              <w:bottom w:val="single" w:color="CDD6CF" w:sz="4"/>
+              <w:right w:val="single" w:color="CDD6CF" w:sz="4"/>
+            </w:tcBorders>
+            <w:tcMar>
+              <w:top w:type="dxa" w:w="80"/>
+              <w:left w:type="dxa" w:w="120"/>
+              <w:bottom w:type="dxa" w:w="90"/>
+              <w:right w:type="dxa" w:w="120"/>
+            </w:tcMar>
+            <w:vAlign w:val="top"/>
+          </w:tcPr>
+          <w:p>
+            <w:pPr>
+              <w:spacing w:after="30" w:before="0" w:line="260"/>
+            </w:pPr>
+            <w:r>
+              <w:rPr>
+                <w:rFonts w:ascii="Arial" w:cs="Arial" w:eastAsia="Arial" w:hAnsi="Arial"/>
+                <w:b/>
+                <w:bCs/>
+                <w:caps w:val="false"/>
+                <w:color w:val="17221B"/>
+                <w:sz w:val="19"/>
+                <w:szCs w:val="19"/>
+              </w:rPr>
+              <w:t xml:space="preserve">Aura Solutions Group Limited</w:t>
+            </w:r>
+          </w:p>
+          <w:p>
+            <w:pPr>
+              <w:spacing w:after="40" w:before="0" w:line="260"/>
+            </w:pPr>
+            <w:r>
+              <w:rPr>
+                <w:rFonts w:ascii="Arial" w:cs="Arial" w:eastAsia="Arial" w:hAnsi="Arial"/>
+                <w:b w:val="false"/>
+                <w:bCs w:val="false"/>
+                <w:caps w:val="false"/>
+                <w:color w:val="17221B"/>
+                <w:sz w:val="17"/>
+                <w:szCs w:val="17"/>
+              </w:rPr>
+              <w:t xml:space="preserve">Main Street, Sedgeberrow</w:t>
+            </w:r>
+            <w:r>
+              <w:br/>
+            </w:r>
+            <w:r>
+              <w:rPr>
+                <w:rFonts w:ascii="Arial" w:cs="Arial" w:eastAsia="Arial" w:hAnsi="Arial"/>
+                <w:b w:val="false"/>
+                <w:bCs w:val="false"/>
+                <w:caps w:val="false"/>
+                <w:color w:val="17221B"/>
+                <w:sz w:val="17"/>
+                <w:szCs w:val="17"/>
+              </w:rPr>
+              <w:t xml:space="preserve">Evesham, Worcestershire</w:t>
+            </w:r>
+            <w:r>
+              <w:br/>
+            </w:r>
+            <w:r>
+              <w:rPr>
+                <w:rFonts w:ascii="Arial" w:cs="Arial" w:eastAsia="Arial" w:hAnsi="Arial"/>
+                <w:b w:val="false"/>
+                <w:bCs w:val="false"/>
+                <w:caps w:val="false"/>
+                <w:color w:val="17221B"/>
+                <w:sz w:val="17"/>
+                <w:szCs w:val="17"/>
+              </w:rPr>
+              <w:t xml:space="preserve">WR11 7UH</w:t>
+            </w:r>
+          </w:p>
+          <w:p>
+            <w:pPr>
+              <w:spacing w:after="0" w:before="0" w:line="260"/>
+            </w:pPr>
+            <w:r>
+              <w:rPr>
+                <w:rFonts w:ascii="Arial" w:cs="Arial" w:eastAsia="Arial" w:hAnsi="Arial"/>
+                <w:b w:val="false"/>
+                <w:bCs w:val="false"/>
+                <w:caps w:val="false"/>
+                <w:color w:val="5B6B60"/>
+                <w:sz w:val="15"/>
+                <w:szCs w:val="15"/>
+              </w:rPr>
+              <w:t xml:space="preserve">VAT no. GB 471 3179 91</w:t>
+            </w:r>
+          </w:p>
         </w:tc>
       </w:tr>
     </w:tbl>

</xml_diff>

<commit_message>
Invoice template v6: faint diagonal background shading like the other documents
Co-Authored-By: Claude Opus 5.5 <noreply@anthropic.com>
Claude-Session: https://claude.ai/code/session_01XczQ4VoiYiQrKwLjiEtYiz
</commit_message>
<xml_diff>
--- a/templates/xero-invoice/Aura Invoice Template.docx
+++ b/templates/xero-invoice/Aura Invoice Template.docx
@@ -4274,6 +4274,59 @@
 <w:ftr xmlns:wpc="http://schemas.microsoft.com/office/word/2010/wordprocessingCanvas" xmlns:mc="http://schemas.openxmlformats.org/markup-compatibility/2006" xmlns:o="urn:schemas-microsoft-com:office:office" xmlns:r="http://schemas.openxmlformats.org/officeDocument/2006/relationships" xmlns:m="http://schemas.openxmlformats.org/officeDocument/2006/math" xmlns:v="urn:schemas-microsoft-com:vml" xmlns:wp14="http://schemas.microsoft.com/office/word/2010/wordprocessingDrawing" xmlns:wp="http://schemas.openxmlformats.org/drawingml/2006/wordprocessingDrawing" xmlns:w10="urn:schemas-microsoft-com:office:word" xmlns:w="http://schemas.openxmlformats.org/wordprocessingml/2006/main" xmlns:w14="http://schemas.microsoft.com/office/word/2010/wordml" xmlns:w15="http://schemas.microsoft.com/office/word/2012/wordml" xmlns:wpg="http://schemas.microsoft.com/office/word/2010/wordprocessingGroup" xmlns:wpi="http://schemas.microsoft.com/office/word/2010/wordprocessingInk" xmlns:wne="http://schemas.microsoft.com/office/word/2006/wordml" xmlns:wps="http://schemas.microsoft.com/office/word/2010/wordprocessingShape">
   <w:p>
     <w:pPr>
+      <w:spacing w:after="0" w:line="20"/>
+    </w:pPr>
+    <w:r>
+      <w:drawing>
+        <wp:anchor distT="0" distB="0" distL="0" distR="0" simplePos="0" allowOverlap="1" behindDoc="1" locked="0" layoutInCell="1" relativeHeight="10696575">
+          <wp:simplePos x="0" y="0"/>
+          <wp:positionH relativeFrom="page">
+            <wp:posOffset>0</wp:posOffset>
+          </wp:positionH>
+          <wp:positionV relativeFrom="page">
+            <wp:posOffset>0</wp:posOffset>
+          </wp:positionV>
+          <wp:extent cx="7562850" cy="10696575"/>
+          <wp:effectExtent t="0" r="0" b="0" l="0"/>
+          <wp:wrapNone/>
+          <wp:docPr id="4" name="" descr="" title=""/>
+          <wp:cNvGraphicFramePr>
+            <a:graphicFrameLocks xmlns:a="http://schemas.openxmlformats.org/drawingml/2006/main" noChangeAspect="1"/>
+          </wp:cNvGraphicFramePr>
+          <a:graphic xmlns:a="http://schemas.openxmlformats.org/drawingml/2006/main">
+            <a:graphicData uri="http://schemas.openxmlformats.org/drawingml/2006/picture">
+              <pic:pic xmlns:pic="http://schemas.openxmlformats.org/drawingml/2006/picture">
+                <pic:nvPicPr>
+                  <pic:cNvPr id="0" name="" descr=""/>
+                  <pic:cNvPicPr>
+                    <a:picLocks noChangeAspect="1" noChangeArrowheads="1"/>
+                  </pic:cNvPicPr>
+                </pic:nvPicPr>
+                <pic:blipFill>
+                  <a:blip r:embed="rId0" cstate="none"/>
+                  <a:srcRect/>
+                  <a:stretch>
+                    <a:fillRect/>
+                  </a:stretch>
+                </pic:blipFill>
+                <pic:spPr bwMode="auto">
+                  <a:xfrm>
+                    <a:off x="0" y="0"/>
+                    <a:ext cx="7562850" cy="10696575"/>
+                  </a:xfrm>
+                  <a:prstGeom prst="rect">
+                    <a:avLst/>
+                  </a:prstGeom>
+                </pic:spPr>
+              </pic:pic>
+            </a:graphicData>
+          </a:graphic>
+        </wp:anchor>
+      </w:drawing>
+    </w:r>
+  </w:p>
+  <w:p>
+    <w:pPr>
       <w:spacing w:after="0" w:line="220"/>
       <w:jc w:val="center"/>
     </w:pPr>
@@ -4304,7 +4357,7 @@
                   </pic:cNvPicPr>
                 </pic:nvPicPr>
                 <pic:blipFill>
-                  <a:blip r:embed="rId0" cstate="none"/>
+                  <a:blip r:embed="rId1" cstate="none"/>
                   <a:srcRect/>
                   <a:stretch>
                     <a:fillRect/>

</xml_diff>

<commit_message>
Invoice template v7: How to pay pinned to the foot of the first page
Co-Authored-By: Claude Opus 5.5 <noreply@anthropic.com>
Claude-Session: https://claude.ai/code/session_01XczQ4VoiYiQrKwLjiEtYiz
</commit_message>
<xml_diff>
--- a/templates/xero-invoice/Aura Invoice Template.docx
+++ b/templates/xero-invoice/Aura Invoice Template.docx
@@ -65,7 +65,7 @@
                           </pic:cNvPicPr>
                         </pic:nvPicPr>
                         <pic:blipFill>
-                          <a:blip r:embed="rId8" cstate="none"/>
+                          <a:blip r:embed="rId9" cstate="none"/>
                           <a:srcRect/>
                           <a:stretch>
                             <a:fillRect/>
@@ -105,7 +105,7 @@
                           </pic:cNvPicPr>
                         </pic:nvPicPr>
                         <pic:blipFill>
-                          <a:blip r:embed="rId9" cstate="none"/>
+                          <a:blip r:embed="rId10" cstate="none"/>
                           <a:srcRect/>
                           <a:stretch>
                             <a:fillRect/>
@@ -3276,957 +3276,13 @@
         </w:tc>
       </w:tr>
     </w:tbl>
-    <w:p>
-      <w:pPr>
-        <w:keepNext/>
-        <w:pBdr>
-          <w:bottom w:val="single" w:color="79CF36" w:sz="6" w:space="3"/>
-        </w:pBdr>
-        <w:spacing w:after="80" w:before="170"/>
-      </w:pPr>
-      <w:r>
-        <w:rPr>
-          <w:rFonts w:ascii="Arial" w:cs="Arial" w:eastAsia="Arial" w:hAnsi="Arial"/>
-          <w:b/>
-          <w:bCs/>
-          <w:color w:val="FFFFFF"/>
-          <w:sz w:val="18"/>
-          <w:szCs w:val="18"/>
-          <w:shd w:fill="2F6B3A" w:color="auto" w:val="clear"/>
-        </w:rPr>
-        <w:t xml:space="preserve"> 3 </w:t>
-      </w:r>
-      <w:r>
-        <w:rPr>
-          <w:rFonts w:ascii="Arial" w:cs="Arial" w:eastAsia="Arial" w:hAnsi="Arial"/>
-          <w:b/>
-          <w:bCs/>
-          <w:color w:val="0C3E17"/>
-          <w:sz w:val="23"/>
-          <w:szCs w:val="23"/>
-        </w:rPr>
-        <w:t xml:space="preserve">  How to pay</w:t>
-      </w:r>
-    </w:p>
-    <w:tbl>
-      <w:tblPr>
-        <w:tblW w:type="dxa" w:w="10466"/>
-        <w:tblBorders>
-          <w:top w:val="none" w:color="FFFFFF" w:sz="0"/>
-          <w:left w:val="none" w:color="FFFFFF" w:sz="0"/>
-          <w:bottom w:val="none" w:color="FFFFFF" w:sz="0"/>
-          <w:right w:val="none" w:color="FFFFFF" w:sz="0"/>
-          <w:insideH w:val="none" w:color="FFFFFF" w:sz="0"/>
-          <w:insideV w:val="none" w:color="FFFFFF" w:sz="0"/>
-        </w:tblBorders>
-        <w:tblLayout w:type="fixed"/>
-      </w:tblPr>
-      <w:tblGrid>
-        <w:gridCol w:w="5200"/>
-        <w:gridCol w:w="160"/>
-        <w:gridCol w:w="5106"/>
-      </w:tblGrid>
-      <w:tr>
-        <w:tc>
-          <w:tcPr>
-            <w:tcW w:type="dxa" w:w="5200"/>
-            <w:tcBorders>
-              <w:top w:val="none" w:color="FFFFFF" w:sz="0"/>
-              <w:left w:val="none" w:color="FFFFFF" w:sz="0"/>
-              <w:bottom w:val="none" w:color="FFFFFF" w:sz="0"/>
-              <w:right w:val="none" w:color="FFFFFF" w:sz="0"/>
-            </w:tcBorders>
-            <w:tcMar>
-              <w:top w:type="dxa" w:w="0"/>
-              <w:left w:type="dxa" w:w="0"/>
-              <w:bottom w:type="dxa" w:w="0"/>
-              <w:right w:type="dxa" w:w="0"/>
-            </w:tcMar>
-            <w:vAlign w:val="top"/>
-          </w:tcPr>
-          <w:p>
-            <w:pPr>
-              <w:spacing w:after="60" w:before="0" w:line="260"/>
-            </w:pPr>
-            <w:r>
-              <w:rPr>
-                <w:rFonts w:ascii="Arial" w:cs="Arial" w:eastAsia="Arial" w:hAnsi="Arial"/>
-                <w:b/>
-                <w:bCs/>
-                <w:caps/>
-                <w:color w:val="2F6B3A"/>
-                <w:spacing w:val="10"/>
-                <w:sz w:val="16"/>
-                <w:szCs w:val="16"/>
-              </w:rPr>
-              <w:t xml:space="preserve">Bank transfer (BACS)</w:t>
-            </w:r>
-          </w:p>
-          <w:tbl>
-            <w:tblPr>
-              <w:tblW w:type="dxa" w:w="5000"/>
-              <w:tblBorders>
-                <w:top w:val="none" w:color="FFFFFF" w:sz="0"/>
-                <w:left w:val="none" w:color="FFFFFF" w:sz="0"/>
-                <w:bottom w:val="none" w:color="FFFFFF" w:sz="0"/>
-                <w:right w:val="none" w:color="FFFFFF" w:sz="0"/>
-                <w:insideH w:val="none" w:color="FFFFFF" w:sz="0"/>
-                <w:insideV w:val="none" w:color="FFFFFF" w:sz="0"/>
-              </w:tblBorders>
-              <w:tblLayout w:type="fixed"/>
-            </w:tblPr>
-            <w:tblGrid>
-              <w:gridCol w:w="1700"/>
-              <w:gridCol w:w="3300"/>
-            </w:tblGrid>
-            <w:tr>
-              <w:tc>
-                <w:tcPr>
-                  <w:tcW w:type="dxa" w:w="1700"/>
-                  <w:tcBorders>
-                    <w:top w:val="none" w:color="FFFFFF" w:sz="0"/>
-                    <w:left w:val="none" w:color="FFFFFF" w:sz="0"/>
-                    <w:bottom w:val="none" w:color="FFFFFF" w:sz="0"/>
-                    <w:right w:val="none" w:color="FFFFFF" w:sz="0"/>
-                  </w:tcBorders>
-                  <w:tcMar>
-                    <w:top w:type="dxa" w:w="15"/>
-                    <w:left w:type="dxa" w:w="0"/>
-                    <w:bottom w:type="dxa" w:w="15"/>
-                    <w:right w:type="dxa" w:w="60"/>
-                  </w:tcMar>
-                  <w:vAlign w:val="top"/>
-                </w:tcPr>
-                <w:p>
-                  <w:pPr>
-                    <w:spacing w:after="0" w:before="0" w:line="260"/>
-                  </w:pPr>
-                  <w:r>
-                    <w:rPr>
-                      <w:rFonts w:ascii="Arial" w:cs="Arial" w:eastAsia="Arial" w:hAnsi="Arial"/>
-                      <w:b w:val="false"/>
-                      <w:bCs w:val="false"/>
-                      <w:caps w:val="false"/>
-                      <w:color w:val="5B6B60"/>
-                      <w:sz w:val="17"/>
-                      <w:szCs w:val="17"/>
-                    </w:rPr>
-                    <w:t xml:space="preserve">Bank</w:t>
-                  </w:r>
-                </w:p>
-              </w:tc>
-              <w:tc>
-                <w:tcPr>
-                  <w:tcW w:type="dxa" w:w="3300"/>
-                  <w:tcBorders>
-                    <w:top w:val="none" w:color="FFFFFF" w:sz="0"/>
-                    <w:left w:val="none" w:color="FFFFFF" w:sz="0"/>
-                    <w:bottom w:val="none" w:color="FFFFFF" w:sz="0"/>
-                    <w:right w:val="none" w:color="FFFFFF" w:sz="0"/>
-                  </w:tcBorders>
-                  <w:tcMar>
-                    <w:top w:type="dxa" w:w="15"/>
-                    <w:left w:type="dxa" w:w="0"/>
-                    <w:bottom w:type="dxa" w:w="15"/>
-                    <w:right w:type="dxa" w:w="0"/>
-                  </w:tcMar>
-                  <w:vAlign w:val="top"/>
-                </w:tcPr>
-                <w:p>
-                  <w:pPr>
-                    <w:spacing w:after="0" w:before="0" w:line="260"/>
-                  </w:pPr>
-                  <w:r>
-                    <w:rPr>
-                      <w:rFonts w:ascii="Arial" w:cs="Arial" w:eastAsia="Arial" w:hAnsi="Arial"/>
-                      <w:b/>
-                      <w:bCs/>
-                      <w:caps w:val="false"/>
-                      <w:color w:val="17221B"/>
-                      <w:sz w:val="17"/>
-                      <w:szCs w:val="17"/>
-                    </w:rPr>
-                    <w:t xml:space="preserve">HSBC</w:t>
-                  </w:r>
-                </w:p>
-              </w:tc>
-            </w:tr>
-          </w:tbl>
-          <w:tbl>
-            <w:tblPr>
-              <w:tblW w:type="dxa" w:w="5000"/>
-              <w:tblBorders>
-                <w:top w:val="none" w:color="FFFFFF" w:sz="0"/>
-                <w:left w:val="none" w:color="FFFFFF" w:sz="0"/>
-                <w:bottom w:val="none" w:color="FFFFFF" w:sz="0"/>
-                <w:right w:val="none" w:color="FFFFFF" w:sz="0"/>
-                <w:insideH w:val="none" w:color="FFFFFF" w:sz="0"/>
-                <w:insideV w:val="none" w:color="FFFFFF" w:sz="0"/>
-              </w:tblBorders>
-              <w:tblLayout w:type="fixed"/>
-            </w:tblPr>
-            <w:tblGrid>
-              <w:gridCol w:w="1700"/>
-              <w:gridCol w:w="3300"/>
-            </w:tblGrid>
-            <w:tr>
-              <w:tc>
-                <w:tcPr>
-                  <w:tcW w:type="dxa" w:w="1700"/>
-                  <w:tcBorders>
-                    <w:top w:val="none" w:color="FFFFFF" w:sz="0"/>
-                    <w:left w:val="none" w:color="FFFFFF" w:sz="0"/>
-                    <w:bottom w:val="none" w:color="FFFFFF" w:sz="0"/>
-                    <w:right w:val="none" w:color="FFFFFF" w:sz="0"/>
-                  </w:tcBorders>
-                  <w:tcMar>
-                    <w:top w:type="dxa" w:w="15"/>
-                    <w:left w:type="dxa" w:w="0"/>
-                    <w:bottom w:type="dxa" w:w="15"/>
-                    <w:right w:type="dxa" w:w="60"/>
-                  </w:tcMar>
-                  <w:vAlign w:val="top"/>
-                </w:tcPr>
-                <w:p>
-                  <w:pPr>
-                    <w:spacing w:after="0" w:before="0" w:line="260"/>
-                  </w:pPr>
-                  <w:r>
-                    <w:rPr>
-                      <w:rFonts w:ascii="Arial" w:cs="Arial" w:eastAsia="Arial" w:hAnsi="Arial"/>
-                      <w:b w:val="false"/>
-                      <w:bCs w:val="false"/>
-                      <w:caps w:val="false"/>
-                      <w:color w:val="5B6B60"/>
-                      <w:sz w:val="17"/>
-                      <w:szCs w:val="17"/>
-                    </w:rPr>
-                    <w:t xml:space="preserve">Account name</w:t>
-                  </w:r>
-                </w:p>
-              </w:tc>
-              <w:tc>
-                <w:tcPr>
-                  <w:tcW w:type="dxa" w:w="3300"/>
-                  <w:tcBorders>
-                    <w:top w:val="none" w:color="FFFFFF" w:sz="0"/>
-                    <w:left w:val="none" w:color="FFFFFF" w:sz="0"/>
-                    <w:bottom w:val="none" w:color="FFFFFF" w:sz="0"/>
-                    <w:right w:val="none" w:color="FFFFFF" w:sz="0"/>
-                  </w:tcBorders>
-                  <w:tcMar>
-                    <w:top w:type="dxa" w:w="15"/>
-                    <w:left w:type="dxa" w:w="0"/>
-                    <w:bottom w:type="dxa" w:w="15"/>
-                    <w:right w:type="dxa" w:w="0"/>
-                  </w:tcMar>
-                  <w:vAlign w:val="top"/>
-                </w:tcPr>
-                <w:p>
-                  <w:pPr>
-                    <w:spacing w:after="0" w:before="0" w:line="260"/>
-                  </w:pPr>
-                  <w:r>
-                    <w:rPr>
-                      <w:rFonts w:ascii="Arial" w:cs="Arial" w:eastAsia="Arial" w:hAnsi="Arial"/>
-                      <w:b/>
-                      <w:bCs/>
-                      <w:caps w:val="false"/>
-                      <w:color w:val="17221B"/>
-                      <w:sz w:val="17"/>
-                      <w:szCs w:val="17"/>
-                    </w:rPr>
-                    <w:t xml:space="preserve">Aura Solutions Group Limited</w:t>
-                  </w:r>
-                </w:p>
-              </w:tc>
-            </w:tr>
-          </w:tbl>
-          <w:tbl>
-            <w:tblPr>
-              <w:tblW w:type="dxa" w:w="5000"/>
-              <w:tblBorders>
-                <w:top w:val="none" w:color="FFFFFF" w:sz="0"/>
-                <w:left w:val="none" w:color="FFFFFF" w:sz="0"/>
-                <w:bottom w:val="none" w:color="FFFFFF" w:sz="0"/>
-                <w:right w:val="none" w:color="FFFFFF" w:sz="0"/>
-                <w:insideH w:val="none" w:color="FFFFFF" w:sz="0"/>
-                <w:insideV w:val="none" w:color="FFFFFF" w:sz="0"/>
-              </w:tblBorders>
-              <w:tblLayout w:type="fixed"/>
-            </w:tblPr>
-            <w:tblGrid>
-              <w:gridCol w:w="1700"/>
-              <w:gridCol w:w="3300"/>
-            </w:tblGrid>
-            <w:tr>
-              <w:tc>
-                <w:tcPr>
-                  <w:tcW w:type="dxa" w:w="1700"/>
-                  <w:tcBorders>
-                    <w:top w:val="none" w:color="FFFFFF" w:sz="0"/>
-                    <w:left w:val="none" w:color="FFFFFF" w:sz="0"/>
-                    <w:bottom w:val="none" w:color="FFFFFF" w:sz="0"/>
-                    <w:right w:val="none" w:color="FFFFFF" w:sz="0"/>
-                  </w:tcBorders>
-                  <w:tcMar>
-                    <w:top w:type="dxa" w:w="15"/>
-                    <w:left w:type="dxa" w:w="0"/>
-                    <w:bottom w:type="dxa" w:w="15"/>
-                    <w:right w:type="dxa" w:w="60"/>
-                  </w:tcMar>
-                  <w:vAlign w:val="top"/>
-                </w:tcPr>
-                <w:p>
-                  <w:pPr>
-                    <w:spacing w:after="0" w:before="0" w:line="260"/>
-                  </w:pPr>
-                  <w:r>
-                    <w:rPr>
-                      <w:rFonts w:ascii="Arial" w:cs="Arial" w:eastAsia="Arial" w:hAnsi="Arial"/>
-                      <w:b w:val="false"/>
-                      <w:bCs w:val="false"/>
-                      <w:caps w:val="false"/>
-                      <w:color w:val="5B6B60"/>
-                      <w:sz w:val="17"/>
-                      <w:szCs w:val="17"/>
-                    </w:rPr>
-                    <w:t xml:space="preserve">Sort code</w:t>
-                  </w:r>
-                </w:p>
-              </w:tc>
-              <w:tc>
-                <w:tcPr>
-                  <w:tcW w:type="dxa" w:w="3300"/>
-                  <w:tcBorders>
-                    <w:top w:val="none" w:color="FFFFFF" w:sz="0"/>
-                    <w:left w:val="none" w:color="FFFFFF" w:sz="0"/>
-                    <w:bottom w:val="none" w:color="FFFFFF" w:sz="0"/>
-                    <w:right w:val="none" w:color="FFFFFF" w:sz="0"/>
-                  </w:tcBorders>
-                  <w:tcMar>
-                    <w:top w:type="dxa" w:w="15"/>
-                    <w:left w:type="dxa" w:w="0"/>
-                    <w:bottom w:type="dxa" w:w="15"/>
-                    <w:right w:type="dxa" w:w="0"/>
-                  </w:tcMar>
-                  <w:vAlign w:val="top"/>
-                </w:tcPr>
-                <w:p>
-                  <w:pPr>
-                    <w:spacing w:after="0" w:before="0" w:line="260"/>
-                  </w:pPr>
-                  <w:r>
-                    <w:rPr>
-                      <w:rFonts w:ascii="Arial" w:cs="Arial" w:eastAsia="Arial" w:hAnsi="Arial"/>
-                      <w:b/>
-                      <w:bCs/>
-                      <w:caps w:val="false"/>
-                      <w:color w:val="17221B"/>
-                      <w:sz w:val="17"/>
-                      <w:szCs w:val="17"/>
-                    </w:rPr>
-                    <w:t xml:space="preserve">40-18-00</w:t>
-                  </w:r>
-                </w:p>
-              </w:tc>
-            </w:tr>
-          </w:tbl>
-          <w:tbl>
-            <w:tblPr>
-              <w:tblW w:type="dxa" w:w="5000"/>
-              <w:tblBorders>
-                <w:top w:val="none" w:color="FFFFFF" w:sz="0"/>
-                <w:left w:val="none" w:color="FFFFFF" w:sz="0"/>
-                <w:bottom w:val="none" w:color="FFFFFF" w:sz="0"/>
-                <w:right w:val="none" w:color="FFFFFF" w:sz="0"/>
-                <w:insideH w:val="none" w:color="FFFFFF" w:sz="0"/>
-                <w:insideV w:val="none" w:color="FFFFFF" w:sz="0"/>
-              </w:tblBorders>
-              <w:tblLayout w:type="fixed"/>
-            </w:tblPr>
-            <w:tblGrid>
-              <w:gridCol w:w="1700"/>
-              <w:gridCol w:w="3300"/>
-            </w:tblGrid>
-            <w:tr>
-              <w:tc>
-                <w:tcPr>
-                  <w:tcW w:type="dxa" w:w="1700"/>
-                  <w:tcBorders>
-                    <w:top w:val="none" w:color="FFFFFF" w:sz="0"/>
-                    <w:left w:val="none" w:color="FFFFFF" w:sz="0"/>
-                    <w:bottom w:val="none" w:color="FFFFFF" w:sz="0"/>
-                    <w:right w:val="none" w:color="FFFFFF" w:sz="0"/>
-                  </w:tcBorders>
-                  <w:tcMar>
-                    <w:top w:type="dxa" w:w="15"/>
-                    <w:left w:type="dxa" w:w="0"/>
-                    <w:bottom w:type="dxa" w:w="15"/>
-                    <w:right w:type="dxa" w:w="60"/>
-                  </w:tcMar>
-                  <w:vAlign w:val="top"/>
-                </w:tcPr>
-                <w:p>
-                  <w:pPr>
-                    <w:spacing w:after="0" w:before="0" w:line="260"/>
-                  </w:pPr>
-                  <w:r>
-                    <w:rPr>
-                      <w:rFonts w:ascii="Arial" w:cs="Arial" w:eastAsia="Arial" w:hAnsi="Arial"/>
-                      <w:b w:val="false"/>
-                      <w:bCs w:val="false"/>
-                      <w:caps w:val="false"/>
-                      <w:color w:val="5B6B60"/>
-                      <w:sz w:val="17"/>
-                      <w:szCs w:val="17"/>
-                    </w:rPr>
-                    <w:t xml:space="preserve">Account no.</w:t>
-                  </w:r>
-                </w:p>
-              </w:tc>
-              <w:tc>
-                <w:tcPr>
-                  <w:tcW w:type="dxa" w:w="3300"/>
-                  <w:tcBorders>
-                    <w:top w:val="none" w:color="FFFFFF" w:sz="0"/>
-                    <w:left w:val="none" w:color="FFFFFF" w:sz="0"/>
-                    <w:bottom w:val="none" w:color="FFFFFF" w:sz="0"/>
-                    <w:right w:val="none" w:color="FFFFFF" w:sz="0"/>
-                  </w:tcBorders>
-                  <w:tcMar>
-                    <w:top w:type="dxa" w:w="15"/>
-                    <w:left w:type="dxa" w:w="0"/>
-                    <w:bottom w:type="dxa" w:w="15"/>
-                    <w:right w:type="dxa" w:w="0"/>
-                  </w:tcMar>
-                  <w:vAlign w:val="top"/>
-                </w:tcPr>
-                <w:p>
-                  <w:pPr>
-                    <w:spacing w:after="0" w:before="0" w:line="260"/>
-                  </w:pPr>
-                  <w:r>
-                    <w:rPr>
-                      <w:rFonts w:ascii="Arial" w:cs="Arial" w:eastAsia="Arial" w:hAnsi="Arial"/>
-                      <w:b/>
-                      <w:bCs/>
-                      <w:caps w:val="false"/>
-                      <w:color w:val="17221B"/>
-                      <w:sz w:val="17"/>
-                      <w:szCs w:val="17"/>
-                    </w:rPr>
-                    <w:t xml:space="preserve">31377817</w:t>
-                  </w:r>
-                </w:p>
-              </w:tc>
-            </w:tr>
-          </w:tbl>
-          <w:tbl>
-            <w:tblPr>
-              <w:tblW w:type="dxa" w:w="5000"/>
-              <w:tblBorders>
-                <w:top w:val="none" w:color="FFFFFF" w:sz="0"/>
-                <w:left w:val="none" w:color="FFFFFF" w:sz="0"/>
-                <w:bottom w:val="none" w:color="FFFFFF" w:sz="0"/>
-                <w:right w:val="none" w:color="FFFFFF" w:sz="0"/>
-                <w:insideH w:val="none" w:color="FFFFFF" w:sz="0"/>
-                <w:insideV w:val="none" w:color="FFFFFF" w:sz="0"/>
-              </w:tblBorders>
-              <w:tblLayout w:type="fixed"/>
-            </w:tblPr>
-            <w:tblGrid>
-              <w:gridCol w:w="1700"/>
-              <w:gridCol w:w="3300"/>
-            </w:tblGrid>
-            <w:tr>
-              <w:tc>
-                <w:tcPr>
-                  <w:tcW w:type="dxa" w:w="1700"/>
-                  <w:tcBorders>
-                    <w:top w:val="none" w:color="FFFFFF" w:sz="0"/>
-                    <w:left w:val="none" w:color="FFFFFF" w:sz="0"/>
-                    <w:bottom w:val="none" w:color="FFFFFF" w:sz="0"/>
-                    <w:right w:val="none" w:color="FFFFFF" w:sz="0"/>
-                  </w:tcBorders>
-                  <w:tcMar>
-                    <w:top w:type="dxa" w:w="15"/>
-                    <w:left w:type="dxa" w:w="0"/>
-                    <w:bottom w:type="dxa" w:w="15"/>
-                    <w:right w:type="dxa" w:w="60"/>
-                  </w:tcMar>
-                  <w:vAlign w:val="top"/>
-                </w:tcPr>
-                <w:p>
-                  <w:pPr>
-                    <w:spacing w:after="0" w:before="0" w:line="260"/>
-                  </w:pPr>
-                  <w:r>
-                    <w:rPr>
-                      <w:rFonts w:ascii="Arial" w:cs="Arial" w:eastAsia="Arial" w:hAnsi="Arial"/>
-                      <w:b w:val="false"/>
-                      <w:bCs w:val="false"/>
-                      <w:caps w:val="false"/>
-                      <w:color w:val="5B6B60"/>
-                      <w:sz w:val="17"/>
-                      <w:szCs w:val="17"/>
-                    </w:rPr>
-                    <w:t xml:space="preserve">Payment reference</w:t>
-                  </w:r>
-                </w:p>
-              </w:tc>
-              <w:tc>
-                <w:tcPr>
-                  <w:tcW w:type="dxa" w:w="3300"/>
-                  <w:tcBorders>
-                    <w:top w:val="none" w:color="FFFFFF" w:sz="0"/>
-                    <w:left w:val="none" w:color="FFFFFF" w:sz="0"/>
-                    <w:bottom w:val="none" w:color="FFFFFF" w:sz="0"/>
-                    <w:right w:val="none" w:color="FFFFFF" w:sz="0"/>
-                  </w:tcBorders>
-                  <w:tcMar>
-                    <w:top w:type="dxa" w:w="15"/>
-                    <w:left w:type="dxa" w:w="0"/>
-                    <w:bottom w:type="dxa" w:w="15"/>
-                    <w:right w:type="dxa" w:w="0"/>
-                  </w:tcMar>
-                  <w:vAlign w:val="top"/>
-                </w:tcPr>
-                <w:p>
-                  <w:pPr>
-                    <w:spacing w:after="0" w:before="0" w:line="260"/>
-                  </w:pPr>
-                  <w:r>
-                    <w:rPr>
-                      <w:rFonts w:ascii="Arial" w:cs="Arial" w:eastAsia="Arial" w:hAnsi="Arial"/>
-                      <w:b/>
-                      <w:bCs/>
-                      <w:caps w:val="false"/>
-                      <w:color w:val="17221B"/>
-                      <w:sz w:val="17"/>
-                      <w:szCs w:val="17"/>
-                    </w:rPr>
-                    <w:fldChar w:fldCharType="begin"/>
-                  </w:r>
-                  <w:r>
-                    <w:rPr>
-                      <w:rFonts w:ascii="Arial" w:cs="Arial" w:eastAsia="Arial" w:hAnsi="Arial"/>
-                      <w:b/>
-                      <w:bCs/>
-                      <w:caps w:val="false"/>
-                      <w:color w:val="17221B"/>
-                      <w:sz w:val="17"/>
-                      <w:szCs w:val="17"/>
-                    </w:rPr>
-                    <w:instrText xml:space="preserve"> MERGEFIELD  InvoiceNumber  \* MERGEFORMAT </w:instrText>
-                  </w:r>
-                  <w:r>
-                    <w:rPr>
-                      <w:rFonts w:ascii="Arial" w:cs="Arial" w:eastAsia="Arial" w:hAnsi="Arial"/>
-                      <w:b/>
-                      <w:bCs/>
-                      <w:caps w:val="false"/>
-                      <w:color w:val="17221B"/>
-                      <w:sz w:val="17"/>
-                      <w:szCs w:val="17"/>
-                    </w:rPr>
-                    <w:fldChar w:fldCharType="separate"/>
-                  </w:r>
-                  <w:r>
-                    <w:rPr>
-                      <w:rFonts w:ascii="Arial" w:cs="Arial" w:eastAsia="Arial" w:hAnsi="Arial"/>
-                      <w:b/>
-                      <w:bCs/>
-                      <w:caps w:val="false"/>
-                      <w:color w:val="17221B"/>
-                      <w:sz w:val="17"/>
-                      <w:szCs w:val="17"/>
-                    </w:rPr>
-                    <w:t xml:space="preserve">«InvoiceNumber»</w:t>
-                  </w:r>
-                  <w:r>
-                    <w:rPr>
-                      <w:rFonts w:ascii="Arial" w:cs="Arial" w:eastAsia="Arial" w:hAnsi="Arial"/>
-                      <w:b/>
-                      <w:bCs/>
-                      <w:caps w:val="false"/>
-                      <w:color w:val="17221B"/>
-                      <w:sz w:val="17"/>
-                      <w:szCs w:val="17"/>
-                    </w:rPr>
-                    <w:fldChar w:fldCharType="end"/>
-                  </w:r>
-                </w:p>
-              </w:tc>
-            </w:tr>
-          </w:tbl>
-          <w:p/>
-        </w:tc>
-        <w:tc>
-          <w:tcPr>
-            <w:tcW w:type="dxa" w:w="160"/>
-            <w:tcBorders>
-              <w:top w:val="none" w:color="FFFFFF" w:sz="0"/>
-              <w:left w:val="none" w:color="FFFFFF" w:sz="0"/>
-              <w:bottom w:val="none" w:color="FFFFFF" w:sz="0"/>
-              <w:right w:val="single" w:color="CDD6CF" w:sz="4"/>
-            </w:tcBorders>
-            <w:tcMar>
-              <w:top w:type="dxa" w:w="0"/>
-              <w:left w:type="dxa" w:w="0"/>
-              <w:bottom w:type="dxa" w:w="0"/>
-              <w:right w:type="dxa" w:w="0"/>
-            </w:tcMar>
-            <w:vAlign w:val="top"/>
-          </w:tcPr>
-          <w:p>
-            <w:pPr>
-              <w:spacing w:after="40" w:before="0" w:line="260"/>
-            </w:pPr>
-          </w:p>
-        </w:tc>
-        <w:tc>
-          <w:tcPr>
-            <w:tcW w:type="dxa" w:w="5106"/>
-            <w:tcBorders>
-              <w:top w:val="none" w:color="FFFFFF" w:sz="0"/>
-              <w:left w:val="none" w:color="FFFFFF" w:sz="0"/>
-              <w:bottom w:val="none" w:color="FFFFFF" w:sz="0"/>
-              <w:right w:val="none" w:color="FFFFFF" w:sz="0"/>
-            </w:tcBorders>
-            <w:tcMar>
-              <w:top w:type="dxa" w:w="0"/>
-              <w:left w:type="dxa" w:w="120"/>
-              <w:bottom w:type="dxa" w:w="0"/>
-              <w:right w:type="dxa" w:w="120"/>
-            </w:tcMar>
-            <w:vAlign w:val="center"/>
-          </w:tcPr>
-          <w:p>
-            <w:pPr>
-              <w:spacing w:after="60" w:before="0" w:line="260"/>
-              <w:jc w:val="center"/>
-            </w:pPr>
-            <w:r>
-              <w:rPr>
-                <w:rFonts w:ascii="Arial" w:cs="Arial" w:eastAsia="Arial" w:hAnsi="Arial"/>
-                <w:b/>
-                <w:bCs/>
-                <w:caps/>
-                <w:color w:val="2F6B3A"/>
-                <w:spacing w:val="10"/>
-                <w:sz w:val="16"/>
-                <w:szCs w:val="16"/>
-              </w:rPr>
-              <w:t xml:space="preserve">Pay online</w:t>
-            </w:r>
-          </w:p>
-          <w:p>
-            <w:pPr>
-              <w:spacing w:after="40"/>
-              <w:jc w:val="center"/>
-            </w:pPr>
-            <w:r>
-              <w:rPr>
-                <w:rFonts w:ascii="Arial" w:cs="Arial" w:eastAsia="Arial" w:hAnsi="Arial"/>
-                <w:b w:val="false"/>
-                <w:bCs w:val="false"/>
-                <w:caps w:val="false"/>
-                <w:color w:val="17221B"/>
-                <w:sz w:val="18"/>
-                <w:szCs w:val="18"/>
-              </w:rPr>
-              <w:fldChar w:fldCharType="begin"/>
-            </w:r>
-            <w:r>
-              <w:rPr>
-                <w:rFonts w:ascii="Arial" w:cs="Arial" w:eastAsia="Arial" w:hAnsi="Arial"/>
-                <w:b w:val="false"/>
-                <w:bCs w:val="false"/>
-                <w:caps w:val="false"/>
-                <w:color w:val="17221B"/>
-                <w:sz w:val="18"/>
-                <w:szCs w:val="18"/>
-              </w:rPr>
-              <w:instrText xml:space="preserve"> MERGEFIELD  PaymentImage  \* MERGEFORMAT </w:instrText>
-            </w:r>
-            <w:r>
-              <w:rPr>
-                <w:rFonts w:ascii="Arial" w:cs="Arial" w:eastAsia="Arial" w:hAnsi="Arial"/>
-                <w:b w:val="false"/>
-                <w:bCs w:val="false"/>
-                <w:caps w:val="false"/>
-                <w:color w:val="17221B"/>
-                <w:sz w:val="18"/>
-                <w:szCs w:val="18"/>
-              </w:rPr>
-              <w:fldChar w:fldCharType="separate"/>
-            </w:r>
-            <w:r>
-              <w:rPr>
-                <w:rFonts w:ascii="Arial" w:cs="Arial" w:eastAsia="Arial" w:hAnsi="Arial"/>
-                <w:b w:val="false"/>
-                <w:bCs w:val="false"/>
-                <w:caps w:val="false"/>
-                <w:color w:val="17221B"/>
-                <w:sz w:val="18"/>
-                <w:szCs w:val="18"/>
-              </w:rPr>
-              <w:t xml:space="preserve">«PaymentImage»</w:t>
-            </w:r>
-            <w:r>
-              <w:rPr>
-                <w:rFonts w:ascii="Arial" w:cs="Arial" w:eastAsia="Arial" w:hAnsi="Arial"/>
-                <w:b w:val="false"/>
-                <w:bCs w:val="false"/>
-                <w:caps w:val="false"/>
-                <w:color w:val="17221B"/>
-                <w:sz w:val="18"/>
-                <w:szCs w:val="18"/>
-              </w:rPr>
-              <w:fldChar w:fldCharType="end"/>
-            </w:r>
-          </w:p>
-          <w:p>
-            <w:pPr>
-              <w:spacing w:after="0" w:before="0" w:line="260"/>
-              <w:jc w:val="center"/>
-            </w:pPr>
-            <w:r>
-              <w:rPr>
-                <w:rFonts w:ascii="Arial" w:cs="Arial" w:eastAsia="Arial" w:hAnsi="Arial"/>
-                <w:b/>
-                <w:bCs/>
-                <w:caps w:val="false"/>
-                <w:color w:val="2F6B3A"/>
-                <w:sz w:val="16"/>
-                <w:szCs w:val="16"/>
-              </w:rPr>
-              <w:fldChar w:fldCharType="begin"/>
-            </w:r>
-            <w:r>
-              <w:rPr>
-                <w:rFonts w:ascii="Arial" w:cs="Arial" w:eastAsia="Arial" w:hAnsi="Arial"/>
-                <w:b/>
-                <w:bCs/>
-                <w:caps w:val="false"/>
-                <w:color w:val="2F6B3A"/>
-                <w:sz w:val="16"/>
-                <w:szCs w:val="16"/>
-              </w:rPr>
-              <w:instrText xml:space="preserve"> MERGEFIELD  PaymentMessageAndUrl  \* MERGEFORMAT </w:instrText>
-            </w:r>
-            <w:r>
-              <w:rPr>
-                <w:rFonts w:ascii="Arial" w:cs="Arial" w:eastAsia="Arial" w:hAnsi="Arial"/>
-                <w:b/>
-                <w:bCs/>
-                <w:caps w:val="false"/>
-                <w:color w:val="2F6B3A"/>
-                <w:sz w:val="16"/>
-                <w:szCs w:val="16"/>
-              </w:rPr>
-              <w:fldChar w:fldCharType="separate"/>
-            </w:r>
-            <w:r>
-              <w:rPr>
-                <w:rFonts w:ascii="Arial" w:cs="Arial" w:eastAsia="Arial" w:hAnsi="Arial"/>
-                <w:b/>
-                <w:bCs/>
-                <w:caps w:val="false"/>
-                <w:color w:val="2F6B3A"/>
-                <w:sz w:val="16"/>
-                <w:szCs w:val="16"/>
-              </w:rPr>
-              <w:t xml:space="preserve">«PaymentMessageAndUrl»</w:t>
-            </w:r>
-            <w:r>
-              <w:rPr>
-                <w:rFonts w:ascii="Arial" w:cs="Arial" w:eastAsia="Arial" w:hAnsi="Arial"/>
-                <w:b/>
-                <w:bCs/>
-                <w:caps w:val="false"/>
-                <w:color w:val="2F6B3A"/>
-                <w:sz w:val="16"/>
-                <w:szCs w:val="16"/>
-              </w:rPr>
-              <w:fldChar w:fldCharType="end"/>
-            </w:r>
-          </w:p>
-        </w:tc>
-      </w:tr>
-    </w:tbl>
-    <w:p>
-      <w:pPr>
-        <w:spacing w:after="80"/>
-      </w:pPr>
-    </w:p>
-    <w:tbl>
-      <w:tblPr>
-        <w:tblW w:type="dxa" w:w="10466"/>
-        <w:tblBorders>
-          <w:top w:val="none" w:color="FFFFFF" w:sz="0"/>
-          <w:left w:val="none" w:color="FFFFFF" w:sz="0"/>
-          <w:bottom w:val="none" w:color="FFFFFF" w:sz="0"/>
-          <w:right w:val="none" w:color="FFFFFF" w:sz="0"/>
-          <w:insideH w:val="none" w:color="FFFFFF" w:sz="0"/>
-          <w:insideV w:val="none" w:color="FFFFFF" w:sz="0"/>
-        </w:tblBorders>
-        <w:tblLayout w:type="fixed"/>
-      </w:tblPr>
-      <w:tblGrid>
-        <w:gridCol w:w="10466"/>
-      </w:tblGrid>
-      <w:tr>
-        <w:tc>
-          <w:tcPr>
-            <w:tcW w:type="dxa" w:w="10466"/>
-            <w:tcBorders>
-              <w:top w:val="single" w:color="E3E9E4" w:sz="4"/>
-              <w:left w:val="single" w:color="E3E9E4" w:sz="4"/>
-              <w:bottom w:val="single" w:color="E3E9E4" w:sz="4"/>
-              <w:right w:val="single" w:color="E3E9E4" w:sz="4"/>
-            </w:tcBorders>
-            <w:shd w:fill="F6F9F6" w:color="auto" w:val="clear"/>
-            <w:tcMar>
-              <w:top w:type="dxa" w:w="90"/>
-              <w:left w:type="dxa" w:w="140"/>
-              <w:bottom w:type="dxa" w:w="90"/>
-              <w:right w:type="dxa" w:w="140"/>
-            </w:tcMar>
-            <w:vAlign w:val="top"/>
-          </w:tcPr>
-          <w:p>
-            <w:pPr>
-              <w:spacing w:after="50" w:before="0" w:line="260"/>
-            </w:pPr>
-            <w:r>
-              <w:rPr>
-                <w:rFonts w:ascii="Arial" w:cs="Arial" w:eastAsia="Arial" w:hAnsi="Arial"/>
-                <w:b w:val="false"/>
-                <w:bCs w:val="false"/>
-                <w:caps w:val="false"/>
-                <w:color w:val="17221B"/>
-                <w:sz w:val="16"/>
-                <w:szCs w:val="16"/>
-              </w:rPr>
-              <w:t xml:space="preserve">Payment is due by </w:t>
-            </w:r>
-            <w:r>
-              <w:rPr>
-                <w:rFonts w:ascii="Arial" w:cs="Arial" w:eastAsia="Arial" w:hAnsi="Arial"/>
-                <w:b w:val="false"/>
-                <w:bCs w:val="false"/>
-                <w:caps w:val="false"/>
-                <w:color w:val="17221B"/>
-                <w:sz w:val="16"/>
-                <w:szCs w:val="16"/>
-              </w:rPr>
-              <w:fldChar w:fldCharType="begin"/>
-            </w:r>
-            <w:r>
-              <w:rPr>
-                <w:rFonts w:ascii="Arial" w:cs="Arial" w:eastAsia="Arial" w:hAnsi="Arial"/>
-                <w:b w:val="false"/>
-                <w:bCs w:val="false"/>
-                <w:caps w:val="false"/>
-                <w:color w:val="17221B"/>
-                <w:sz w:val="16"/>
-                <w:szCs w:val="16"/>
-              </w:rPr>
-              <w:instrText xml:space="preserve"> MERGEFIELD  InvoiceDueDate  \@ "d MMMM yyyy"  \* MERGEFORMAT </w:instrText>
-            </w:r>
-            <w:r>
-              <w:rPr>
-                <w:rFonts w:ascii="Arial" w:cs="Arial" w:eastAsia="Arial" w:hAnsi="Arial"/>
-                <w:b w:val="false"/>
-                <w:bCs w:val="false"/>
-                <w:caps w:val="false"/>
-                <w:color w:val="17221B"/>
-                <w:sz w:val="16"/>
-                <w:szCs w:val="16"/>
-              </w:rPr>
-              <w:fldChar w:fldCharType="separate"/>
-            </w:r>
-            <w:r>
-              <w:rPr>
-                <w:rFonts w:ascii="Arial" w:cs="Arial" w:eastAsia="Arial" w:hAnsi="Arial"/>
-                <w:b w:val="false"/>
-                <w:bCs w:val="false"/>
-                <w:caps w:val="false"/>
-                <w:color w:val="17221B"/>
-                <w:sz w:val="16"/>
-                <w:szCs w:val="16"/>
-              </w:rPr>
-              <w:t xml:space="preserve">«InvoiceDueDate»</w:t>
-            </w:r>
-            <w:r>
-              <w:rPr>
-                <w:rFonts w:ascii="Arial" w:cs="Arial" w:eastAsia="Arial" w:hAnsi="Arial"/>
-                <w:b w:val="false"/>
-                <w:bCs w:val="false"/>
-                <w:caps w:val="false"/>
-                <w:color w:val="17221B"/>
-                <w:sz w:val="16"/>
-                <w:szCs w:val="16"/>
-              </w:rPr>
-              <w:fldChar w:fldCharType="end"/>
-            </w:r>
-            <w:r>
-              <w:rPr>
-                <w:rFonts w:ascii="Arial" w:cs="Arial" w:eastAsia="Arial" w:hAnsi="Arial"/>
-                <w:b w:val="false"/>
-                <w:bCs w:val="false"/>
-                <w:caps w:val="false"/>
-                <w:color w:val="17221B"/>
-                <w:sz w:val="16"/>
-                <w:szCs w:val="16"/>
-              </w:rPr>
-              <w:t xml:space="preserve"> – 30 days end of month. Please quote the invoice number as your payment reference and send remittance advice to info@aurasolutions.co.uk.</w:t>
-            </w:r>
-          </w:p>
-          <w:p>
-            <w:pPr>
-              <w:spacing w:after="50" w:before="0" w:line="260"/>
-            </w:pPr>
-            <w:r>
-              <w:rPr>
-                <w:rFonts w:ascii="Arial" w:cs="Arial" w:eastAsia="Arial" w:hAnsi="Arial"/>
-                <w:b/>
-                <w:bCs/>
-                <w:caps w:val="false"/>
-                <w:color w:val="17221B"/>
-                <w:sz w:val="16"/>
-                <w:szCs w:val="16"/>
-              </w:rPr>
-              <w:t xml:space="preserve">No CIS deductions are to be made from this invoice.</w:t>
-            </w:r>
-          </w:p>
-          <w:p>
-            <w:pPr>
-              <w:spacing w:after="0" w:before="0" w:line="260"/>
-            </w:pPr>
-            <w:r>
-              <w:rPr>
-                <w:rFonts w:ascii="Arial" w:cs="Arial" w:eastAsia="Arial" w:hAnsi="Arial"/>
-                <w:b w:val="false"/>
-                <w:bCs w:val="false"/>
-                <w:caps w:val="false"/>
-                <w:color w:val="5B6B60"/>
-                <w:sz w:val="15"/>
-                <w:szCs w:val="15"/>
-              </w:rPr>
-              <w:t xml:space="preserve">Accounts not settled within terms may be charged interest and compensation under the Late Payment of Commercial Debts (Interest) Act 1998.</w:t>
-            </w:r>
-          </w:p>
-        </w:tc>
-      </w:tr>
-    </w:tbl>
     <w:sectPr>
       <w:footerReference w:type="default" r:id="rId6"/>
+      <w:footerReference w:type="first" r:id="rId7"/>
       <w:pgSz w:w="11906" w:h="16838" w:orient="portrait"/>
       <w:pgMar w:top="567" w:right="720" w:bottom="1080" w:left="720" w:header="300" w:footer="300" w:gutter="0"/>
       <w:pgNumType/>
+      <w:titlePg/>
       <w:docGrid w:linePitch="360"/>
     </w:sectPr>
   </w:body>
@@ -4289,7 +3345,7 @@
           <wp:extent cx="7562850" cy="10696575"/>
           <wp:effectExtent t="0" r="0" b="0" l="0"/>
           <wp:wrapNone/>
-          <wp:docPr id="4" name="" descr="" title=""/>
+          <wp:docPr id="3" name="" descr="" title=""/>
           <wp:cNvGraphicFramePr>
             <a:graphicFrameLocks xmlns:a="http://schemas.openxmlformats.org/drawingml/2006/main" noChangeAspect="1"/>
           </wp:cNvGraphicFramePr>
@@ -4343,7 +3399,1190 @@
           <wp:extent cx="7562850" cy="685800"/>
           <wp:effectExtent t="0" r="0" b="0" l="0"/>
           <wp:wrapNone/>
-          <wp:docPr id="3" name="" descr="" title=""/>
+          <wp:docPr id="4" name="" descr="" title=""/>
+          <wp:cNvGraphicFramePr>
+            <a:graphicFrameLocks xmlns:a="http://schemas.openxmlformats.org/drawingml/2006/main" noChangeAspect="1"/>
+          </wp:cNvGraphicFramePr>
+          <a:graphic xmlns:a="http://schemas.openxmlformats.org/drawingml/2006/main">
+            <a:graphicData uri="http://schemas.openxmlformats.org/drawingml/2006/picture">
+              <pic:pic xmlns:pic="http://schemas.openxmlformats.org/drawingml/2006/picture">
+                <pic:nvPicPr>
+                  <pic:cNvPr id="0" name="" descr=""/>
+                  <pic:cNvPicPr>
+                    <a:picLocks noChangeAspect="1" noChangeArrowheads="1"/>
+                  </pic:cNvPicPr>
+                </pic:nvPicPr>
+                <pic:blipFill>
+                  <a:blip r:embed="rId1" cstate="none"/>
+                  <a:srcRect/>
+                  <a:stretch>
+                    <a:fillRect/>
+                  </a:stretch>
+                </pic:blipFill>
+                <pic:spPr bwMode="auto">
+                  <a:xfrm>
+                    <a:off x="0" y="0"/>
+                    <a:ext cx="7562850" cy="685800"/>
+                  </a:xfrm>
+                  <a:prstGeom prst="rect">
+                    <a:avLst/>
+                  </a:prstGeom>
+                </pic:spPr>
+              </pic:pic>
+            </a:graphicData>
+          </a:graphic>
+        </wp:anchor>
+      </w:drawing>
+    </w:r>
+    <w:r>
+      <w:rPr>
+        <w:rFonts w:ascii="Arial" w:cs="Arial" w:eastAsia="Arial" w:hAnsi="Arial"/>
+        <w:b/>
+        <w:bCs/>
+        <w:caps w:val="false"/>
+        <w:color w:val="FFFFFF"/>
+        <w:sz w:val="13"/>
+        <w:szCs w:val="13"/>
+      </w:rPr>
+      <w:t xml:space="preserve">AURA SOLUTIONS GROUP LIMITED  ·  Registered office: Main Street, Sedgeberrow, Evesham, England, WR11 7UH</w:t>
+    </w:r>
+  </w:p>
+  <w:p>
+    <w:pPr>
+      <w:spacing w:after="0" w:line="220"/>
+      <w:jc w:val="center"/>
+    </w:pPr>
+    <w:r>
+      <w:rPr>
+        <w:rFonts w:ascii="Arial" w:cs="Arial" w:eastAsia="Arial" w:hAnsi="Arial"/>
+        <w:b w:val="false"/>
+        <w:bCs w:val="false"/>
+        <w:caps w:val="false"/>
+        <w:color w:val="FFFFFF"/>
+        <w:sz w:val="13"/>
+        <w:szCs w:val="13"/>
+      </w:rPr>
+      <w:t xml:space="preserve">Registered in England and Wales no. 15761350  ·  VAT no. GB 471 3179 91  ·  Registered waste carrier CBDU631384</w:t>
+    </w:r>
+  </w:p>
+  <w:p>
+    <w:pPr>
+      <w:spacing w:after="0" w:line="220"/>
+      <w:jc w:val="center"/>
+    </w:pPr>
+    <w:r>
+      <w:rPr>
+        <w:rFonts w:ascii="Arial" w:cs="Arial" w:eastAsia="Arial" w:hAnsi="Arial"/>
+        <w:b w:val="false"/>
+        <w:bCs w:val="false"/>
+        <w:caps w:val="false"/>
+        <w:color w:val="B9D3BD"/>
+        <w:sz w:val="13"/>
+        <w:szCs w:val="13"/>
+      </w:rPr>
+      <w:t xml:space="preserve">Invoice </w:t>
+    </w:r>
+    <w:r>
+      <w:rPr>
+        <w:rFonts w:ascii="Arial" w:cs="Arial" w:eastAsia="Arial" w:hAnsi="Arial"/>
+        <w:b w:val="false"/>
+        <w:bCs w:val="false"/>
+        <w:caps w:val="false"/>
+        <w:color w:val="B9D3BD"/>
+        <w:sz w:val="13"/>
+        <w:szCs w:val="13"/>
+      </w:rPr>
+      <w:fldChar w:fldCharType="begin"/>
+    </w:r>
+    <w:r>
+      <w:rPr>
+        <w:rFonts w:ascii="Arial" w:cs="Arial" w:eastAsia="Arial" w:hAnsi="Arial"/>
+        <w:b w:val="false"/>
+        <w:bCs w:val="false"/>
+        <w:caps w:val="false"/>
+        <w:color w:val="B9D3BD"/>
+        <w:sz w:val="13"/>
+        <w:szCs w:val="13"/>
+      </w:rPr>
+      <w:instrText xml:space="preserve"> MERGEFIELD  InvoiceNumber  \* MERGEFORMAT </w:instrText>
+    </w:r>
+    <w:r>
+      <w:rPr>
+        <w:rFonts w:ascii="Arial" w:cs="Arial" w:eastAsia="Arial" w:hAnsi="Arial"/>
+        <w:b w:val="false"/>
+        <w:bCs w:val="false"/>
+        <w:caps w:val="false"/>
+        <w:color w:val="B9D3BD"/>
+        <w:sz w:val="13"/>
+        <w:szCs w:val="13"/>
+      </w:rPr>
+      <w:fldChar w:fldCharType="separate"/>
+    </w:r>
+    <w:r>
+      <w:rPr>
+        <w:rFonts w:ascii="Arial" w:cs="Arial" w:eastAsia="Arial" w:hAnsi="Arial"/>
+        <w:b w:val="false"/>
+        <w:bCs w:val="false"/>
+        <w:caps w:val="false"/>
+        <w:color w:val="B9D3BD"/>
+        <w:sz w:val="13"/>
+        <w:szCs w:val="13"/>
+      </w:rPr>
+      <w:t xml:space="preserve">«InvoiceNumber»</w:t>
+    </w:r>
+    <w:r>
+      <w:rPr>
+        <w:rFonts w:ascii="Arial" w:cs="Arial" w:eastAsia="Arial" w:hAnsi="Arial"/>
+        <w:b w:val="false"/>
+        <w:bCs w:val="false"/>
+        <w:caps w:val="false"/>
+        <w:color w:val="B9D3BD"/>
+        <w:sz w:val="13"/>
+        <w:szCs w:val="13"/>
+      </w:rPr>
+      <w:fldChar w:fldCharType="end"/>
+    </w:r>
+    <w:r>
+      <w:rPr>
+        <w:rFonts w:ascii="Arial" w:cs="Arial" w:eastAsia="Arial" w:hAnsi="Arial"/>
+        <w:b w:val="false"/>
+        <w:bCs w:val="false"/>
+        <w:caps w:val="false"/>
+        <w:color w:val="B9D3BD"/>
+        <w:sz w:val="13"/>
+        <w:szCs w:val="13"/>
+      </w:rPr>
+      <w:t xml:space="preserve">  ·  Queries: info@aurasolutions.co.uk · 01386 571556</w:t>
+    </w:r>
+  </w:p>
+</w:ftr>
+</file>
+
+<file path=word/footer2.xml><?xml version="1.0" encoding="utf-8"?>
+<w:ftr xmlns:wpc="http://schemas.microsoft.com/office/word/2010/wordprocessingCanvas" xmlns:mc="http://schemas.openxmlformats.org/markup-compatibility/2006" xmlns:o="urn:schemas-microsoft-com:office:office" xmlns:r="http://schemas.openxmlformats.org/officeDocument/2006/relationships" xmlns:m="http://schemas.openxmlformats.org/officeDocument/2006/math" xmlns:v="urn:schemas-microsoft-com:vml" xmlns:wp14="http://schemas.microsoft.com/office/word/2010/wordprocessingDrawing" xmlns:wp="http://schemas.openxmlformats.org/drawingml/2006/wordprocessingDrawing" xmlns:w10="urn:schemas-microsoft-com:office:word" xmlns:w="http://schemas.openxmlformats.org/wordprocessingml/2006/main" xmlns:w14="http://schemas.microsoft.com/office/word/2010/wordml" xmlns:w15="http://schemas.microsoft.com/office/word/2012/wordml" xmlns:wpg="http://schemas.microsoft.com/office/word/2010/wordprocessingGroup" xmlns:wpi="http://schemas.microsoft.com/office/word/2010/wordprocessingInk" xmlns:wne="http://schemas.microsoft.com/office/word/2006/wordml" xmlns:wps="http://schemas.microsoft.com/office/word/2010/wordprocessingShape">
+  <w:p>
+    <w:pPr>
+      <w:keepNext/>
+      <w:pBdr>
+        <w:bottom w:val="single" w:color="79CF36" w:sz="6" w:space="3"/>
+      </w:pBdr>
+      <w:spacing w:after="80" w:before="170"/>
+    </w:pPr>
+    <w:r>
+      <w:rPr>
+        <w:rFonts w:ascii="Arial" w:cs="Arial" w:eastAsia="Arial" w:hAnsi="Arial"/>
+        <w:b/>
+        <w:bCs/>
+        <w:color w:val="FFFFFF"/>
+        <w:sz w:val="18"/>
+        <w:szCs w:val="18"/>
+        <w:shd w:fill="2F6B3A" w:color="auto" w:val="clear"/>
+      </w:rPr>
+      <w:t xml:space="preserve"> 3 </w:t>
+    </w:r>
+    <w:r>
+      <w:rPr>
+        <w:rFonts w:ascii="Arial" w:cs="Arial" w:eastAsia="Arial" w:hAnsi="Arial"/>
+        <w:b/>
+        <w:bCs/>
+        <w:color w:val="0C3E17"/>
+        <w:sz w:val="23"/>
+        <w:szCs w:val="23"/>
+      </w:rPr>
+      <w:t xml:space="preserve">  How to pay</w:t>
+    </w:r>
+  </w:p>
+  <w:tbl>
+    <w:tblPr>
+      <w:tblW w:type="dxa" w:w="10466"/>
+      <w:tblBorders>
+        <w:top w:val="none" w:color="FFFFFF" w:sz="0"/>
+        <w:left w:val="none" w:color="FFFFFF" w:sz="0"/>
+        <w:bottom w:val="none" w:color="FFFFFF" w:sz="0"/>
+        <w:right w:val="none" w:color="FFFFFF" w:sz="0"/>
+        <w:insideH w:val="none" w:color="FFFFFF" w:sz="0"/>
+        <w:insideV w:val="none" w:color="FFFFFF" w:sz="0"/>
+      </w:tblBorders>
+      <w:tblLayout w:type="fixed"/>
+    </w:tblPr>
+    <w:tblGrid>
+      <w:gridCol w:w="5200"/>
+      <w:gridCol w:w="160"/>
+      <w:gridCol w:w="5106"/>
+    </w:tblGrid>
+    <w:tr>
+      <w:tc>
+        <w:tcPr>
+          <w:tcW w:type="dxa" w:w="5200"/>
+          <w:tcBorders>
+            <w:top w:val="none" w:color="FFFFFF" w:sz="0"/>
+            <w:left w:val="none" w:color="FFFFFF" w:sz="0"/>
+            <w:bottom w:val="none" w:color="FFFFFF" w:sz="0"/>
+            <w:right w:val="none" w:color="FFFFFF" w:sz="0"/>
+          </w:tcBorders>
+          <w:tcMar>
+            <w:top w:type="dxa" w:w="0"/>
+            <w:left w:type="dxa" w:w="0"/>
+            <w:bottom w:type="dxa" w:w="0"/>
+            <w:right w:type="dxa" w:w="0"/>
+          </w:tcMar>
+          <w:vAlign w:val="top"/>
+        </w:tcPr>
+        <w:p>
+          <w:pPr>
+            <w:spacing w:after="60" w:before="0" w:line="260"/>
+          </w:pPr>
+          <w:r>
+            <w:rPr>
+              <w:rFonts w:ascii="Arial" w:cs="Arial" w:eastAsia="Arial" w:hAnsi="Arial"/>
+              <w:b/>
+              <w:bCs/>
+              <w:caps/>
+              <w:color w:val="2F6B3A"/>
+              <w:spacing w:val="10"/>
+              <w:sz w:val="16"/>
+              <w:szCs w:val="16"/>
+            </w:rPr>
+            <w:t xml:space="preserve">Bank transfer (BACS)</w:t>
+          </w:r>
+        </w:p>
+        <w:tbl>
+          <w:tblPr>
+            <w:tblW w:type="dxa" w:w="5000"/>
+            <w:tblBorders>
+              <w:top w:val="none" w:color="FFFFFF" w:sz="0"/>
+              <w:left w:val="none" w:color="FFFFFF" w:sz="0"/>
+              <w:bottom w:val="none" w:color="FFFFFF" w:sz="0"/>
+              <w:right w:val="none" w:color="FFFFFF" w:sz="0"/>
+              <w:insideH w:val="none" w:color="FFFFFF" w:sz="0"/>
+              <w:insideV w:val="none" w:color="FFFFFF" w:sz="0"/>
+            </w:tblBorders>
+            <w:tblLayout w:type="fixed"/>
+          </w:tblPr>
+          <w:tblGrid>
+            <w:gridCol w:w="1700"/>
+            <w:gridCol w:w="3300"/>
+          </w:tblGrid>
+          <w:tr>
+            <w:tc>
+              <w:tcPr>
+                <w:tcW w:type="dxa" w:w="1700"/>
+                <w:tcBorders>
+                  <w:top w:val="none" w:color="FFFFFF" w:sz="0"/>
+                  <w:left w:val="none" w:color="FFFFFF" w:sz="0"/>
+                  <w:bottom w:val="none" w:color="FFFFFF" w:sz="0"/>
+                  <w:right w:val="none" w:color="FFFFFF" w:sz="0"/>
+                </w:tcBorders>
+                <w:tcMar>
+                  <w:top w:type="dxa" w:w="15"/>
+                  <w:left w:type="dxa" w:w="0"/>
+                  <w:bottom w:type="dxa" w:w="15"/>
+                  <w:right w:type="dxa" w:w="60"/>
+                </w:tcMar>
+                <w:vAlign w:val="top"/>
+              </w:tcPr>
+              <w:p>
+                <w:pPr>
+                  <w:spacing w:after="0" w:before="0" w:line="260"/>
+                </w:pPr>
+                <w:r>
+                  <w:rPr>
+                    <w:rFonts w:ascii="Arial" w:cs="Arial" w:eastAsia="Arial" w:hAnsi="Arial"/>
+                    <w:b w:val="false"/>
+                    <w:bCs w:val="false"/>
+                    <w:caps w:val="false"/>
+                    <w:color w:val="5B6B60"/>
+                    <w:sz w:val="17"/>
+                    <w:szCs w:val="17"/>
+                  </w:rPr>
+                  <w:t xml:space="preserve">Bank</w:t>
+                </w:r>
+              </w:p>
+            </w:tc>
+            <w:tc>
+              <w:tcPr>
+                <w:tcW w:type="dxa" w:w="3300"/>
+                <w:tcBorders>
+                  <w:top w:val="none" w:color="FFFFFF" w:sz="0"/>
+                  <w:left w:val="none" w:color="FFFFFF" w:sz="0"/>
+                  <w:bottom w:val="none" w:color="FFFFFF" w:sz="0"/>
+                  <w:right w:val="none" w:color="FFFFFF" w:sz="0"/>
+                </w:tcBorders>
+                <w:tcMar>
+                  <w:top w:type="dxa" w:w="15"/>
+                  <w:left w:type="dxa" w:w="0"/>
+                  <w:bottom w:type="dxa" w:w="15"/>
+                  <w:right w:type="dxa" w:w="0"/>
+                </w:tcMar>
+                <w:vAlign w:val="top"/>
+              </w:tcPr>
+              <w:p>
+                <w:pPr>
+                  <w:spacing w:after="0" w:before="0" w:line="260"/>
+                </w:pPr>
+                <w:r>
+                  <w:rPr>
+                    <w:rFonts w:ascii="Arial" w:cs="Arial" w:eastAsia="Arial" w:hAnsi="Arial"/>
+                    <w:b/>
+                    <w:bCs/>
+                    <w:caps w:val="false"/>
+                    <w:color w:val="17221B"/>
+                    <w:sz w:val="17"/>
+                    <w:szCs w:val="17"/>
+                  </w:rPr>
+                  <w:t xml:space="preserve">HSBC</w:t>
+                </w:r>
+              </w:p>
+            </w:tc>
+          </w:tr>
+        </w:tbl>
+        <w:tbl>
+          <w:tblPr>
+            <w:tblW w:type="dxa" w:w="5000"/>
+            <w:tblBorders>
+              <w:top w:val="none" w:color="FFFFFF" w:sz="0"/>
+              <w:left w:val="none" w:color="FFFFFF" w:sz="0"/>
+              <w:bottom w:val="none" w:color="FFFFFF" w:sz="0"/>
+              <w:right w:val="none" w:color="FFFFFF" w:sz="0"/>
+              <w:insideH w:val="none" w:color="FFFFFF" w:sz="0"/>
+              <w:insideV w:val="none" w:color="FFFFFF" w:sz="0"/>
+            </w:tblBorders>
+            <w:tblLayout w:type="fixed"/>
+          </w:tblPr>
+          <w:tblGrid>
+            <w:gridCol w:w="1700"/>
+            <w:gridCol w:w="3300"/>
+          </w:tblGrid>
+          <w:tr>
+            <w:tc>
+              <w:tcPr>
+                <w:tcW w:type="dxa" w:w="1700"/>
+                <w:tcBorders>
+                  <w:top w:val="none" w:color="FFFFFF" w:sz="0"/>
+                  <w:left w:val="none" w:color="FFFFFF" w:sz="0"/>
+                  <w:bottom w:val="none" w:color="FFFFFF" w:sz="0"/>
+                  <w:right w:val="none" w:color="FFFFFF" w:sz="0"/>
+                </w:tcBorders>
+                <w:tcMar>
+                  <w:top w:type="dxa" w:w="15"/>
+                  <w:left w:type="dxa" w:w="0"/>
+                  <w:bottom w:type="dxa" w:w="15"/>
+                  <w:right w:type="dxa" w:w="60"/>
+                </w:tcMar>
+                <w:vAlign w:val="top"/>
+              </w:tcPr>
+              <w:p>
+                <w:pPr>
+                  <w:spacing w:after="0" w:before="0" w:line="260"/>
+                </w:pPr>
+                <w:r>
+                  <w:rPr>
+                    <w:rFonts w:ascii="Arial" w:cs="Arial" w:eastAsia="Arial" w:hAnsi="Arial"/>
+                    <w:b w:val="false"/>
+                    <w:bCs w:val="false"/>
+                    <w:caps w:val="false"/>
+                    <w:color w:val="5B6B60"/>
+                    <w:sz w:val="17"/>
+                    <w:szCs w:val="17"/>
+                  </w:rPr>
+                  <w:t xml:space="preserve">Account name</w:t>
+                </w:r>
+              </w:p>
+            </w:tc>
+            <w:tc>
+              <w:tcPr>
+                <w:tcW w:type="dxa" w:w="3300"/>
+                <w:tcBorders>
+                  <w:top w:val="none" w:color="FFFFFF" w:sz="0"/>
+                  <w:left w:val="none" w:color="FFFFFF" w:sz="0"/>
+                  <w:bottom w:val="none" w:color="FFFFFF" w:sz="0"/>
+                  <w:right w:val="none" w:color="FFFFFF" w:sz="0"/>
+                </w:tcBorders>
+                <w:tcMar>
+                  <w:top w:type="dxa" w:w="15"/>
+                  <w:left w:type="dxa" w:w="0"/>
+                  <w:bottom w:type="dxa" w:w="15"/>
+                  <w:right w:type="dxa" w:w="0"/>
+                </w:tcMar>
+                <w:vAlign w:val="top"/>
+              </w:tcPr>
+              <w:p>
+                <w:pPr>
+                  <w:spacing w:after="0" w:before="0" w:line="260"/>
+                </w:pPr>
+                <w:r>
+                  <w:rPr>
+                    <w:rFonts w:ascii="Arial" w:cs="Arial" w:eastAsia="Arial" w:hAnsi="Arial"/>
+                    <w:b/>
+                    <w:bCs/>
+                    <w:caps w:val="false"/>
+                    <w:color w:val="17221B"/>
+                    <w:sz w:val="17"/>
+                    <w:szCs w:val="17"/>
+                  </w:rPr>
+                  <w:t xml:space="preserve">Aura Solutions Group Limited</w:t>
+                </w:r>
+              </w:p>
+            </w:tc>
+          </w:tr>
+        </w:tbl>
+        <w:tbl>
+          <w:tblPr>
+            <w:tblW w:type="dxa" w:w="5000"/>
+            <w:tblBorders>
+              <w:top w:val="none" w:color="FFFFFF" w:sz="0"/>
+              <w:left w:val="none" w:color="FFFFFF" w:sz="0"/>
+              <w:bottom w:val="none" w:color="FFFFFF" w:sz="0"/>
+              <w:right w:val="none" w:color="FFFFFF" w:sz="0"/>
+              <w:insideH w:val="none" w:color="FFFFFF" w:sz="0"/>
+              <w:insideV w:val="none" w:color="FFFFFF" w:sz="0"/>
+            </w:tblBorders>
+            <w:tblLayout w:type="fixed"/>
+          </w:tblPr>
+          <w:tblGrid>
+            <w:gridCol w:w="1700"/>
+            <w:gridCol w:w="3300"/>
+          </w:tblGrid>
+          <w:tr>
+            <w:tc>
+              <w:tcPr>
+                <w:tcW w:type="dxa" w:w="1700"/>
+                <w:tcBorders>
+                  <w:top w:val="none" w:color="FFFFFF" w:sz="0"/>
+                  <w:left w:val="none" w:color="FFFFFF" w:sz="0"/>
+                  <w:bottom w:val="none" w:color="FFFFFF" w:sz="0"/>
+                  <w:right w:val="none" w:color="FFFFFF" w:sz="0"/>
+                </w:tcBorders>
+                <w:tcMar>
+                  <w:top w:type="dxa" w:w="15"/>
+                  <w:left w:type="dxa" w:w="0"/>
+                  <w:bottom w:type="dxa" w:w="15"/>
+                  <w:right w:type="dxa" w:w="60"/>
+                </w:tcMar>
+                <w:vAlign w:val="top"/>
+              </w:tcPr>
+              <w:p>
+                <w:pPr>
+                  <w:spacing w:after="0" w:before="0" w:line="260"/>
+                </w:pPr>
+                <w:r>
+                  <w:rPr>
+                    <w:rFonts w:ascii="Arial" w:cs="Arial" w:eastAsia="Arial" w:hAnsi="Arial"/>
+                    <w:b w:val="false"/>
+                    <w:bCs w:val="false"/>
+                    <w:caps w:val="false"/>
+                    <w:color w:val="5B6B60"/>
+                    <w:sz w:val="17"/>
+                    <w:szCs w:val="17"/>
+                  </w:rPr>
+                  <w:t xml:space="preserve">Sort code</w:t>
+                </w:r>
+              </w:p>
+            </w:tc>
+            <w:tc>
+              <w:tcPr>
+                <w:tcW w:type="dxa" w:w="3300"/>
+                <w:tcBorders>
+                  <w:top w:val="none" w:color="FFFFFF" w:sz="0"/>
+                  <w:left w:val="none" w:color="FFFFFF" w:sz="0"/>
+                  <w:bottom w:val="none" w:color="FFFFFF" w:sz="0"/>
+                  <w:right w:val="none" w:color="FFFFFF" w:sz="0"/>
+                </w:tcBorders>
+                <w:tcMar>
+                  <w:top w:type="dxa" w:w="15"/>
+                  <w:left w:type="dxa" w:w="0"/>
+                  <w:bottom w:type="dxa" w:w="15"/>
+                  <w:right w:type="dxa" w:w="0"/>
+                </w:tcMar>
+                <w:vAlign w:val="top"/>
+              </w:tcPr>
+              <w:p>
+                <w:pPr>
+                  <w:spacing w:after="0" w:before="0" w:line="260"/>
+                </w:pPr>
+                <w:r>
+                  <w:rPr>
+                    <w:rFonts w:ascii="Arial" w:cs="Arial" w:eastAsia="Arial" w:hAnsi="Arial"/>
+                    <w:b/>
+                    <w:bCs/>
+                    <w:caps w:val="false"/>
+                    <w:color w:val="17221B"/>
+                    <w:sz w:val="17"/>
+                    <w:szCs w:val="17"/>
+                  </w:rPr>
+                  <w:t xml:space="preserve">40-18-00</w:t>
+                </w:r>
+              </w:p>
+            </w:tc>
+          </w:tr>
+        </w:tbl>
+        <w:tbl>
+          <w:tblPr>
+            <w:tblW w:type="dxa" w:w="5000"/>
+            <w:tblBorders>
+              <w:top w:val="none" w:color="FFFFFF" w:sz="0"/>
+              <w:left w:val="none" w:color="FFFFFF" w:sz="0"/>
+              <w:bottom w:val="none" w:color="FFFFFF" w:sz="0"/>
+              <w:right w:val="none" w:color="FFFFFF" w:sz="0"/>
+              <w:insideH w:val="none" w:color="FFFFFF" w:sz="0"/>
+              <w:insideV w:val="none" w:color="FFFFFF" w:sz="0"/>
+            </w:tblBorders>
+            <w:tblLayout w:type="fixed"/>
+          </w:tblPr>
+          <w:tblGrid>
+            <w:gridCol w:w="1700"/>
+            <w:gridCol w:w="3300"/>
+          </w:tblGrid>
+          <w:tr>
+            <w:tc>
+              <w:tcPr>
+                <w:tcW w:type="dxa" w:w="1700"/>
+                <w:tcBorders>
+                  <w:top w:val="none" w:color="FFFFFF" w:sz="0"/>
+                  <w:left w:val="none" w:color="FFFFFF" w:sz="0"/>
+                  <w:bottom w:val="none" w:color="FFFFFF" w:sz="0"/>
+                  <w:right w:val="none" w:color="FFFFFF" w:sz="0"/>
+                </w:tcBorders>
+                <w:tcMar>
+                  <w:top w:type="dxa" w:w="15"/>
+                  <w:left w:type="dxa" w:w="0"/>
+                  <w:bottom w:type="dxa" w:w="15"/>
+                  <w:right w:type="dxa" w:w="60"/>
+                </w:tcMar>
+                <w:vAlign w:val="top"/>
+              </w:tcPr>
+              <w:p>
+                <w:pPr>
+                  <w:spacing w:after="0" w:before="0" w:line="260"/>
+                </w:pPr>
+                <w:r>
+                  <w:rPr>
+                    <w:rFonts w:ascii="Arial" w:cs="Arial" w:eastAsia="Arial" w:hAnsi="Arial"/>
+                    <w:b w:val="false"/>
+                    <w:bCs w:val="false"/>
+                    <w:caps w:val="false"/>
+                    <w:color w:val="5B6B60"/>
+                    <w:sz w:val="17"/>
+                    <w:szCs w:val="17"/>
+                  </w:rPr>
+                  <w:t xml:space="preserve">Account no.</w:t>
+                </w:r>
+              </w:p>
+            </w:tc>
+            <w:tc>
+              <w:tcPr>
+                <w:tcW w:type="dxa" w:w="3300"/>
+                <w:tcBorders>
+                  <w:top w:val="none" w:color="FFFFFF" w:sz="0"/>
+                  <w:left w:val="none" w:color="FFFFFF" w:sz="0"/>
+                  <w:bottom w:val="none" w:color="FFFFFF" w:sz="0"/>
+                  <w:right w:val="none" w:color="FFFFFF" w:sz="0"/>
+                </w:tcBorders>
+                <w:tcMar>
+                  <w:top w:type="dxa" w:w="15"/>
+                  <w:left w:type="dxa" w:w="0"/>
+                  <w:bottom w:type="dxa" w:w="15"/>
+                  <w:right w:type="dxa" w:w="0"/>
+                </w:tcMar>
+                <w:vAlign w:val="top"/>
+              </w:tcPr>
+              <w:p>
+                <w:pPr>
+                  <w:spacing w:after="0" w:before="0" w:line="260"/>
+                </w:pPr>
+                <w:r>
+                  <w:rPr>
+                    <w:rFonts w:ascii="Arial" w:cs="Arial" w:eastAsia="Arial" w:hAnsi="Arial"/>
+                    <w:b/>
+                    <w:bCs/>
+                    <w:caps w:val="false"/>
+                    <w:color w:val="17221B"/>
+                    <w:sz w:val="17"/>
+                    <w:szCs w:val="17"/>
+                  </w:rPr>
+                  <w:t xml:space="preserve">31377817</w:t>
+                </w:r>
+              </w:p>
+            </w:tc>
+          </w:tr>
+        </w:tbl>
+        <w:tbl>
+          <w:tblPr>
+            <w:tblW w:type="dxa" w:w="5000"/>
+            <w:tblBorders>
+              <w:top w:val="none" w:color="FFFFFF" w:sz="0"/>
+              <w:left w:val="none" w:color="FFFFFF" w:sz="0"/>
+              <w:bottom w:val="none" w:color="FFFFFF" w:sz="0"/>
+              <w:right w:val="none" w:color="FFFFFF" w:sz="0"/>
+              <w:insideH w:val="none" w:color="FFFFFF" w:sz="0"/>
+              <w:insideV w:val="none" w:color="FFFFFF" w:sz="0"/>
+            </w:tblBorders>
+            <w:tblLayout w:type="fixed"/>
+          </w:tblPr>
+          <w:tblGrid>
+            <w:gridCol w:w="1700"/>
+            <w:gridCol w:w="3300"/>
+          </w:tblGrid>
+          <w:tr>
+            <w:tc>
+              <w:tcPr>
+                <w:tcW w:type="dxa" w:w="1700"/>
+                <w:tcBorders>
+                  <w:top w:val="none" w:color="FFFFFF" w:sz="0"/>
+                  <w:left w:val="none" w:color="FFFFFF" w:sz="0"/>
+                  <w:bottom w:val="none" w:color="FFFFFF" w:sz="0"/>
+                  <w:right w:val="none" w:color="FFFFFF" w:sz="0"/>
+                </w:tcBorders>
+                <w:tcMar>
+                  <w:top w:type="dxa" w:w="15"/>
+                  <w:left w:type="dxa" w:w="0"/>
+                  <w:bottom w:type="dxa" w:w="15"/>
+                  <w:right w:type="dxa" w:w="60"/>
+                </w:tcMar>
+                <w:vAlign w:val="top"/>
+              </w:tcPr>
+              <w:p>
+                <w:pPr>
+                  <w:spacing w:after="0" w:before="0" w:line="260"/>
+                </w:pPr>
+                <w:r>
+                  <w:rPr>
+                    <w:rFonts w:ascii="Arial" w:cs="Arial" w:eastAsia="Arial" w:hAnsi="Arial"/>
+                    <w:b w:val="false"/>
+                    <w:bCs w:val="false"/>
+                    <w:caps w:val="false"/>
+                    <w:color w:val="5B6B60"/>
+                    <w:sz w:val="17"/>
+                    <w:szCs w:val="17"/>
+                  </w:rPr>
+                  <w:t xml:space="preserve">Payment reference</w:t>
+                </w:r>
+              </w:p>
+            </w:tc>
+            <w:tc>
+              <w:tcPr>
+                <w:tcW w:type="dxa" w:w="3300"/>
+                <w:tcBorders>
+                  <w:top w:val="none" w:color="FFFFFF" w:sz="0"/>
+                  <w:left w:val="none" w:color="FFFFFF" w:sz="0"/>
+                  <w:bottom w:val="none" w:color="FFFFFF" w:sz="0"/>
+                  <w:right w:val="none" w:color="FFFFFF" w:sz="0"/>
+                </w:tcBorders>
+                <w:tcMar>
+                  <w:top w:type="dxa" w:w="15"/>
+                  <w:left w:type="dxa" w:w="0"/>
+                  <w:bottom w:type="dxa" w:w="15"/>
+                  <w:right w:type="dxa" w:w="0"/>
+                </w:tcMar>
+                <w:vAlign w:val="top"/>
+              </w:tcPr>
+              <w:p>
+                <w:pPr>
+                  <w:spacing w:after="0" w:before="0" w:line="260"/>
+                </w:pPr>
+                <w:r>
+                  <w:rPr>
+                    <w:rFonts w:ascii="Arial" w:cs="Arial" w:eastAsia="Arial" w:hAnsi="Arial"/>
+                    <w:b/>
+                    <w:bCs/>
+                    <w:caps w:val="false"/>
+                    <w:color w:val="17221B"/>
+                    <w:sz w:val="17"/>
+                    <w:szCs w:val="17"/>
+                  </w:rPr>
+                  <w:fldChar w:fldCharType="begin"/>
+                </w:r>
+                <w:r>
+                  <w:rPr>
+                    <w:rFonts w:ascii="Arial" w:cs="Arial" w:eastAsia="Arial" w:hAnsi="Arial"/>
+                    <w:b/>
+                    <w:bCs/>
+                    <w:caps w:val="false"/>
+                    <w:color w:val="17221B"/>
+                    <w:sz w:val="17"/>
+                    <w:szCs w:val="17"/>
+                  </w:rPr>
+                  <w:instrText xml:space="preserve"> MERGEFIELD  InvoiceNumber  \* MERGEFORMAT </w:instrText>
+                </w:r>
+                <w:r>
+                  <w:rPr>
+                    <w:rFonts w:ascii="Arial" w:cs="Arial" w:eastAsia="Arial" w:hAnsi="Arial"/>
+                    <w:b/>
+                    <w:bCs/>
+                    <w:caps w:val="false"/>
+                    <w:color w:val="17221B"/>
+                    <w:sz w:val="17"/>
+                    <w:szCs w:val="17"/>
+                  </w:rPr>
+                  <w:fldChar w:fldCharType="separate"/>
+                </w:r>
+                <w:r>
+                  <w:rPr>
+                    <w:rFonts w:ascii="Arial" w:cs="Arial" w:eastAsia="Arial" w:hAnsi="Arial"/>
+                    <w:b/>
+                    <w:bCs/>
+                    <w:caps w:val="false"/>
+                    <w:color w:val="17221B"/>
+                    <w:sz w:val="17"/>
+                    <w:szCs w:val="17"/>
+                  </w:rPr>
+                  <w:t xml:space="preserve">«InvoiceNumber»</w:t>
+                </w:r>
+                <w:r>
+                  <w:rPr>
+                    <w:rFonts w:ascii="Arial" w:cs="Arial" w:eastAsia="Arial" w:hAnsi="Arial"/>
+                    <w:b/>
+                    <w:bCs/>
+                    <w:caps w:val="false"/>
+                    <w:color w:val="17221B"/>
+                    <w:sz w:val="17"/>
+                    <w:szCs w:val="17"/>
+                  </w:rPr>
+                  <w:fldChar w:fldCharType="end"/>
+                </w:r>
+              </w:p>
+            </w:tc>
+          </w:tr>
+        </w:tbl>
+        <w:p/>
+      </w:tc>
+      <w:tc>
+        <w:tcPr>
+          <w:tcW w:type="dxa" w:w="160"/>
+          <w:tcBorders>
+            <w:top w:val="none" w:color="FFFFFF" w:sz="0"/>
+            <w:left w:val="none" w:color="FFFFFF" w:sz="0"/>
+            <w:bottom w:val="none" w:color="FFFFFF" w:sz="0"/>
+            <w:right w:val="single" w:color="CDD6CF" w:sz="4"/>
+          </w:tcBorders>
+          <w:tcMar>
+            <w:top w:type="dxa" w:w="0"/>
+            <w:left w:type="dxa" w:w="0"/>
+            <w:bottom w:type="dxa" w:w="0"/>
+            <w:right w:type="dxa" w:w="0"/>
+          </w:tcMar>
+          <w:vAlign w:val="top"/>
+        </w:tcPr>
+        <w:p>
+          <w:pPr>
+            <w:spacing w:after="40" w:before="0" w:line="260"/>
+          </w:pPr>
+        </w:p>
+      </w:tc>
+      <w:tc>
+        <w:tcPr>
+          <w:tcW w:type="dxa" w:w="5106"/>
+          <w:tcBorders>
+            <w:top w:val="none" w:color="FFFFFF" w:sz="0"/>
+            <w:left w:val="none" w:color="FFFFFF" w:sz="0"/>
+            <w:bottom w:val="none" w:color="FFFFFF" w:sz="0"/>
+            <w:right w:val="none" w:color="FFFFFF" w:sz="0"/>
+          </w:tcBorders>
+          <w:tcMar>
+            <w:top w:type="dxa" w:w="0"/>
+            <w:left w:type="dxa" w:w="120"/>
+            <w:bottom w:type="dxa" w:w="0"/>
+            <w:right w:type="dxa" w:w="120"/>
+          </w:tcMar>
+          <w:vAlign w:val="center"/>
+        </w:tcPr>
+        <w:p>
+          <w:pPr>
+            <w:spacing w:after="60" w:before="0" w:line="260"/>
+            <w:jc w:val="center"/>
+          </w:pPr>
+          <w:r>
+            <w:rPr>
+              <w:rFonts w:ascii="Arial" w:cs="Arial" w:eastAsia="Arial" w:hAnsi="Arial"/>
+              <w:b/>
+              <w:bCs/>
+              <w:caps/>
+              <w:color w:val="2F6B3A"/>
+              <w:spacing w:val="10"/>
+              <w:sz w:val="16"/>
+              <w:szCs w:val="16"/>
+            </w:rPr>
+            <w:t xml:space="preserve">Pay online</w:t>
+          </w:r>
+        </w:p>
+        <w:p>
+          <w:pPr>
+            <w:spacing w:after="40"/>
+            <w:jc w:val="center"/>
+          </w:pPr>
+          <w:r>
+            <w:rPr>
+              <w:rFonts w:ascii="Arial" w:cs="Arial" w:eastAsia="Arial" w:hAnsi="Arial"/>
+              <w:b w:val="false"/>
+              <w:bCs w:val="false"/>
+              <w:caps w:val="false"/>
+              <w:color w:val="17221B"/>
+              <w:sz w:val="18"/>
+              <w:szCs w:val="18"/>
+            </w:rPr>
+            <w:fldChar w:fldCharType="begin"/>
+          </w:r>
+          <w:r>
+            <w:rPr>
+              <w:rFonts w:ascii="Arial" w:cs="Arial" w:eastAsia="Arial" w:hAnsi="Arial"/>
+              <w:b w:val="false"/>
+              <w:bCs w:val="false"/>
+              <w:caps w:val="false"/>
+              <w:color w:val="17221B"/>
+              <w:sz w:val="18"/>
+              <w:szCs w:val="18"/>
+            </w:rPr>
+            <w:instrText xml:space="preserve"> MERGEFIELD  PaymentImage  \* MERGEFORMAT </w:instrText>
+          </w:r>
+          <w:r>
+            <w:rPr>
+              <w:rFonts w:ascii="Arial" w:cs="Arial" w:eastAsia="Arial" w:hAnsi="Arial"/>
+              <w:b w:val="false"/>
+              <w:bCs w:val="false"/>
+              <w:caps w:val="false"/>
+              <w:color w:val="17221B"/>
+              <w:sz w:val="18"/>
+              <w:szCs w:val="18"/>
+            </w:rPr>
+            <w:fldChar w:fldCharType="separate"/>
+          </w:r>
+          <w:r>
+            <w:rPr>
+              <w:rFonts w:ascii="Arial" w:cs="Arial" w:eastAsia="Arial" w:hAnsi="Arial"/>
+              <w:b w:val="false"/>
+              <w:bCs w:val="false"/>
+              <w:caps w:val="false"/>
+              <w:color w:val="17221B"/>
+              <w:sz w:val="18"/>
+              <w:szCs w:val="18"/>
+            </w:rPr>
+            <w:t xml:space="preserve">«PaymentImage»</w:t>
+          </w:r>
+          <w:r>
+            <w:rPr>
+              <w:rFonts w:ascii="Arial" w:cs="Arial" w:eastAsia="Arial" w:hAnsi="Arial"/>
+              <w:b w:val="false"/>
+              <w:bCs w:val="false"/>
+              <w:caps w:val="false"/>
+              <w:color w:val="17221B"/>
+              <w:sz w:val="18"/>
+              <w:szCs w:val="18"/>
+            </w:rPr>
+            <w:fldChar w:fldCharType="end"/>
+          </w:r>
+        </w:p>
+        <w:p>
+          <w:pPr>
+            <w:spacing w:after="0" w:before="0" w:line="260"/>
+            <w:jc w:val="center"/>
+          </w:pPr>
+          <w:r>
+            <w:rPr>
+              <w:rFonts w:ascii="Arial" w:cs="Arial" w:eastAsia="Arial" w:hAnsi="Arial"/>
+              <w:b/>
+              <w:bCs/>
+              <w:caps w:val="false"/>
+              <w:color w:val="2F6B3A"/>
+              <w:sz w:val="16"/>
+              <w:szCs w:val="16"/>
+            </w:rPr>
+            <w:fldChar w:fldCharType="begin"/>
+          </w:r>
+          <w:r>
+            <w:rPr>
+              <w:rFonts w:ascii="Arial" w:cs="Arial" w:eastAsia="Arial" w:hAnsi="Arial"/>
+              <w:b/>
+              <w:bCs/>
+              <w:caps w:val="false"/>
+              <w:color w:val="2F6B3A"/>
+              <w:sz w:val="16"/>
+              <w:szCs w:val="16"/>
+            </w:rPr>
+            <w:instrText xml:space="preserve"> MERGEFIELD  PaymentMessageAndUrl  \* MERGEFORMAT </w:instrText>
+          </w:r>
+          <w:r>
+            <w:rPr>
+              <w:rFonts w:ascii="Arial" w:cs="Arial" w:eastAsia="Arial" w:hAnsi="Arial"/>
+              <w:b/>
+              <w:bCs/>
+              <w:caps w:val="false"/>
+              <w:color w:val="2F6B3A"/>
+              <w:sz w:val="16"/>
+              <w:szCs w:val="16"/>
+            </w:rPr>
+            <w:fldChar w:fldCharType="separate"/>
+          </w:r>
+          <w:r>
+            <w:rPr>
+              <w:rFonts w:ascii="Arial" w:cs="Arial" w:eastAsia="Arial" w:hAnsi="Arial"/>
+              <w:b/>
+              <w:bCs/>
+              <w:caps w:val="false"/>
+              <w:color w:val="2F6B3A"/>
+              <w:sz w:val="16"/>
+              <w:szCs w:val="16"/>
+            </w:rPr>
+            <w:t xml:space="preserve">«PaymentMessageAndUrl»</w:t>
+          </w:r>
+          <w:r>
+            <w:rPr>
+              <w:rFonts w:ascii="Arial" w:cs="Arial" w:eastAsia="Arial" w:hAnsi="Arial"/>
+              <w:b/>
+              <w:bCs/>
+              <w:caps w:val="false"/>
+              <w:color w:val="2F6B3A"/>
+              <w:sz w:val="16"/>
+              <w:szCs w:val="16"/>
+            </w:rPr>
+            <w:fldChar w:fldCharType="end"/>
+          </w:r>
+        </w:p>
+      </w:tc>
+    </w:tr>
+  </w:tbl>
+  <w:p>
+    <w:pPr>
+      <w:spacing w:after="80"/>
+    </w:pPr>
+  </w:p>
+  <w:tbl>
+    <w:tblPr>
+      <w:tblW w:type="dxa" w:w="10466"/>
+      <w:tblBorders>
+        <w:top w:val="none" w:color="FFFFFF" w:sz="0"/>
+        <w:left w:val="none" w:color="FFFFFF" w:sz="0"/>
+        <w:bottom w:val="none" w:color="FFFFFF" w:sz="0"/>
+        <w:right w:val="none" w:color="FFFFFF" w:sz="0"/>
+        <w:insideH w:val="none" w:color="FFFFFF" w:sz="0"/>
+        <w:insideV w:val="none" w:color="FFFFFF" w:sz="0"/>
+      </w:tblBorders>
+      <w:tblLayout w:type="fixed"/>
+    </w:tblPr>
+    <w:tblGrid>
+      <w:gridCol w:w="10466"/>
+    </w:tblGrid>
+    <w:tr>
+      <w:tc>
+        <w:tcPr>
+          <w:tcW w:type="dxa" w:w="10466"/>
+          <w:tcBorders>
+            <w:top w:val="single" w:color="E3E9E4" w:sz="4"/>
+            <w:left w:val="single" w:color="E3E9E4" w:sz="4"/>
+            <w:bottom w:val="single" w:color="E3E9E4" w:sz="4"/>
+            <w:right w:val="single" w:color="E3E9E4" w:sz="4"/>
+          </w:tcBorders>
+          <w:shd w:fill="F6F9F6" w:color="auto" w:val="clear"/>
+          <w:tcMar>
+            <w:top w:type="dxa" w:w="90"/>
+            <w:left w:type="dxa" w:w="140"/>
+            <w:bottom w:type="dxa" w:w="90"/>
+            <w:right w:type="dxa" w:w="140"/>
+          </w:tcMar>
+          <w:vAlign w:val="top"/>
+        </w:tcPr>
+        <w:p>
+          <w:pPr>
+            <w:spacing w:after="50" w:before="0" w:line="260"/>
+          </w:pPr>
+          <w:r>
+            <w:rPr>
+              <w:rFonts w:ascii="Arial" w:cs="Arial" w:eastAsia="Arial" w:hAnsi="Arial"/>
+              <w:b w:val="false"/>
+              <w:bCs w:val="false"/>
+              <w:caps w:val="false"/>
+              <w:color w:val="17221B"/>
+              <w:sz w:val="16"/>
+              <w:szCs w:val="16"/>
+            </w:rPr>
+            <w:t xml:space="preserve">Payment is due by </w:t>
+          </w:r>
+          <w:r>
+            <w:rPr>
+              <w:rFonts w:ascii="Arial" w:cs="Arial" w:eastAsia="Arial" w:hAnsi="Arial"/>
+              <w:b w:val="false"/>
+              <w:bCs w:val="false"/>
+              <w:caps w:val="false"/>
+              <w:color w:val="17221B"/>
+              <w:sz w:val="16"/>
+              <w:szCs w:val="16"/>
+            </w:rPr>
+            <w:fldChar w:fldCharType="begin"/>
+          </w:r>
+          <w:r>
+            <w:rPr>
+              <w:rFonts w:ascii="Arial" w:cs="Arial" w:eastAsia="Arial" w:hAnsi="Arial"/>
+              <w:b w:val="false"/>
+              <w:bCs w:val="false"/>
+              <w:caps w:val="false"/>
+              <w:color w:val="17221B"/>
+              <w:sz w:val="16"/>
+              <w:szCs w:val="16"/>
+            </w:rPr>
+            <w:instrText xml:space="preserve"> MERGEFIELD  InvoiceDueDate  \@ "d MMMM yyyy"  \* MERGEFORMAT </w:instrText>
+          </w:r>
+          <w:r>
+            <w:rPr>
+              <w:rFonts w:ascii="Arial" w:cs="Arial" w:eastAsia="Arial" w:hAnsi="Arial"/>
+              <w:b w:val="false"/>
+              <w:bCs w:val="false"/>
+              <w:caps w:val="false"/>
+              <w:color w:val="17221B"/>
+              <w:sz w:val="16"/>
+              <w:szCs w:val="16"/>
+            </w:rPr>
+            <w:fldChar w:fldCharType="separate"/>
+          </w:r>
+          <w:r>
+            <w:rPr>
+              <w:rFonts w:ascii="Arial" w:cs="Arial" w:eastAsia="Arial" w:hAnsi="Arial"/>
+              <w:b w:val="false"/>
+              <w:bCs w:val="false"/>
+              <w:caps w:val="false"/>
+              <w:color w:val="17221B"/>
+              <w:sz w:val="16"/>
+              <w:szCs w:val="16"/>
+            </w:rPr>
+            <w:t xml:space="preserve">«InvoiceDueDate»</w:t>
+          </w:r>
+          <w:r>
+            <w:rPr>
+              <w:rFonts w:ascii="Arial" w:cs="Arial" w:eastAsia="Arial" w:hAnsi="Arial"/>
+              <w:b w:val="false"/>
+              <w:bCs w:val="false"/>
+              <w:caps w:val="false"/>
+              <w:color w:val="17221B"/>
+              <w:sz w:val="16"/>
+              <w:szCs w:val="16"/>
+            </w:rPr>
+            <w:fldChar w:fldCharType="end"/>
+          </w:r>
+          <w:r>
+            <w:rPr>
+              <w:rFonts w:ascii="Arial" w:cs="Arial" w:eastAsia="Arial" w:hAnsi="Arial"/>
+              <w:b w:val="false"/>
+              <w:bCs w:val="false"/>
+              <w:caps w:val="false"/>
+              <w:color w:val="17221B"/>
+              <w:sz w:val="16"/>
+              <w:szCs w:val="16"/>
+            </w:rPr>
+            <w:t xml:space="preserve"> – 30 days end of month. Please quote the invoice number as your payment reference and send remittance advice to info@aurasolutions.co.uk.</w:t>
+          </w:r>
+        </w:p>
+        <w:p>
+          <w:pPr>
+            <w:spacing w:after="50" w:before="0" w:line="260"/>
+          </w:pPr>
+          <w:r>
+            <w:rPr>
+              <w:rFonts w:ascii="Arial" w:cs="Arial" w:eastAsia="Arial" w:hAnsi="Arial"/>
+              <w:b/>
+              <w:bCs/>
+              <w:caps w:val="false"/>
+              <w:color w:val="17221B"/>
+              <w:sz w:val="16"/>
+              <w:szCs w:val="16"/>
+            </w:rPr>
+            <w:t xml:space="preserve">No CIS deductions are to be made from this invoice.</w:t>
+          </w:r>
+        </w:p>
+        <w:p>
+          <w:pPr>
+            <w:spacing w:after="0" w:before="0" w:line="260"/>
+          </w:pPr>
+          <w:r>
+            <w:rPr>
+              <w:rFonts w:ascii="Arial" w:cs="Arial" w:eastAsia="Arial" w:hAnsi="Arial"/>
+              <w:b w:val="false"/>
+              <w:bCs w:val="false"/>
+              <w:caps w:val="false"/>
+              <w:color w:val="5B6B60"/>
+              <w:sz w:val="15"/>
+              <w:szCs w:val="15"/>
+            </w:rPr>
+            <w:t xml:space="preserve">Accounts not settled within terms may be charged interest and compensation under the Late Payment of Commercial Debts (Interest) Act 1998.</w:t>
+          </w:r>
+        </w:p>
+      </w:tc>
+    </w:tr>
+  </w:tbl>
+  <w:p>
+    <w:pPr>
+      <w:spacing w:after="120"/>
+    </w:pPr>
+  </w:p>
+  <w:p>
+    <w:pPr>
+      <w:spacing w:after="0" w:line="20"/>
+    </w:pPr>
+    <w:r>
+      <w:drawing>
+        <wp:anchor distT="0" distB="0" distL="0" distR="0" simplePos="0" allowOverlap="1" behindDoc="1" locked="0" layoutInCell="1" relativeHeight="10696575">
+          <wp:simplePos x="0" y="0"/>
+          <wp:positionH relativeFrom="page">
+            <wp:posOffset>0</wp:posOffset>
+          </wp:positionH>
+          <wp:positionV relativeFrom="page">
+            <wp:posOffset>0</wp:posOffset>
+          </wp:positionV>
+          <wp:extent cx="7562850" cy="10696575"/>
+          <wp:effectExtent t="0" r="0" b="0" l="0"/>
+          <wp:wrapNone/>
+          <wp:docPr id="5" name="" descr="" title=""/>
+          <wp:cNvGraphicFramePr>
+            <a:graphicFrameLocks xmlns:a="http://schemas.openxmlformats.org/drawingml/2006/main" noChangeAspect="1"/>
+          </wp:cNvGraphicFramePr>
+          <a:graphic xmlns:a="http://schemas.openxmlformats.org/drawingml/2006/main">
+            <a:graphicData uri="http://schemas.openxmlformats.org/drawingml/2006/picture">
+              <pic:pic xmlns:pic="http://schemas.openxmlformats.org/drawingml/2006/picture">
+                <pic:nvPicPr>
+                  <pic:cNvPr id="0" name="" descr=""/>
+                  <pic:cNvPicPr>
+                    <a:picLocks noChangeAspect="1" noChangeArrowheads="1"/>
+                  </pic:cNvPicPr>
+                </pic:nvPicPr>
+                <pic:blipFill>
+                  <a:blip r:embed="rId0" cstate="none"/>
+                  <a:srcRect/>
+                  <a:stretch>
+                    <a:fillRect/>
+                  </a:stretch>
+                </pic:blipFill>
+                <pic:spPr bwMode="auto">
+                  <a:xfrm>
+                    <a:off x="0" y="0"/>
+                    <a:ext cx="7562850" cy="10696575"/>
+                  </a:xfrm>
+                  <a:prstGeom prst="rect">
+                    <a:avLst/>
+                  </a:prstGeom>
+                </pic:spPr>
+              </pic:pic>
+            </a:graphicData>
+          </a:graphic>
+        </wp:anchor>
+      </w:drawing>
+    </w:r>
+  </w:p>
+  <w:p>
+    <w:pPr>
+      <w:spacing w:after="0" w:line="220"/>
+      <w:jc w:val="center"/>
+    </w:pPr>
+    <w:r>
+      <w:drawing>
+        <wp:anchor distT="0" distB="0" distL="0" distR="0" simplePos="0" allowOverlap="1" behindDoc="1" locked="0" layoutInCell="1" relativeHeight="685800">
+          <wp:simplePos x="0" y="0"/>
+          <wp:positionH relativeFrom="page">
+            <wp:posOffset>0</wp:posOffset>
+          </wp:positionH>
+          <wp:positionV relativeFrom="page">
+            <wp:posOffset>10008000</wp:posOffset>
+          </wp:positionV>
+          <wp:extent cx="7562850" cy="685800"/>
+          <wp:effectExtent t="0" r="0" b="0" l="0"/>
+          <wp:wrapNone/>
+          <wp:docPr id="6" name="" descr="" title=""/>
           <wp:cNvGraphicFramePr>
             <a:graphicFrameLocks xmlns:a="http://schemas.openxmlformats.org/drawingml/2006/main" noChangeAspect="1"/>
           </wp:cNvGraphicFramePr>

</xml_diff>

<commit_message>
Invoice template v8: our job reference with the customer's, page numbers
Co-Authored-By: Claude Opus 5.5 <noreply@anthropic.com>
Claude-Session: https://claude.ai/code/session_01XczQ4VoiYiQrKwLjiEtYiz
</commit_message>
<xml_diff>
--- a/templates/xero-invoice/Aura Invoice Template.docx
+++ b/templates/xero-invoice/Aura Invoice Template.docx
@@ -688,7 +688,7 @@
                 <w:sz w:val="14"/>
                 <w:szCs w:val="14"/>
               </w:rPr>
-              <w:t xml:space="preserve">Your reference</w:t>
+              <w:t xml:space="preserve">Your ref · our job</w:t>
             </w:r>
           </w:p>
           <w:p>
@@ -3552,7 +3552,106 @@
         <w:sz w:val="13"/>
         <w:szCs w:val="13"/>
       </w:rPr>
-      <w:t xml:space="preserve">  ·  Queries: info@aurasolutions.co.uk · 01386 571556</w:t>
+      <w:t xml:space="preserve">  ·  Queries: info@aurasolutions.co.uk · 01386 571556  ·  Page </w:t>
+    </w:r>
+    <w:r>
+      <w:rPr>
+        <w:rFonts w:ascii="Arial" w:cs="Arial" w:eastAsia="Arial" w:hAnsi="Arial"/>
+        <w:color w:val="B9D3BD"/>
+        <w:sz w:val="13"/>
+        <w:szCs w:val="13"/>
+      </w:rPr>
+      <w:fldChar w:fldCharType="begin"/>
+    </w:r>
+    <w:r>
+      <w:rPr>
+        <w:rFonts w:ascii="Arial" w:cs="Arial" w:eastAsia="Arial" w:hAnsi="Arial"/>
+        <w:color w:val="B9D3BD"/>
+        <w:sz w:val="13"/>
+        <w:szCs w:val="13"/>
+      </w:rPr>
+      <w:instrText xml:space="preserve"> PAGE </w:instrText>
+    </w:r>
+    <w:r>
+      <w:rPr>
+        <w:rFonts w:ascii="Arial" w:cs="Arial" w:eastAsia="Arial" w:hAnsi="Arial"/>
+        <w:color w:val="B9D3BD"/>
+        <w:sz w:val="13"/>
+        <w:szCs w:val="13"/>
+      </w:rPr>
+      <w:fldChar w:fldCharType="separate"/>
+    </w:r>
+    <w:r>
+      <w:rPr>
+        <w:rFonts w:ascii="Arial" w:cs="Arial" w:eastAsia="Arial" w:hAnsi="Arial"/>
+        <w:color w:val="B9D3BD"/>
+        <w:sz w:val="13"/>
+        <w:szCs w:val="13"/>
+      </w:rPr>
+      <w:t>1</w:t>
+    </w:r>
+    <w:r>
+      <w:rPr>
+        <w:rFonts w:ascii="Arial" w:cs="Arial" w:eastAsia="Arial" w:hAnsi="Arial"/>
+        <w:color w:val="B9D3BD"/>
+        <w:sz w:val="13"/>
+        <w:szCs w:val="13"/>
+      </w:rPr>
+      <w:fldChar w:fldCharType="end"/>
+    </w:r>
+    <w:r>
+      <w:rPr>
+        <w:rFonts w:ascii="Arial" w:cs="Arial" w:eastAsia="Arial" w:hAnsi="Arial"/>
+        <w:color w:val="B9D3BD"/>
+        <w:sz w:val="13"/>
+        <w:szCs w:val="13"/>
+      </w:rPr>
+      <w:t xml:space="preserve"> of </w:t>
+    </w:r>
+    <w:r>
+      <w:rPr>
+        <w:rFonts w:ascii="Arial" w:cs="Arial" w:eastAsia="Arial" w:hAnsi="Arial"/>
+        <w:color w:val="B9D3BD"/>
+        <w:sz w:val="13"/>
+        <w:szCs w:val="13"/>
+      </w:rPr>
+      <w:fldChar w:fldCharType="begin"/>
+    </w:r>
+    <w:r>
+      <w:rPr>
+        <w:rFonts w:ascii="Arial" w:cs="Arial" w:eastAsia="Arial" w:hAnsi="Arial"/>
+        <w:color w:val="B9D3BD"/>
+        <w:sz w:val="13"/>
+        <w:szCs w:val="13"/>
+      </w:rPr>
+      <w:instrText xml:space="preserve"> NUMPAGES </w:instrText>
+    </w:r>
+    <w:r>
+      <w:rPr>
+        <w:rFonts w:ascii="Arial" w:cs="Arial" w:eastAsia="Arial" w:hAnsi="Arial"/>
+        <w:color w:val="B9D3BD"/>
+        <w:sz w:val="13"/>
+        <w:szCs w:val="13"/>
+      </w:rPr>
+      <w:fldChar w:fldCharType="separate"/>
+    </w:r>
+    <w:r>
+      <w:rPr>
+        <w:rFonts w:ascii="Arial" w:cs="Arial" w:eastAsia="Arial" w:hAnsi="Arial"/>
+        <w:color w:val="B9D3BD"/>
+        <w:sz w:val="13"/>
+        <w:szCs w:val="13"/>
+      </w:rPr>
+      <w:t>1</w:t>
+    </w:r>
+    <w:r>
+      <w:rPr>
+        <w:rFonts w:ascii="Arial" w:cs="Arial" w:eastAsia="Arial" w:hAnsi="Arial"/>
+        <w:color w:val="B9D3BD"/>
+        <w:sz w:val="13"/>
+        <w:szCs w:val="13"/>
+      </w:rPr>
+      <w:fldChar w:fldCharType="end"/>
     </w:r>
   </w:p>
 </w:ftr>
@@ -4735,7 +4834,106 @@
         <w:sz w:val="13"/>
         <w:szCs w:val="13"/>
       </w:rPr>
-      <w:t xml:space="preserve">  ·  Queries: info@aurasolutions.co.uk · 01386 571556</w:t>
+      <w:t xml:space="preserve">  ·  Queries: info@aurasolutions.co.uk · 01386 571556  ·  Page </w:t>
+    </w:r>
+    <w:r>
+      <w:rPr>
+        <w:rFonts w:ascii="Arial" w:cs="Arial" w:eastAsia="Arial" w:hAnsi="Arial"/>
+        <w:color w:val="B9D3BD"/>
+        <w:sz w:val="13"/>
+        <w:szCs w:val="13"/>
+      </w:rPr>
+      <w:fldChar w:fldCharType="begin"/>
+    </w:r>
+    <w:r>
+      <w:rPr>
+        <w:rFonts w:ascii="Arial" w:cs="Arial" w:eastAsia="Arial" w:hAnsi="Arial"/>
+        <w:color w:val="B9D3BD"/>
+        <w:sz w:val="13"/>
+        <w:szCs w:val="13"/>
+      </w:rPr>
+      <w:instrText xml:space="preserve"> PAGE </w:instrText>
+    </w:r>
+    <w:r>
+      <w:rPr>
+        <w:rFonts w:ascii="Arial" w:cs="Arial" w:eastAsia="Arial" w:hAnsi="Arial"/>
+        <w:color w:val="B9D3BD"/>
+        <w:sz w:val="13"/>
+        <w:szCs w:val="13"/>
+      </w:rPr>
+      <w:fldChar w:fldCharType="separate"/>
+    </w:r>
+    <w:r>
+      <w:rPr>
+        <w:rFonts w:ascii="Arial" w:cs="Arial" w:eastAsia="Arial" w:hAnsi="Arial"/>
+        <w:color w:val="B9D3BD"/>
+        <w:sz w:val="13"/>
+        <w:szCs w:val="13"/>
+      </w:rPr>
+      <w:t>1</w:t>
+    </w:r>
+    <w:r>
+      <w:rPr>
+        <w:rFonts w:ascii="Arial" w:cs="Arial" w:eastAsia="Arial" w:hAnsi="Arial"/>
+        <w:color w:val="B9D3BD"/>
+        <w:sz w:val="13"/>
+        <w:szCs w:val="13"/>
+      </w:rPr>
+      <w:fldChar w:fldCharType="end"/>
+    </w:r>
+    <w:r>
+      <w:rPr>
+        <w:rFonts w:ascii="Arial" w:cs="Arial" w:eastAsia="Arial" w:hAnsi="Arial"/>
+        <w:color w:val="B9D3BD"/>
+        <w:sz w:val="13"/>
+        <w:szCs w:val="13"/>
+      </w:rPr>
+      <w:t xml:space="preserve"> of </w:t>
+    </w:r>
+    <w:r>
+      <w:rPr>
+        <w:rFonts w:ascii="Arial" w:cs="Arial" w:eastAsia="Arial" w:hAnsi="Arial"/>
+        <w:color w:val="B9D3BD"/>
+        <w:sz w:val="13"/>
+        <w:szCs w:val="13"/>
+      </w:rPr>
+      <w:fldChar w:fldCharType="begin"/>
+    </w:r>
+    <w:r>
+      <w:rPr>
+        <w:rFonts w:ascii="Arial" w:cs="Arial" w:eastAsia="Arial" w:hAnsi="Arial"/>
+        <w:color w:val="B9D3BD"/>
+        <w:sz w:val="13"/>
+        <w:szCs w:val="13"/>
+      </w:rPr>
+      <w:instrText xml:space="preserve"> NUMPAGES </w:instrText>
+    </w:r>
+    <w:r>
+      <w:rPr>
+        <w:rFonts w:ascii="Arial" w:cs="Arial" w:eastAsia="Arial" w:hAnsi="Arial"/>
+        <w:color w:val="B9D3BD"/>
+        <w:sz w:val="13"/>
+        <w:szCs w:val="13"/>
+      </w:rPr>
+      <w:fldChar w:fldCharType="separate"/>
+    </w:r>
+    <w:r>
+      <w:rPr>
+        <w:rFonts w:ascii="Arial" w:cs="Arial" w:eastAsia="Arial" w:hAnsi="Arial"/>
+        <w:color w:val="B9D3BD"/>
+        <w:sz w:val="13"/>
+        <w:szCs w:val="13"/>
+      </w:rPr>
+      <w:t>1</w:t>
+    </w:r>
+    <w:r>
+      <w:rPr>
+        <w:rFonts w:ascii="Arial" w:cs="Arial" w:eastAsia="Arial" w:hAnsi="Arial"/>
+        <w:color w:val="B9D3BD"/>
+        <w:sz w:val="13"/>
+        <w:szCs w:val="13"/>
+      </w:rPr>
+      <w:fldChar w:fldCharType="end"/>
     </w:r>
   </w:p>
 </w:ftr>

</xml_diff>